<commit_message>
Updated admin and user docs
</commit_message>
<xml_diff>
--- a/BridgeOpsClient/Documentation/Bridge Manager Administration Guide.docx
+++ b/BridgeOpsClient/Documentation/Bridge Manager Administration Guide.docx
@@ -74,6 +74,7 @@
         </w:rPr>
         <w:t xml:space="preserve"> </w:t>
       </w:r>
+      <w:proofErr w:type="gramStart"/>
       <w:r>
         <w:rPr>
           <w:sz w:val="48"/>
@@ -97,8 +98,9 @@
           <w:sz w:val="36"/>
           <w:szCs w:val="36"/>
         </w:rPr>
-        <w:t>Administration Guide</w:t>
-      </w:r>
+        <w:t>Administration</w:t>
+      </w:r>
+      <w:proofErr w:type="gramEnd"/>
       <w:r>
         <w:rPr>
           <w:b/>
@@ -106,35 +108,44 @@
           <w:sz w:val="36"/>
           <w:szCs w:val="36"/>
         </w:rPr>
-        <w:br/>
-      </w:r>
-      <w:r>
-        <w:rPr>
+        <w:t xml:space="preserve"> Guide</w:t>
+      </w:r>
+      <w:r>
+        <w:rPr>
+          <w:b/>
+          <w:bCs/>
           <w:sz w:val="36"/>
           <w:szCs w:val="36"/>
         </w:rPr>
-        <w:t xml:space="preserve">v </w:t>
+        <w:br/>
       </w:r>
       <w:r>
         <w:rPr>
           <w:sz w:val="36"/>
           <w:szCs w:val="36"/>
         </w:rPr>
-        <w:t>1</w:t>
+        <w:t xml:space="preserve">v </w:t>
       </w:r>
       <w:r>
         <w:rPr>
           <w:sz w:val="36"/>
           <w:szCs w:val="36"/>
         </w:rPr>
-        <w:t>.</w:t>
+        <w:t>1</w:t>
       </w:r>
       <w:r>
         <w:rPr>
           <w:sz w:val="36"/>
           <w:szCs w:val="36"/>
         </w:rPr>
-        <w:t>2</w:t>
+        <w:t>.</w:t>
+      </w:r>
+      <w:r>
+        <w:rPr>
+          <w:sz w:val="36"/>
+          <w:szCs w:val="36"/>
+        </w:rPr>
+        <w:t>3</w:t>
       </w:r>
       <w:r>
         <w:rPr>
@@ -2294,6 +2305,7 @@
                                 <w:lang w:val="fr-FR"/>
                               </w:rPr>
                             </w:pPr>
+                            <w:proofErr w:type="spellStart"/>
                             <w:r>
                               <w:rPr>
                                 <w:b/>
@@ -2304,6 +2316,7 @@
                               </w:rPr>
                               <w:t>Prerequisites</w:t>
                             </w:r>
+                            <w:proofErr w:type="spellEnd"/>
                             <w:r>
                               <w:rPr>
                                 <w:b/>
@@ -3306,6 +3319,7 @@
                                 <w:szCs w:val="20"/>
                               </w:rPr>
                             </w:pPr>
+                            <w:proofErr w:type="spellStart"/>
                             <w:r>
                               <w:rPr>
                                 <w:b/>
@@ -3313,7 +3327,17 @@
                                 <w:sz w:val="20"/>
                                 <w:szCs w:val="20"/>
                               </w:rPr>
-                              <w:t>BridgeManager Database Diagram</w:t>
+                              <w:t>BridgeManager</w:t>
+                            </w:r>
+                            <w:proofErr w:type="spellEnd"/>
+                            <w:r>
+                              <w:rPr>
+                                <w:b/>
+                                <w:bCs/>
+                                <w:sz w:val="20"/>
+                                <w:szCs w:val="20"/>
+                              </w:rPr>
+                              <w:t xml:space="preserve"> Database Diagram</w:t>
                             </w:r>
                             <w:r>
                               <w:rPr>
@@ -5085,7 +5109,14 @@
           <w:sz w:val="20"/>
           <w:szCs w:val="20"/>
         </w:rPr>
-        <w:t xml:space="preserve"> with a 10GB database size limit, which should be sufficient for most use</w:t>
+        <w:t xml:space="preserve"> with a 10GB database size limit, which should be sufficient for </w:t>
+      </w:r>
+      <w:r>
+        <w:rPr>
+          <w:sz w:val="20"/>
+          <w:szCs w:val="20"/>
+        </w:rPr>
+        <w:t>almost any</w:t>
       </w:r>
       <w:r>
         <w:rPr>
@@ -5099,7 +5130,14 @@
           <w:sz w:val="20"/>
           <w:szCs w:val="20"/>
         </w:rPr>
-        <w:t>cases.</w:t>
+        <w:t xml:space="preserve">use </w:t>
+      </w:r>
+      <w:r>
+        <w:rPr>
+          <w:sz w:val="20"/>
+          <w:szCs w:val="20"/>
+        </w:rPr>
+        <w:t>case.</w:t>
       </w:r>
     </w:p>
     <w:p>
@@ -5119,6 +5157,7 @@
           <w:szCs w:val="30"/>
         </w:rPr>
       </w:pPr>
+      <w:bookmarkStart w:id="1" w:name="_Hlk231563684"/>
       <w:r>
         <w:rPr>
           <w:b/>
@@ -5126,9 +5165,19 @@
           <w:sz w:val="30"/>
           <w:szCs w:val="30"/>
         </w:rPr>
-        <w:t>Microsoft SQL Server Setup</w:t>
-      </w:r>
-    </w:p>
+        <w:t xml:space="preserve">Microsoft SQL Server </w:t>
+      </w:r>
+      <w:r>
+        <w:rPr>
+          <w:b/>
+          <w:bCs/>
+          <w:sz w:val="30"/>
+          <w:szCs w:val="30"/>
+        </w:rPr>
+        <w:t>Configuration</w:t>
+      </w:r>
+    </w:p>
+    <w:bookmarkEnd w:id="1"/>
     <w:p>
       <w:pPr>
         <w:rPr>
@@ -5216,7 +5265,14 @@
           <w:sz w:val="20"/>
           <w:szCs w:val="20"/>
         </w:rPr>
-        <w:t xml:space="preserve">TCP/IP and Shared Memory protocols </w:t>
+        <w:t xml:space="preserve">The </w:t>
+      </w:r>
+      <w:r>
+        <w:rPr>
+          <w:sz w:val="20"/>
+          <w:szCs w:val="20"/>
+        </w:rPr>
+        <w:t xml:space="preserve">Shared Memory protocol </w:t>
       </w:r>
       <w:r>
         <w:rPr>
@@ -5230,14 +5286,7 @@
           <w:sz w:val="20"/>
           <w:szCs w:val="20"/>
         </w:rPr>
-        <w:t>both</w:t>
-      </w:r>
-      <w:r>
-        <w:rPr>
-          <w:sz w:val="20"/>
-          <w:szCs w:val="20"/>
-        </w:rPr>
-        <w:t xml:space="preserve"> be</w:t>
+        <w:t>be</w:t>
       </w:r>
       <w:r>
         <w:rPr>
@@ -5321,7 +5370,21 @@
           <w:sz w:val="20"/>
           <w:szCs w:val="20"/>
         </w:rPr>
-        <w:t xml:space="preserve"> set to use the local built-in account in the SQL Server Configuration Manager.</w:t>
+        <w:t xml:space="preserve"> set to use the local built-in </w:t>
+      </w:r>
+      <w:r>
+        <w:rPr>
+          <w:sz w:val="20"/>
+          <w:szCs w:val="20"/>
+        </w:rPr>
+        <w:t xml:space="preserve">Windows </w:t>
+      </w:r>
+      <w:r>
+        <w:rPr>
+          <w:sz w:val="20"/>
+          <w:szCs w:val="20"/>
+        </w:rPr>
+        <w:t>account in the SQL Server Configuration Manager.</w:t>
       </w:r>
     </w:p>
     <w:p>
@@ -5388,7 +5451,23 @@
           <w:sz w:val="20"/>
           <w:szCs w:val="20"/>
         </w:rPr>
-        <w:t>The login must be mapped to BridgeManager (not possible until after the application has been set up).</w:t>
+        <w:t xml:space="preserve">The login must be mapped to </w:t>
+      </w:r>
+      <w:proofErr w:type="spellStart"/>
+      <w:r>
+        <w:rPr>
+          <w:sz w:val="20"/>
+          <w:szCs w:val="20"/>
+        </w:rPr>
+        <w:t>BridgeManager</w:t>
+      </w:r>
+      <w:proofErr w:type="spellEnd"/>
+      <w:r>
+        <w:rPr>
+          <w:sz w:val="20"/>
+          <w:szCs w:val="20"/>
+        </w:rPr>
+        <w:t xml:space="preserve"> (not possible until after the application has been set up).</w:t>
       </w:r>
     </w:p>
     <w:p>
@@ -5408,14 +5487,46 @@
           <w:sz w:val="20"/>
           <w:szCs w:val="20"/>
         </w:rPr>
-        <w:t>The login should have only the public and db_datareader roles enabled</w:t>
-      </w:r>
-      <w:r>
-        <w:rPr>
-          <w:sz w:val="20"/>
-          <w:szCs w:val="20"/>
-        </w:rPr>
-        <w:t xml:space="preserve"> for the BridgeManager database (not possible until after the application has been set up).</w:t>
+        <w:t xml:space="preserve">The login should have only the public and </w:t>
+      </w:r>
+      <w:proofErr w:type="spellStart"/>
+      <w:r>
+        <w:rPr>
+          <w:sz w:val="20"/>
+          <w:szCs w:val="20"/>
+        </w:rPr>
+        <w:t>db_datareader</w:t>
+      </w:r>
+      <w:proofErr w:type="spellEnd"/>
+      <w:r>
+        <w:rPr>
+          <w:sz w:val="20"/>
+          <w:szCs w:val="20"/>
+        </w:rPr>
+        <w:t xml:space="preserve"> roles enabled</w:t>
+      </w:r>
+      <w:r>
+        <w:rPr>
+          <w:sz w:val="20"/>
+          <w:szCs w:val="20"/>
+        </w:rPr>
+        <w:t xml:space="preserve"> for the </w:t>
+      </w:r>
+      <w:proofErr w:type="spellStart"/>
+      <w:r>
+        <w:rPr>
+          <w:sz w:val="20"/>
+          <w:szCs w:val="20"/>
+        </w:rPr>
+        <w:t>BridgeManager</w:t>
+      </w:r>
+      <w:proofErr w:type="spellEnd"/>
+      <w:r>
+        <w:rPr>
+          <w:sz w:val="20"/>
+          <w:szCs w:val="20"/>
+        </w:rPr>
+        <w:t xml:space="preserve"> database (not possible until after the application has been set up).</w:t>
       </w:r>
     </w:p>
     <w:p>
@@ -6180,7 +6291,7 @@
           <w:bCs/>
         </w:rPr>
       </w:pPr>
-      <w:bookmarkStart w:id="1" w:name="_Hlk185606029"/>
+      <w:bookmarkStart w:id="2" w:name="_Hlk185606029"/>
       <w:r>
         <w:rPr>
           <w:b/>
@@ -6231,7 +6342,7 @@
         </w:rPr>
         <w:t>best to familiarise yourself with the console’s menu navigation system. When the console application has fully loaded</w:t>
       </w:r>
-      <w:bookmarkEnd w:id="1"/>
+      <w:bookmarkEnd w:id="2"/>
       <w:r>
         <w:rPr>
           <w:sz w:val="20"/>
@@ -7133,103 +7244,147 @@
           <w:sz w:val="20"/>
           <w:szCs w:val="20"/>
         </w:rPr>
-        <w:t xml:space="preserve">When the agent is first launched, if not present, it will create the sql-reader.txt file in “Documents/Bridge Manager/Config Files”. This file contains two lines, the first representing the username for the SQL reader account mentioned in the </w:t>
-      </w:r>
-      <w:r>
-        <w:rPr>
-          <w:b/>
-          <w:bCs/>
-          <w:sz w:val="20"/>
-          <w:szCs w:val="20"/>
-        </w:rPr>
-        <w:t xml:space="preserve">Microsoft SQL Server Setup </w:t>
-      </w:r>
-      <w:r>
-        <w:rPr>
-          <w:sz w:val="20"/>
-          <w:szCs w:val="20"/>
-        </w:rPr>
-        <w:t>section</w:t>
-      </w:r>
-      <w:r>
-        <w:rPr>
-          <w:sz w:val="20"/>
-          <w:szCs w:val="20"/>
-        </w:rPr>
-        <w:t xml:space="preserve">, the </w:t>
-      </w:r>
-      <w:r>
-        <w:rPr>
-          <w:sz w:val="20"/>
-          <w:szCs w:val="20"/>
-        </w:rPr>
-        <w:t xml:space="preserve">second representing the password. Make sure that this file is set correctly </w:t>
+        <w:t xml:space="preserve">You must provide Bridge Manager with the username and password for the reader account you created as part of the </w:t>
+      </w:r>
+      <w:r>
+        <w:rPr>
+          <w:b/>
+          <w:bCs/>
+          <w:sz w:val="20"/>
+          <w:szCs w:val="20"/>
+        </w:rPr>
+        <w:t>Microsoft SQL Server Configuration</w:t>
+      </w:r>
+      <w:r>
+        <w:rPr>
+          <w:sz w:val="20"/>
+          <w:szCs w:val="20"/>
+        </w:rPr>
+        <w:t xml:space="preserve"> process outlined earlier in this document. To do this, refer to</w:t>
+      </w:r>
+      <w:r>
+        <w:rPr>
+          <w:rFonts w:ascii="Roboto Mono" w:hAnsi="Roboto Mono"/>
+          <w:b/>
+          <w:bCs/>
+          <w:sz w:val="18"/>
+          <w:szCs w:val="18"/>
+        </w:rPr>
+        <w:t xml:space="preserve"> </w:t>
       </w:r>
       <w:proofErr w:type="gramStart"/>
       <w:r>
         <w:rPr>
-          <w:sz w:val="20"/>
-          <w:szCs w:val="20"/>
-        </w:rPr>
-        <w:t>in order for</w:t>
+          <w:rFonts w:ascii="Roboto Mono" w:hAnsi="Roboto Mono"/>
+          <w:b/>
+          <w:bCs/>
+          <w:sz w:val="18"/>
+          <w:szCs w:val="18"/>
+        </w:rPr>
+        <w:t>d</w:t>
+      </w:r>
+      <w:r>
+        <w:rPr>
+          <w:rFonts w:ascii="Roboto Mono" w:hAnsi="Roboto Mono"/>
+          <w:b/>
+          <w:bCs/>
+          <w:sz w:val="18"/>
+          <w:szCs w:val="18"/>
+        </w:rPr>
+        <w:t>atabase</w:t>
+      </w:r>
+      <w:r>
+        <w:rPr>
+          <w:rFonts w:ascii="Roboto Mono" w:hAnsi="Roboto Mono"/>
+          <w:b/>
+          <w:bCs/>
+          <w:sz w:val="18"/>
+          <w:szCs w:val="18"/>
+        </w:rPr>
+        <w:t xml:space="preserve"> </w:t>
+      </w:r>
+      <w:r>
+        <w:rPr>
+          <w:sz w:val="18"/>
+          <w:szCs w:val="18"/>
+        </w:rPr>
+        <w:t xml:space="preserve"> </w:t>
+      </w:r>
+      <w:r>
+        <w:rPr>
+          <w:sz w:val="20"/>
+          <w:szCs w:val="20"/>
+        </w:rPr>
+        <w:t>&gt;</w:t>
       </w:r>
       <w:proofErr w:type="gramEnd"/>
       <w:r>
         <w:rPr>
-          <w:sz w:val="20"/>
-          <w:szCs w:val="20"/>
-        </w:rPr>
-        <w:t xml:space="preserve"> users to run custom select statements from the client’s Select Query Builder.</w:t>
-      </w:r>
-    </w:p>
-    <w:p>
-      <w:pPr>
-        <w:rPr>
-          <w:sz w:val="20"/>
-          <w:szCs w:val="20"/>
-        </w:rPr>
-      </w:pPr>
-      <w:r>
-        <w:rPr>
-          <w:sz w:val="20"/>
-          <w:szCs w:val="20"/>
-        </w:rPr>
-        <w:t>Not</w:t>
-      </w:r>
-      <w:r>
-        <w:rPr>
-          <w:sz w:val="20"/>
-          <w:szCs w:val="20"/>
-        </w:rPr>
-        <w:t>e</w:t>
-      </w:r>
-      <w:r>
-        <w:rPr>
-          <w:sz w:val="20"/>
-          <w:szCs w:val="20"/>
-        </w:rPr>
-        <w:t xml:space="preserve"> that this</w:t>
-      </w:r>
-      <w:r>
-        <w:rPr>
-          <w:sz w:val="20"/>
-          <w:szCs w:val="20"/>
-        </w:rPr>
-        <w:t xml:space="preserve"> feature</w:t>
-      </w:r>
-      <w:r>
-        <w:rPr>
-          <w:sz w:val="20"/>
-          <w:szCs w:val="20"/>
-        </w:rPr>
-        <w:t xml:space="preserve"> raises a clear security issue for any system connected to the internet that is intended to hold sensitive data. It is a consequence of the application’s intended deployment on an air-gapped network. If this poses a risk for your specific deployment, the source code will need to be modified to mitigate this.</w:t>
-      </w:r>
-      <w:r>
-        <w:rPr>
-          <w:sz w:val="20"/>
-          <w:szCs w:val="20"/>
-        </w:rPr>
-        <w:t xml:space="preserve"> Regardless, it is important to make sure that this login is only configured to be allowed to read from the database, and not to write to it.</w:t>
+          <w:rFonts w:ascii="Roboto Mono" w:hAnsi="Roboto Mono"/>
+          <w:b/>
+          <w:bCs/>
+          <w:sz w:val="18"/>
+          <w:szCs w:val="18"/>
+        </w:rPr>
+        <w:t xml:space="preserve"> s</w:t>
+      </w:r>
+      <w:r>
+        <w:rPr>
+          <w:rFonts w:ascii="Roboto Mono" w:hAnsi="Roboto Mono"/>
+          <w:b/>
+          <w:bCs/>
+          <w:sz w:val="18"/>
+          <w:szCs w:val="18"/>
+        </w:rPr>
+        <w:t>et reader credential</w:t>
+      </w:r>
+      <w:r>
+        <w:rPr>
+          <w:rFonts w:ascii="Roboto Mono" w:hAnsi="Roboto Mono"/>
+          <w:b/>
+          <w:bCs/>
+          <w:sz w:val="18"/>
+          <w:szCs w:val="18"/>
+        </w:rPr>
+        <w:t xml:space="preserve">s </w:t>
+      </w:r>
+      <w:r>
+        <w:rPr>
+          <w:sz w:val="20"/>
+          <w:szCs w:val="20"/>
+        </w:rPr>
+        <w:t xml:space="preserve">in the </w:t>
+      </w:r>
+      <w:r>
+        <w:rPr>
+          <w:b/>
+          <w:bCs/>
+          <w:sz w:val="20"/>
+          <w:szCs w:val="20"/>
+        </w:rPr>
+        <w:t>Console Command List</w:t>
+      </w:r>
+      <w:r>
+        <w:rPr>
+          <w:sz w:val="20"/>
+          <w:szCs w:val="20"/>
+        </w:rPr>
+        <w:t xml:space="preserve"> below.</w:t>
+      </w:r>
+    </w:p>
+    <w:p>
+      <w:pPr>
+        <w:rPr>
+          <w:sz w:val="20"/>
+          <w:szCs w:val="20"/>
+        </w:rPr>
+      </w:pPr>
+      <w:r>
+        <w:rPr>
+          <w:sz w:val="20"/>
+          <w:szCs w:val="20"/>
+        </w:rPr>
+        <w:t>The stored username and password are encrypted at rest.</w:t>
       </w:r>
     </w:p>
     <w:p>
@@ -7258,7 +7413,7 @@
           <w:sz w:val="40"/>
           <w:szCs w:val="40"/>
         </w:rPr>
-        <w:t>Customise Network Port</w:t>
+        <w:t xml:space="preserve">Server Network </w:t>
       </w:r>
       <w:r>
         <w:rPr>
@@ -7267,121 +7422,222 @@
           <w:sz w:val="40"/>
           <w:szCs w:val="40"/>
         </w:rPr>
-        <w:t xml:space="preserve"> Settings</w:t>
-      </w:r>
-    </w:p>
-    <w:p>
-      <w:pPr>
-        <w:rPr>
-          <w:sz w:val="20"/>
-          <w:szCs w:val="20"/>
-        </w:rPr>
-      </w:pPr>
-      <w:r>
-        <w:rPr>
-          <w:sz w:val="20"/>
-          <w:szCs w:val="20"/>
-        </w:rPr>
-        <w:t>This section is only relevant to administrators wishing to use specific network ports.</w:t>
-      </w:r>
-    </w:p>
-    <w:p>
-      <w:pPr>
-        <w:rPr>
-          <w:sz w:val="20"/>
-          <w:szCs w:val="20"/>
-        </w:rPr>
-      </w:pPr>
-      <w:r>
-        <w:rPr>
-          <w:sz w:val="20"/>
-          <w:szCs w:val="20"/>
-        </w:rPr>
-        <w:t xml:space="preserve">To create a network config file, in the console, navigate to the agent menu and type ‘create network config’. </w:t>
-      </w:r>
-      <w:r>
-        <w:rPr>
-          <w:sz w:val="20"/>
-          <w:szCs w:val="20"/>
-        </w:rPr>
-        <w:t>n</w:t>
-      </w:r>
-      <w:r>
-        <w:rPr>
-          <w:sz w:val="20"/>
-          <w:szCs w:val="20"/>
-        </w:rPr>
-        <w:t>etwork-config.txt will be placed in “Documents/Bridge Manager/Config Files”.</w:t>
-      </w:r>
-    </w:p>
-    <w:p>
-      <w:pPr>
-        <w:rPr>
-          <w:sz w:val="20"/>
-          <w:szCs w:val="20"/>
-        </w:rPr>
-      </w:pPr>
-      <w:r>
-        <w:rPr>
-          <w:sz w:val="20"/>
-          <w:szCs w:val="20"/>
-        </w:rPr>
-        <w:t>When you open this text file, you will see inbound and outbound port fields. Set these as desired and ensure that the Bridge Manager client applications that connect to it are configured with the reverse, i.e. the client’s outbound port should be equal to the agent’s inbound port. Make sure to leave the textual format of the file untouched including the white space, altering only the port numbers.</w:t>
-      </w:r>
-    </w:p>
-    <w:p>
-      <w:pPr>
-        <w:rPr>
-          <w:sz w:val="20"/>
-          <w:szCs w:val="20"/>
-        </w:rPr>
-      </w:pPr>
-      <w:r>
-        <w:rPr>
-          <w:sz w:val="20"/>
-          <w:szCs w:val="20"/>
-        </w:rPr>
-        <w:t>In the console, type ‘parse network config’</w:t>
-      </w:r>
-      <w:r>
-        <w:rPr>
-          <w:sz w:val="20"/>
-          <w:szCs w:val="20"/>
-        </w:rPr>
-        <w:t xml:space="preserve"> to confirm that you have set the ports correctly.</w:t>
-      </w:r>
-      <w:r>
-        <w:rPr>
-          <w:sz w:val="20"/>
-          <w:szCs w:val="20"/>
-        </w:rPr>
-        <w:t xml:space="preserve"> Assuming this is successful, the agent will pick up the new ports on the next start.</w:t>
-      </w:r>
-    </w:p>
-    <w:p>
-      <w:pPr>
-        <w:rPr>
-          <w:sz w:val="20"/>
-          <w:szCs w:val="20"/>
-        </w:rPr>
-      </w:pPr>
-      <w:r>
-        <w:rPr>
-          <w:sz w:val="20"/>
-          <w:szCs w:val="20"/>
-        </w:rPr>
-        <w:t>When configuring the ports for use in your firewall settings, note that the Bridge Manager client and agent communicate with each other only over TCP, never UDP.</w:t>
-      </w:r>
-    </w:p>
-    <w:p>
-      <w:pPr>
+        <w:t xml:space="preserve">and SSL </w:t>
+      </w:r>
+      <w:r>
         <w:rPr>
           <w:b/>
           <w:bCs/>
           <w:sz w:val="40"/>
           <w:szCs w:val="40"/>
         </w:rPr>
-      </w:pPr>
+        <w:t>Configuration</w:t>
+      </w:r>
+    </w:p>
+    <w:p>
+      <w:pPr>
+        <w:rPr>
+          <w:sz w:val="20"/>
+          <w:szCs w:val="20"/>
+        </w:rPr>
+      </w:pPr>
+      <w:r>
+        <w:rPr>
+          <w:sz w:val="20"/>
+          <w:szCs w:val="20"/>
+        </w:rPr>
+        <w:t>In the console, type ‘set network config’. You will be presented with prompts to enter the desired port (the default is 61152), the SSL mode and the optional SSL certificate thumbprint. The thumbprint is only required if you are using SSL.</w:t>
+      </w:r>
+    </w:p>
+    <w:p>
+      <w:pPr>
+        <w:rPr>
+          <w:sz w:val="20"/>
+          <w:szCs w:val="20"/>
+        </w:rPr>
+      </w:pPr>
+      <w:r>
+        <w:rPr>
+          <w:sz w:val="20"/>
+          <w:szCs w:val="20"/>
+        </w:rPr>
+        <w:t xml:space="preserve">SSL certificate generation, distribution and thumbprint retrieval fall outside the scope of </w:t>
+      </w:r>
+      <w:r>
+        <w:rPr>
+          <w:sz w:val="20"/>
+          <w:szCs w:val="20"/>
+        </w:rPr>
+        <w:t>this document</w:t>
+      </w:r>
+      <w:r>
+        <w:rPr>
+          <w:sz w:val="20"/>
+          <w:szCs w:val="20"/>
+        </w:rPr>
+        <w:t>,</w:t>
+      </w:r>
+      <w:r>
+        <w:rPr>
+          <w:sz w:val="20"/>
+          <w:szCs w:val="20"/>
+        </w:rPr>
+        <w:t xml:space="preserve"> </w:t>
+      </w:r>
+      <w:r>
+        <w:rPr>
+          <w:sz w:val="20"/>
+          <w:szCs w:val="20"/>
+        </w:rPr>
+        <w:t xml:space="preserve">but you must ensure that the following </w:t>
+      </w:r>
+      <w:r>
+        <w:rPr>
+          <w:sz w:val="20"/>
+          <w:szCs w:val="20"/>
+        </w:rPr>
+        <w:t xml:space="preserve">non-negotiable </w:t>
+      </w:r>
+      <w:r>
+        <w:rPr>
+          <w:sz w:val="20"/>
+          <w:szCs w:val="20"/>
+        </w:rPr>
+        <w:t>requirements are met:</w:t>
+      </w:r>
+    </w:p>
+    <w:p>
+      <w:pPr>
+        <w:pStyle w:val="ListParagraph"/>
+        <w:numPr>
+          <w:ilvl w:val="0"/>
+          <w:numId w:val="13"/>
+        </w:numPr>
+        <w:rPr>
+          <w:sz w:val="20"/>
+          <w:szCs w:val="20"/>
+        </w:rPr>
+      </w:pPr>
+      <w:r>
+        <w:rPr>
+          <w:sz w:val="20"/>
+          <w:szCs w:val="20"/>
+        </w:rPr>
+        <w:t>The certificate must contain the server’s static IP address in the SAN extension.</w:t>
+      </w:r>
+    </w:p>
+    <w:p>
+      <w:pPr>
+        <w:pStyle w:val="ListParagraph"/>
+        <w:numPr>
+          <w:ilvl w:val="0"/>
+          <w:numId w:val="13"/>
+        </w:numPr>
+        <w:rPr>
+          <w:sz w:val="20"/>
+          <w:szCs w:val="20"/>
+        </w:rPr>
+      </w:pPr>
+      <w:r>
+        <w:rPr>
+          <w:sz w:val="20"/>
+          <w:szCs w:val="20"/>
+        </w:rPr>
+        <w:t xml:space="preserve">The certificate must </w:t>
+      </w:r>
+      <w:r>
+        <w:rPr>
+          <w:sz w:val="20"/>
+          <w:szCs w:val="20"/>
+        </w:rPr>
+        <w:t>be considered valid according to Windows’ certificate validation.</w:t>
+      </w:r>
+    </w:p>
+    <w:p>
+      <w:pPr>
+        <w:rPr>
+          <w:sz w:val="20"/>
+          <w:szCs w:val="20"/>
+        </w:rPr>
+      </w:pPr>
+      <w:r>
+        <w:rPr>
+          <w:sz w:val="20"/>
+          <w:szCs w:val="20"/>
+        </w:rPr>
+        <w:t>After setting the configuration, i</w:t>
+      </w:r>
+      <w:r>
+        <w:rPr>
+          <w:sz w:val="20"/>
+          <w:szCs w:val="20"/>
+        </w:rPr>
+        <w:t>n the console, type ‘parse network config’</w:t>
+      </w:r>
+      <w:r>
+        <w:rPr>
+          <w:sz w:val="20"/>
+          <w:szCs w:val="20"/>
+        </w:rPr>
+        <w:t xml:space="preserve"> to confirm that you have </w:t>
+      </w:r>
+      <w:r>
+        <w:rPr>
+          <w:sz w:val="20"/>
+          <w:szCs w:val="20"/>
+        </w:rPr>
+        <w:t>input the desired values into the config file</w:t>
+      </w:r>
+      <w:r>
+        <w:rPr>
+          <w:sz w:val="20"/>
+          <w:szCs w:val="20"/>
+        </w:rPr>
+        <w:t xml:space="preserve"> correctly.</w:t>
+      </w:r>
+      <w:r>
+        <w:rPr>
+          <w:sz w:val="20"/>
+          <w:szCs w:val="20"/>
+        </w:rPr>
+        <w:t xml:space="preserve"> Assuming this is successful, the agent will pick up the</w:t>
+      </w:r>
+      <w:r>
+        <w:rPr>
+          <w:sz w:val="20"/>
+          <w:szCs w:val="20"/>
+        </w:rPr>
+        <w:t xml:space="preserve"> new </w:t>
+      </w:r>
+      <w:r>
+        <w:rPr>
+          <w:sz w:val="20"/>
+          <w:szCs w:val="20"/>
+        </w:rPr>
+        <w:t>configuration</w:t>
+      </w:r>
+      <w:r>
+        <w:rPr>
+          <w:sz w:val="20"/>
+          <w:szCs w:val="20"/>
+        </w:rPr>
+        <w:t xml:space="preserve"> on the next start.</w:t>
+      </w:r>
+    </w:p>
+    <w:p>
+      <w:pPr>
+        <w:rPr>
+          <w:sz w:val="20"/>
+          <w:szCs w:val="20"/>
+        </w:rPr>
+      </w:pPr>
+      <w:r>
+        <w:rPr>
+          <w:sz w:val="20"/>
+          <w:szCs w:val="20"/>
+        </w:rPr>
+        <w:t>When configuring the port for use in your firewall settings, note that the Bridge Manager client and agent communicate with each other only over TCP, never UDP.</w:t>
+      </w:r>
     </w:p>
     <w:p>
       <w:pPr>
@@ -7392,16 +7648,16 @@
           <w:szCs w:val="40"/>
         </w:rPr>
       </w:pPr>
-      <w:r>
+    </w:p>
+    <w:p>
+      <w:pPr>
         <w:rPr>
           <w:b/>
           <w:bCs/>
           <w:sz w:val="40"/>
           <w:szCs w:val="40"/>
         </w:rPr>
-        <w:t xml:space="preserve">Creating and Restoring </w:t>
-      </w:r>
-      <w:proofErr w:type="gramStart"/>
+      </w:pPr>
       <w:r>
         <w:rPr>
           <w:b/>
@@ -7409,9 +7665,9 @@
           <w:sz w:val="40"/>
           <w:szCs w:val="40"/>
         </w:rPr>
-        <w:t>From</w:t>
-      </w:r>
-      <w:proofErr w:type="gramEnd"/>
+        <w:t xml:space="preserve">Creating and Restoring </w:t>
+      </w:r>
+      <w:proofErr w:type="gramStart"/>
       <w:r>
         <w:rPr>
           <w:b/>
@@ -7419,6 +7675,16 @@
           <w:sz w:val="40"/>
           <w:szCs w:val="40"/>
         </w:rPr>
+        <w:t>From</w:t>
+      </w:r>
+      <w:proofErr w:type="gramEnd"/>
+      <w:r>
+        <w:rPr>
+          <w:b/>
+          <w:bCs/>
+          <w:sz w:val="40"/>
+          <w:szCs w:val="40"/>
+        </w:rPr>
         <w:t xml:space="preserve"> Backups</w:t>
       </w:r>
     </w:p>
@@ -7618,6 +7884,25 @@
           <w:sz w:val="30"/>
           <w:szCs w:val="30"/>
         </w:rPr>
+        <w:br w:type="page"/>
+      </w:r>
+    </w:p>
+    <w:p>
+      <w:pPr>
+        <w:rPr>
+          <w:b/>
+          <w:bCs/>
+          <w:sz w:val="30"/>
+          <w:szCs w:val="30"/>
+        </w:rPr>
+      </w:pPr>
+      <w:r>
+        <w:rPr>
+          <w:b/>
+          <w:bCs/>
+          <w:sz w:val="30"/>
+          <w:szCs w:val="30"/>
+        </w:rPr>
         <w:lastRenderedPageBreak/>
         <w:t>Restoring From a Backup</w:t>
       </w:r>
@@ -7829,7 +8114,23 @@
           <w:sz w:val="20"/>
           <w:szCs w:val="20"/>
         </w:rPr>
-        <w:t xml:space="preserve">its BridgeManager </w:t>
+        <w:t xml:space="preserve">its </w:t>
+      </w:r>
+      <w:proofErr w:type="spellStart"/>
+      <w:r>
+        <w:rPr>
+          <w:sz w:val="20"/>
+          <w:szCs w:val="20"/>
+        </w:rPr>
+        <w:t>BridgeManager</w:t>
+      </w:r>
+      <w:proofErr w:type="spellEnd"/>
+      <w:r>
+        <w:rPr>
+          <w:sz w:val="20"/>
+          <w:szCs w:val="20"/>
+        </w:rPr>
+        <w:t xml:space="preserve"> </w:t>
       </w:r>
       <w:r>
         <w:rPr>
@@ -8387,7 +8688,39 @@
           <w:sz w:val="20"/>
           <w:szCs w:val="20"/>
         </w:rPr>
-        <w:t>commands allow you to predefine more user-friendly names for columns or names more specific to your use case, for example changing ‘Dial_No’ to ‘IP_Address’.</w:t>
+        <w:t>commands allow you to predefine more user-friendly names for columns or names more specific to your use case, for example changing ‘</w:t>
+      </w:r>
+      <w:proofErr w:type="spellStart"/>
+      <w:r>
+        <w:rPr>
+          <w:sz w:val="20"/>
+          <w:szCs w:val="20"/>
+        </w:rPr>
+        <w:t>Dial_No</w:t>
+      </w:r>
+      <w:proofErr w:type="spellEnd"/>
+      <w:r>
+        <w:rPr>
+          <w:sz w:val="20"/>
+          <w:szCs w:val="20"/>
+        </w:rPr>
+        <w:t>’ to ‘</w:t>
+      </w:r>
+      <w:proofErr w:type="spellStart"/>
+      <w:r>
+        <w:rPr>
+          <w:sz w:val="20"/>
+          <w:szCs w:val="20"/>
+        </w:rPr>
+        <w:t>IP_Address</w:t>
+      </w:r>
+      <w:proofErr w:type="spellEnd"/>
+      <w:r>
+        <w:rPr>
+          <w:sz w:val="20"/>
+          <w:szCs w:val="20"/>
+        </w:rPr>
+        <w:t>’.</w:t>
       </w:r>
       <w:r>
         <w:rPr>
@@ -9135,7 +9468,39 @@
           <w:sz w:val="20"/>
           <w:szCs w:val="20"/>
         </w:rPr>
-        <w:t>This command will automatically create the database, placing both the BridgeManager_Data.mdf database file and the BridgeManager_Log.ldf log file into “Documents/Bridge Manager”, applying any loaded type overrides, column additions or friendly names as it does so.</w:t>
+        <w:t xml:space="preserve">This command will automatically create the database, placing both the </w:t>
+      </w:r>
+      <w:proofErr w:type="spellStart"/>
+      <w:r>
+        <w:rPr>
+          <w:sz w:val="20"/>
+          <w:szCs w:val="20"/>
+        </w:rPr>
+        <w:t>BridgeManager_Data.mdf</w:t>
+      </w:r>
+      <w:proofErr w:type="spellEnd"/>
+      <w:r>
+        <w:rPr>
+          <w:sz w:val="20"/>
+          <w:szCs w:val="20"/>
+        </w:rPr>
+        <w:t xml:space="preserve"> database file and the </w:t>
+      </w:r>
+      <w:proofErr w:type="spellStart"/>
+      <w:r>
+        <w:rPr>
+          <w:sz w:val="20"/>
+          <w:szCs w:val="20"/>
+        </w:rPr>
+        <w:t>BridgeManager_Log.ldf</w:t>
+      </w:r>
+      <w:proofErr w:type="spellEnd"/>
+      <w:r>
+        <w:rPr>
+          <w:sz w:val="20"/>
+          <w:szCs w:val="20"/>
+        </w:rPr>
+        <w:t xml:space="preserve"> log file into “Documents/Bridge Manager”, applying any loaded type overrides, column additions or friendly names as it does so.</w:t>
       </w:r>
     </w:p>
     <w:p>
@@ -9345,6 +9710,71 @@
           <w:szCs w:val="20"/>
         </w:rPr>
         <w:t>irreversible unless a backup was made beforehand.</w:t>
+      </w:r>
+    </w:p>
+    <w:p>
+      <w:pPr>
+        <w:rPr>
+          <w:sz w:val="20"/>
+          <w:szCs w:val="20"/>
+        </w:rPr>
+      </w:pPr>
+      <w:r>
+        <w:rPr>
+          <w:rFonts w:ascii="Roboto Mono" w:hAnsi="Roboto Mono"/>
+          <w:b/>
+          <w:bCs/>
+          <w:sz w:val="20"/>
+          <w:szCs w:val="20"/>
+        </w:rPr>
+        <w:t>set reader credentials</w:t>
+      </w:r>
+      <w:r>
+        <w:rPr>
+          <w:rFonts w:ascii="Roboto Mono" w:hAnsi="Roboto Mono"/>
+          <w:b/>
+          <w:bCs/>
+          <w:sz w:val="20"/>
+          <w:szCs w:val="20"/>
+        </w:rPr>
+        <w:t xml:space="preserve"> [string]</w:t>
+      </w:r>
+      <w:r>
+        <w:rPr>
+          <w:b/>
+          <w:bCs/>
+          <w:sz w:val="20"/>
+          <w:szCs w:val="20"/>
+        </w:rPr>
+        <w:br/>
+      </w:r>
+      <w:r>
+        <w:rPr>
+          <w:sz w:val="20"/>
+          <w:szCs w:val="20"/>
+        </w:rPr>
+        <w:t xml:space="preserve">Set the username and password for the user account, separated by the pipe </w:t>
+      </w:r>
+      <w:r>
+        <w:rPr>
+          <w:sz w:val="20"/>
+          <w:szCs w:val="20"/>
+        </w:rPr>
+        <w:t xml:space="preserve">| </w:t>
+      </w:r>
+      <w:r>
+        <w:rPr>
+          <w:sz w:val="20"/>
+          <w:szCs w:val="20"/>
+        </w:rPr>
+        <w:t>symbol</w:t>
+      </w:r>
+      <w:r>
+        <w:rPr>
+          <w:sz w:val="20"/>
+          <w:szCs w:val="20"/>
+        </w:rPr>
+        <w:t>. These credentials are encrypted at rest.</w:t>
       </w:r>
     </w:p>
     <w:p>
@@ -9674,14 +10104,6 @@
           <w:szCs w:val="20"/>
         </w:rPr>
       </w:pPr>
-    </w:p>
-    <w:p>
-      <w:pPr>
-        <w:rPr>
-          <w:sz w:val="20"/>
-          <w:szCs w:val="20"/>
-        </w:rPr>
-      </w:pPr>
       <w:r>
         <w:rPr>
           <w:rFonts w:ascii="Roboto Mono" w:hAnsi="Roboto Mono"/>
@@ -10361,12 +10783,21 @@
         </w:rPr>
         <w:br/>
       </w:r>
-      <w:r>
-        <w:rPr>
-          <w:sz w:val="20"/>
-          <w:szCs w:val="20"/>
-        </w:rPr>
-        <w:t>Start the BridgeManagerAgent.exe program. Note that this executable must be in the same directory as the console application. The command will fail if the executable could not be found, or if the process is already running in the background.</w:t>
+      <w:proofErr w:type="spellStart"/>
+      <w:r>
+        <w:rPr>
+          <w:sz w:val="20"/>
+          <w:szCs w:val="20"/>
+        </w:rPr>
+        <w:t>Start</w:t>
+      </w:r>
+      <w:proofErr w:type="spellEnd"/>
+      <w:r>
+        <w:rPr>
+          <w:sz w:val="20"/>
+          <w:szCs w:val="20"/>
+        </w:rPr>
+        <w:t xml:space="preserve"> the BridgeManagerAgent.exe program. Note that this executable must be in the same directory as the console application. The command will fail if the executable could not be found, or if the process is already running in the background.</w:t>
       </w:r>
     </w:p>
     <w:p>
@@ -10425,12 +10856,21 @@
         </w:rPr>
         <w:br/>
       </w:r>
-      <w:r>
-        <w:rPr>
-          <w:sz w:val="20"/>
-          <w:szCs w:val="20"/>
-        </w:rPr>
-        <w:t>Stop the BridgeManagerAgent.exe program. This command will work even if the agent wasn’t started this session or from within the console</w:t>
+      <w:proofErr w:type="spellStart"/>
+      <w:r>
+        <w:rPr>
+          <w:sz w:val="20"/>
+          <w:szCs w:val="20"/>
+        </w:rPr>
+        <w:t>Stop</w:t>
+      </w:r>
+      <w:proofErr w:type="spellEnd"/>
+      <w:r>
+        <w:rPr>
+          <w:sz w:val="20"/>
+          <w:szCs w:val="20"/>
+        </w:rPr>
+        <w:t xml:space="preserve"> the BridgeManagerAgent.exe program. This command will work even if the agent wasn’t started this session or from within the console</w:t>
       </w:r>
       <w:r>
         <w:rPr>
@@ -10522,8 +10962,6 @@
     <w:p>
       <w:pPr>
         <w:rPr>
-          <w:b/>
-          <w:bCs/>
           <w:sz w:val="20"/>
           <w:szCs w:val="20"/>
         </w:rPr>
@@ -10558,6 +10996,23 @@
     <w:p>
       <w:pPr>
         <w:rPr>
+          <w:b/>
+          <w:bCs/>
+          <w:sz w:val="20"/>
+          <w:szCs w:val="20"/>
+        </w:rPr>
+      </w:pPr>
+      <w:r>
+        <w:rPr>
+          <w:sz w:val="20"/>
+          <w:szCs w:val="20"/>
+        </w:rPr>
+        <w:t>Note that this function can be unreliable due to its dependence on the client application being logged in and responsive.</w:t>
+      </w:r>
+    </w:p>
+    <w:p>
+      <w:pPr>
+        <w:rPr>
           <w:sz w:val="20"/>
           <w:szCs w:val="20"/>
         </w:rPr>
@@ -10587,6 +11042,38 @@
           <w:szCs w:val="20"/>
         </w:rPr>
         <w:t>Reset the default admin account’s password to ‘admin’.</w:t>
+      </w:r>
+    </w:p>
+    <w:p>
+      <w:pPr>
+        <w:rPr>
+          <w:sz w:val="20"/>
+          <w:szCs w:val="20"/>
+        </w:rPr>
+      </w:pPr>
+      <w:r>
+        <w:rPr>
+          <w:rFonts w:ascii="Roboto Mono" w:hAnsi="Roboto Mono"/>
+          <w:b/>
+          <w:bCs/>
+          <w:sz w:val="20"/>
+          <w:szCs w:val="20"/>
+        </w:rPr>
+        <w:t>open error log</w:t>
+      </w:r>
+      <w:r>
+        <w:rPr>
+          <w:sz w:val="20"/>
+          <w:szCs w:val="20"/>
+        </w:rPr>
+        <w:br/>
+      </w:r>
+      <w:r>
+        <w:rPr>
+          <w:sz w:val="20"/>
+          <w:szCs w:val="20"/>
+        </w:rPr>
+        <w:t xml:space="preserve">Open the text file containing the server’s error log in the system’s default text editor. </w:t>
       </w:r>
     </w:p>
     <w:p>
@@ -10761,18 +11248,66 @@
     <w:p>
       <w:pPr>
         <w:rPr>
-          <w:sz w:val="20"/>
-          <w:szCs w:val="20"/>
-        </w:rPr>
-      </w:pPr>
-      <w:r>
-        <w:rPr>
           <w:rFonts w:ascii="Roboto Mono" w:hAnsi="Roboto Mono"/>
           <w:b/>
           <w:bCs/>
           <w:sz w:val="20"/>
           <w:szCs w:val="20"/>
         </w:rPr>
+      </w:pPr>
+      <w:r>
+        <w:rPr>
+          <w:rFonts w:ascii="Roboto Mono" w:hAnsi="Roboto Mono"/>
+          <w:b/>
+          <w:bCs/>
+          <w:sz w:val="20"/>
+          <w:szCs w:val="20"/>
+        </w:rPr>
+        <w:t>set</w:t>
+      </w:r>
+      <w:r>
+        <w:rPr>
+          <w:rFonts w:ascii="Roboto Mono" w:hAnsi="Roboto Mono"/>
+          <w:b/>
+          <w:bCs/>
+          <w:sz w:val="20"/>
+          <w:szCs w:val="20"/>
+        </w:rPr>
+        <w:t xml:space="preserve"> network config</w:t>
+      </w:r>
+      <w:r>
+        <w:rPr>
+          <w:rFonts w:ascii="Roboto Mono" w:hAnsi="Roboto Mono"/>
+          <w:b/>
+          <w:bCs/>
+          <w:sz w:val="20"/>
+          <w:szCs w:val="20"/>
+        </w:rPr>
+        <w:br/>
+      </w:r>
+      <w:r>
+        <w:rPr>
+          <w:sz w:val="20"/>
+          <w:szCs w:val="20"/>
+        </w:rPr>
+        <w:t>Set the port (the application default is 61152), SSL mode, and SSL thumbprint if required.</w:t>
+      </w:r>
+    </w:p>
+    <w:p>
+      <w:pPr>
+        <w:rPr>
+          <w:sz w:val="20"/>
+          <w:szCs w:val="20"/>
+        </w:rPr>
+      </w:pPr>
+      <w:r>
+        <w:rPr>
+          <w:rFonts w:ascii="Roboto Mono" w:hAnsi="Roboto Mono"/>
+          <w:b/>
+          <w:bCs/>
+          <w:sz w:val="20"/>
+          <w:szCs w:val="20"/>
+        </w:rPr>
         <w:t>parse network config</w:t>
       </w:r>
       <w:r>
@@ -10847,6 +11382,65 @@
           <w:szCs w:val="20"/>
         </w:rPr>
         <w:t>.</w:t>
+      </w:r>
+    </w:p>
+    <w:p>
+      <w:pPr>
+        <w:rPr>
+          <w:sz w:val="20"/>
+          <w:szCs w:val="20"/>
+        </w:rPr>
+      </w:pPr>
+      <w:r>
+        <w:rPr>
+          <w:rFonts w:ascii="Roboto Mono" w:hAnsi="Roboto Mono"/>
+          <w:b/>
+          <w:bCs/>
+          <w:sz w:val="20"/>
+          <w:szCs w:val="20"/>
+        </w:rPr>
+        <w:t xml:space="preserve">open </w:t>
+      </w:r>
+      <w:r>
+        <w:rPr>
+          <w:rFonts w:ascii="Roboto Mono" w:hAnsi="Roboto Mono"/>
+          <w:b/>
+          <w:bCs/>
+          <w:sz w:val="20"/>
+          <w:szCs w:val="20"/>
+        </w:rPr>
+        <w:t>network config</w:t>
+      </w:r>
+      <w:r>
+        <w:rPr>
+          <w:rFonts w:ascii="Roboto Mono" w:hAnsi="Roboto Mono"/>
+          <w:b/>
+          <w:bCs/>
+          <w:sz w:val="20"/>
+          <w:szCs w:val="20"/>
+        </w:rPr>
+        <w:br/>
+      </w:r>
+      <w:r>
+        <w:rPr>
+          <w:sz w:val="20"/>
+          <w:szCs w:val="20"/>
+        </w:rPr>
+        <w:t xml:space="preserve">Open the text file containing the </w:t>
+      </w:r>
+      <w:r>
+        <w:rPr>
+          <w:sz w:val="20"/>
+          <w:szCs w:val="20"/>
+        </w:rPr>
+        <w:t xml:space="preserve">network configuration </w:t>
+      </w:r>
+      <w:r>
+        <w:rPr>
+          <w:sz w:val="20"/>
+          <w:szCs w:val="20"/>
+        </w:rPr>
+        <w:t>in the system’s default text editor.</w:t>
       </w:r>
     </w:p>
     <w:p>
@@ -11518,22 +12112,24 @@
       </w:pPr>
       <w:r>
         <w:rPr>
+          <w:b/>
+          <w:bCs/>
           <w:noProof/>
         </w:rPr>
         <w:lastRenderedPageBreak/>
         <w:drawing>
-          <wp:anchor distT="0" distB="0" distL="360045" distR="114300" simplePos="0" relativeHeight="251659264" behindDoc="0" locked="0" layoutInCell="1" allowOverlap="1" wp14:anchorId="2097CA5C" wp14:editId="077EB28B">
+          <wp:anchor distT="0" distB="0" distL="114300" distR="114300" simplePos="0" relativeHeight="251676672" behindDoc="0" locked="0" layoutInCell="1" allowOverlap="1" wp14:anchorId="652AF8A5" wp14:editId="40FA474E">
             <wp:simplePos x="0" y="0"/>
             <wp:positionH relativeFrom="column">
-              <wp:posOffset>4765675</wp:posOffset>
+              <wp:posOffset>4789170</wp:posOffset>
             </wp:positionH>
             <wp:positionV relativeFrom="paragraph">
-              <wp:posOffset>70012</wp:posOffset>
+              <wp:posOffset>68884</wp:posOffset>
             </wp:positionV>
-            <wp:extent cx="1904400" cy="3139200"/>
-            <wp:effectExtent l="0" t="0" r="635" b="4445"/>
+            <wp:extent cx="1907540" cy="3142615"/>
+            <wp:effectExtent l="0" t="0" r="0" b="635"/>
             <wp:wrapSquare wrapText="bothSides"/>
-            <wp:docPr id="1065817654" name="Picture 1" descr="A screenshot of a login screen&#10;&#10;Description automatically generated"/>
+            <wp:docPr id="1965852841" name="Picture 1"/>
             <wp:cNvGraphicFramePr>
               <a:graphicFrameLocks xmlns:a="http://schemas.openxmlformats.org/drawingml/2006/main" noChangeAspect="1"/>
             </wp:cNvGraphicFramePr>
@@ -11541,8 +12137,10 @@
               <a:graphicData uri="http://schemas.openxmlformats.org/drawingml/2006/picture">
                 <pic:pic xmlns:pic="http://schemas.openxmlformats.org/drawingml/2006/picture">
                   <pic:nvPicPr>
-                    <pic:cNvPr id="1065817654" name="Picture 1" descr="A screenshot of a login screen&#10;&#10;Description automatically generated"/>
-                    <pic:cNvPicPr/>
+                    <pic:cNvPr id="0" name="Picture 2"/>
+                    <pic:cNvPicPr>
+                      <a:picLocks noChangeAspect="1" noChangeArrowheads="1"/>
+                    </pic:cNvPicPr>
                   </pic:nvPicPr>
                   <pic:blipFill>
                     <a:blip r:embed="rId9">
@@ -11552,18 +12150,23 @@
                         </a:ext>
                       </a:extLst>
                     </a:blip>
+                    <a:srcRect/>
                     <a:stretch>
                       <a:fillRect/>
                     </a:stretch>
                   </pic:blipFill>
-                  <pic:spPr>
+                  <pic:spPr bwMode="auto">
                     <a:xfrm>
                       <a:off x="0" y="0"/>
-                      <a:ext cx="1904400" cy="3139200"/>
+                      <a:ext cx="1907540" cy="3142615"/>
                     </a:xfrm>
                     <a:prstGeom prst="rect">
                       <a:avLst/>
                     </a:prstGeom>
+                    <a:noFill/>
+                    <a:ln>
+                      <a:noFill/>
+                    </a:ln>
                   </pic:spPr>
                 </pic:pic>
               </a:graphicData>
@@ -11758,27 +12361,25 @@
           <w:szCs w:val="20"/>
         </w:rPr>
       </w:pPr>
-    </w:p>
-    <w:p>
-      <w:r>
-        <w:rPr>
-          <w:b/>
-          <w:bCs/>
+      <w:r>
+        <w:rPr>
           <w:noProof/>
+          <w:sz w:val="30"/>
+          <w:szCs w:val="30"/>
         </w:rPr>
         <w:drawing>
-          <wp:anchor distT="0" distB="0" distL="114300" distR="360045" simplePos="0" relativeHeight="251660288" behindDoc="0" locked="0" layoutInCell="1" allowOverlap="1" wp14:anchorId="57BF250B" wp14:editId="29CB1E1D">
+          <wp:anchor distT="0" distB="0" distL="114300" distR="360045" simplePos="0" relativeHeight="251677696" behindDoc="0" locked="0" layoutInCell="1" allowOverlap="1" wp14:anchorId="04593F29" wp14:editId="56238120">
             <wp:simplePos x="0" y="0"/>
             <wp:positionH relativeFrom="column">
-              <wp:posOffset>-479</wp:posOffset>
+              <wp:posOffset>0</wp:posOffset>
             </wp:positionH>
             <wp:positionV relativeFrom="paragraph">
-              <wp:posOffset>1426</wp:posOffset>
+              <wp:posOffset>280670</wp:posOffset>
             </wp:positionV>
-            <wp:extent cx="2361600" cy="1317600"/>
-            <wp:effectExtent l="0" t="0" r="635" b="0"/>
+            <wp:extent cx="2322000" cy="1335600"/>
+            <wp:effectExtent l="0" t="0" r="2540" b="0"/>
             <wp:wrapSquare wrapText="bothSides"/>
-            <wp:docPr id="190403603" name="Picture 1" descr="A screenshot of a computer&#10;&#10;Description automatically generated"/>
+            <wp:docPr id="1293918313" name="Picture 2"/>
             <wp:cNvGraphicFramePr>
               <a:graphicFrameLocks xmlns:a="http://schemas.openxmlformats.org/drawingml/2006/main" noChangeAspect="1"/>
             </wp:cNvGraphicFramePr>
@@ -11786,8 +12387,10 @@
               <a:graphicData uri="http://schemas.openxmlformats.org/drawingml/2006/picture">
                 <pic:pic xmlns:pic="http://schemas.openxmlformats.org/drawingml/2006/picture">
                   <pic:nvPicPr>
-                    <pic:cNvPr id="190403603" name="Picture 1" descr="A screenshot of a computer&#10;&#10;Description automatically generated"/>
-                    <pic:cNvPicPr/>
+                    <pic:cNvPr id="0" name="Picture 3"/>
+                    <pic:cNvPicPr>
+                      <a:picLocks noChangeAspect="1" noChangeArrowheads="1"/>
+                    </pic:cNvPicPr>
                   </pic:nvPicPr>
                   <pic:blipFill>
                     <a:blip r:embed="rId10">
@@ -11797,18 +12400,23 @@
                         </a:ext>
                       </a:extLst>
                     </a:blip>
+                    <a:srcRect/>
                     <a:stretch>
                       <a:fillRect/>
                     </a:stretch>
                   </pic:blipFill>
-                  <pic:spPr>
+                  <pic:spPr bwMode="auto">
                     <a:xfrm>
                       <a:off x="0" y="0"/>
-                      <a:ext cx="2361600" cy="1317600"/>
+                      <a:ext cx="2322000" cy="1335600"/>
                     </a:xfrm>
                     <a:prstGeom prst="rect">
                       <a:avLst/>
                     </a:prstGeom>
+                    <a:noFill/>
+                    <a:ln>
+                      <a:noFill/>
+                    </a:ln>
                   </pic:spPr>
                 </pic:pic>
               </a:graphicData>
@@ -11822,47 +12430,55 @@
           </wp:anchor>
         </w:drawing>
       </w:r>
-      <w:r>
-        <w:rPr>
-          <w:b/>
-          <w:bCs/>
-        </w:rPr>
-        <w:t>Outbound &amp; Inbound Ports</w:t>
-      </w:r>
-    </w:p>
-    <w:p>
-      <w:pPr>
-        <w:rPr>
-          <w:i/>
-          <w:iCs/>
-          <w:sz w:val="20"/>
-          <w:szCs w:val="20"/>
-        </w:rPr>
-      </w:pPr>
-      <w:r>
-        <w:rPr>
-          <w:i/>
-          <w:iCs/>
-          <w:sz w:val="20"/>
-          <w:szCs w:val="20"/>
-        </w:rPr>
-        <w:t>Unless you have a reason to, it is recommended to leave these ports on their default settings.</w:t>
-      </w:r>
-    </w:p>
-    <w:p>
-      <w:pPr>
-        <w:rPr>
-          <w:sz w:val="20"/>
-          <w:szCs w:val="20"/>
-        </w:rPr>
-      </w:pPr>
-      <w:r>
-        <w:rPr>
-          <w:sz w:val="20"/>
-          <w:szCs w:val="20"/>
-        </w:rPr>
-        <w:t>They must be set to the reverse of their definitions in the agent's network-config.txt file. Unless this file has been altered, the default settings will be correct.</w:t>
-      </w:r>
+    </w:p>
+    <w:p>
+      <w:r>
+        <w:rPr>
+          <w:b/>
+          <w:bCs/>
+        </w:rPr>
+        <w:t>Port</w:t>
+      </w:r>
+      <w:r>
+        <w:rPr>
+          <w:b/>
+          <w:bCs/>
+        </w:rPr>
+        <w:t xml:space="preserve"> </w:t>
+      </w:r>
+      <w:r>
+        <w:t>&amp;</w:t>
+      </w:r>
+      <w:r>
+        <w:rPr>
+          <w:b/>
+          <w:bCs/>
+        </w:rPr>
+        <w:t xml:space="preserve"> Use SSL</w:t>
+      </w:r>
+    </w:p>
+    <w:p>
+      <w:pPr>
+        <w:rPr>
+          <w:sz w:val="20"/>
+          <w:szCs w:val="20"/>
+        </w:rPr>
+      </w:pPr>
+      <w:r>
+        <w:rPr>
+          <w:sz w:val="20"/>
+          <w:szCs w:val="20"/>
+        </w:rPr>
+        <w:t>These settings must mirror the agent’s network configuration.</w:t>
+      </w:r>
+    </w:p>
+    <w:p>
+      <w:pPr>
+        <w:rPr>
+          <w:sz w:val="20"/>
+          <w:szCs w:val="20"/>
+        </w:rPr>
+      </w:pPr>
     </w:p>
     <w:p>
       <w:pPr>
@@ -11888,40 +12504,39 @@
           <w:sz w:val="30"/>
           <w:szCs w:val="30"/>
         </w:rPr>
-        <w:t>Log In</w:t>
-      </w:r>
-    </w:p>
-    <w:p>
-      <w:pPr>
-        <w:rPr>
-          <w:sz w:val="20"/>
-          <w:szCs w:val="20"/>
-        </w:rPr>
-      </w:pPr>
-      <w:r>
-        <w:rPr>
-          <w:sz w:val="20"/>
-          <w:szCs w:val="20"/>
-        </w:rPr>
-        <w:t xml:space="preserve">Once the network settings have been set, log in with the built-in administrator account. </w:t>
-      </w:r>
-      <w:r>
-        <w:rPr>
-          <w:sz w:val="20"/>
-          <w:szCs w:val="20"/>
-        </w:rPr>
-        <w:t>The default username and password will be 'admin' and 'admin'. It is recommended to change this password as early as possible.</w:t>
-      </w:r>
-    </w:p>
-    <w:p>
-      <w:pPr>
+        <w:br/>
+      </w:r>
+      <w:r>
         <w:rPr>
           <w:b/>
           <w:bCs/>
           <w:sz w:val="30"/>
           <w:szCs w:val="30"/>
         </w:rPr>
-      </w:pPr>
+        <w:t>Log In</w:t>
+      </w:r>
+    </w:p>
+    <w:p>
+      <w:pPr>
+        <w:rPr>
+          <w:sz w:val="20"/>
+          <w:szCs w:val="20"/>
+        </w:rPr>
+      </w:pPr>
+      <w:r>
+        <w:rPr>
+          <w:sz w:val="20"/>
+          <w:szCs w:val="20"/>
+        </w:rPr>
+        <w:t xml:space="preserve">Once the network settings have been set, log in with the built-in administrator account. </w:t>
+      </w:r>
+      <w:r>
+        <w:rPr>
+          <w:sz w:val="20"/>
+          <w:szCs w:val="20"/>
+        </w:rPr>
+        <w:t>The default username and password will be 'admin' and 'admin'. It is recommended to change this password as early as possible.</w:t>
+      </w:r>
     </w:p>
     <w:p>
       <w:pPr>
@@ -11932,13 +12547,23 @@
           <w:szCs w:val="30"/>
         </w:rPr>
       </w:pPr>
-      <w:r>
+    </w:p>
+    <w:p>
+      <w:pPr>
         <w:rPr>
           <w:b/>
           <w:bCs/>
           <w:sz w:val="30"/>
           <w:szCs w:val="30"/>
         </w:rPr>
+      </w:pPr>
+      <w:r>
+        <w:rPr>
+          <w:b/>
+          <w:bCs/>
+          <w:sz w:val="30"/>
+          <w:szCs w:val="30"/>
+        </w:rPr>
         <w:t>Troubleshooting</w:t>
       </w:r>
     </w:p>
@@ -12008,7 +12633,168 @@
           <w:sz w:val="20"/>
           <w:szCs w:val="20"/>
         </w:rPr>
-        <w:t>If you are unable to connect to the agent, then the IP address or ports may be set incorrectly. Check the client's network settings and the agent's network-config.txt file and remember that the inbound and outbound ports should be reversed on each. If you are still unable to connect, it could indicate an issue with your network or firewall. Confirm network connectivity, and that the necessary ports are open for TCP connections on the client and server machines for the Client and Agent applications respectively.</w:t>
+        <w:t>If you are unable to connect to the agent, then the IP address</w:t>
+      </w:r>
+      <w:r>
+        <w:rPr>
+          <w:sz w:val="20"/>
+          <w:szCs w:val="20"/>
+        </w:rPr>
+        <w:t>,</w:t>
+      </w:r>
+      <w:r>
+        <w:rPr>
+          <w:sz w:val="20"/>
+          <w:szCs w:val="20"/>
+        </w:rPr>
+        <w:t xml:space="preserve"> port</w:t>
+      </w:r>
+      <w:r>
+        <w:rPr>
+          <w:sz w:val="20"/>
+          <w:szCs w:val="20"/>
+        </w:rPr>
+        <w:t>, or SSL settings</w:t>
+      </w:r>
+      <w:r>
+        <w:rPr>
+          <w:sz w:val="20"/>
+          <w:szCs w:val="20"/>
+        </w:rPr>
+        <w:t xml:space="preserve"> may be </w:t>
+      </w:r>
+      <w:r>
+        <w:rPr>
+          <w:sz w:val="20"/>
+          <w:szCs w:val="20"/>
+        </w:rPr>
+        <w:t>incorrect</w:t>
+      </w:r>
+      <w:r>
+        <w:rPr>
+          <w:sz w:val="20"/>
+          <w:szCs w:val="20"/>
+        </w:rPr>
+        <w:t>. Check the client's network settings and the agent's network-config.txt file</w:t>
+      </w:r>
+      <w:r>
+        <w:rPr>
+          <w:sz w:val="20"/>
+          <w:szCs w:val="20"/>
+        </w:rPr>
+        <w:t>,</w:t>
+      </w:r>
+      <w:r>
+        <w:rPr>
+          <w:sz w:val="20"/>
+          <w:szCs w:val="20"/>
+        </w:rPr>
+        <w:t xml:space="preserve"> and </w:t>
+      </w:r>
+      <w:r>
+        <w:rPr>
+          <w:sz w:val="20"/>
+          <w:szCs w:val="20"/>
+        </w:rPr>
+        <w:t>make sure they mirror each other</w:t>
+      </w:r>
+      <w:r>
+        <w:rPr>
+          <w:sz w:val="20"/>
+          <w:szCs w:val="20"/>
+        </w:rPr>
+        <w:t>. If you are still unable to connect, it could indicate an issue with your network</w:t>
+      </w:r>
+      <w:r>
+        <w:rPr>
+          <w:sz w:val="20"/>
+          <w:szCs w:val="20"/>
+        </w:rPr>
+        <w:t>,</w:t>
+      </w:r>
+      <w:r>
+        <w:rPr>
+          <w:sz w:val="20"/>
+          <w:szCs w:val="20"/>
+        </w:rPr>
+        <w:t xml:space="preserve"> firewall</w:t>
+      </w:r>
+      <w:r>
+        <w:rPr>
+          <w:sz w:val="20"/>
+          <w:szCs w:val="20"/>
+        </w:rPr>
+        <w:t>, or SSL certificate configuration</w:t>
+      </w:r>
+      <w:r>
+        <w:rPr>
+          <w:sz w:val="20"/>
+          <w:szCs w:val="20"/>
+        </w:rPr>
+        <w:t>. Confirm network connectivity</w:t>
+      </w:r>
+      <w:r>
+        <w:rPr>
+          <w:sz w:val="20"/>
+          <w:szCs w:val="20"/>
+        </w:rPr>
+        <w:t xml:space="preserve"> on both ends</w:t>
+      </w:r>
+      <w:r>
+        <w:rPr>
+          <w:sz w:val="20"/>
+          <w:szCs w:val="20"/>
+        </w:rPr>
+        <w:t>, that the</w:t>
+      </w:r>
+      <w:r>
+        <w:rPr>
+          <w:sz w:val="20"/>
+          <w:szCs w:val="20"/>
+        </w:rPr>
+        <w:t xml:space="preserve"> selected</w:t>
+      </w:r>
+      <w:r>
+        <w:rPr>
+          <w:sz w:val="20"/>
+          <w:szCs w:val="20"/>
+        </w:rPr>
+        <w:t xml:space="preserve"> port </w:t>
+      </w:r>
+      <w:r>
+        <w:rPr>
+          <w:sz w:val="20"/>
+          <w:szCs w:val="20"/>
+        </w:rPr>
+        <w:t xml:space="preserve">is </w:t>
+      </w:r>
+      <w:r>
+        <w:rPr>
+          <w:sz w:val="20"/>
+          <w:szCs w:val="20"/>
+        </w:rPr>
+        <w:t>open for TCP connections on the client and server machines for the Client and Agent applications respectively</w:t>
+      </w:r>
+      <w:r>
+        <w:rPr>
+          <w:sz w:val="20"/>
+          <w:szCs w:val="20"/>
+        </w:rPr>
+        <w:t>, and confirm that the SSL thumbprint, if in use, is specified correctly in the network-config.txt file with no trailing white</w:t>
+      </w:r>
+      <w:r>
+        <w:rPr>
+          <w:sz w:val="20"/>
+          <w:szCs w:val="20"/>
+        </w:rPr>
+        <w:t xml:space="preserve"> </w:t>
+      </w:r>
+      <w:r>
+        <w:rPr>
+          <w:sz w:val="20"/>
+          <w:szCs w:val="20"/>
+        </w:rPr>
+        <w:t>space.</w:t>
       </w:r>
     </w:p>
     <w:p>
@@ -12623,7 +13409,35 @@
                 <w:sz w:val="20"/>
                 <w:szCs w:val="20"/>
               </w:rPr>
-              <w:t>Relates to organisations, assets and contacts.</w:t>
+              <w:t>Relates to organisations, assets</w:t>
+            </w:r>
+            <w:r>
+              <w:rPr>
+                <w:sz w:val="20"/>
+                <w:szCs w:val="20"/>
+              </w:rPr>
+              <w:t>,</w:t>
+            </w:r>
+            <w:r>
+              <w:rPr>
+                <w:sz w:val="20"/>
+                <w:szCs w:val="20"/>
+              </w:rPr>
+              <w:t xml:space="preserve"> and contacts</w:t>
+            </w:r>
+            <w:r>
+              <w:rPr>
+                <w:sz w:val="20"/>
+                <w:szCs w:val="20"/>
+              </w:rPr>
+              <w:t xml:space="preserve"> and bank holidays</w:t>
+            </w:r>
+            <w:r>
+              <w:rPr>
+                <w:sz w:val="20"/>
+                <w:szCs w:val="20"/>
+              </w:rPr>
+              <w:t>.</w:t>
             </w:r>
           </w:p>
         </w:tc>
@@ -14031,6 +14845,21 @@
         </w:rPr>
         <w:t xml:space="preserve"> and you need all users to close their applications before you can update the software.</w:t>
       </w:r>
+    </w:p>
+    <w:p>
+      <w:pPr>
+        <w:rPr>
+          <w:sz w:val="20"/>
+          <w:szCs w:val="20"/>
+        </w:rPr>
+      </w:pPr>
+      <w:r>
+        <w:rPr>
+          <w:sz w:val="20"/>
+          <w:szCs w:val="20"/>
+        </w:rPr>
+        <w:t>Note that this function can be unreliable due to its dependence on the client application being logged in and responsive.</w:t>
+      </w:r>
       <w:r>
         <w:rPr>
           <w:sz w:val="20"/>
@@ -15101,7 +15930,23 @@
           <w:sz w:val="20"/>
           <w:szCs w:val="20"/>
         </w:rPr>
-        <w:t>the organisation table’s Dial_No column to ‘IP Address’, it will appear as ‘IP Address’ in the Organisation window, the search bar of the data pane and the select query builder.</w:t>
+        <w:t xml:space="preserve">the organisation table’s </w:t>
+      </w:r>
+      <w:proofErr w:type="spellStart"/>
+      <w:r>
+        <w:rPr>
+          <w:sz w:val="20"/>
+          <w:szCs w:val="20"/>
+        </w:rPr>
+        <w:t>Dial_No</w:t>
+      </w:r>
+      <w:proofErr w:type="spellEnd"/>
+      <w:r>
+        <w:rPr>
+          <w:sz w:val="20"/>
+          <w:szCs w:val="20"/>
+        </w:rPr>
+        <w:t xml:space="preserve"> column to ‘IP Address’, it will appear as ‘IP Address’ in the Organisation window, the search bar of the data pane and the select query builder.</w:t>
       </w:r>
     </w:p>
     <w:p>
@@ -15261,6 +16106,7 @@
         </w:rPr>
         <w:t>type (</w:t>
       </w:r>
+      <w:proofErr w:type="spellStart"/>
       <w:r>
         <w:rPr>
           <w:b/>
@@ -15275,8 +16121,17 @@
           <w:sz w:val="20"/>
           <w:szCs w:val="20"/>
         </w:rPr>
-        <w:t xml:space="preserve">iable </w:t>
-      </w:r>
+        <w:t>iable</w:t>
+      </w:r>
+      <w:proofErr w:type="spellEnd"/>
+      <w:r>
+        <w:rPr>
+          <w:sz w:val="20"/>
+          <w:szCs w:val="20"/>
+        </w:rPr>
+        <w:t xml:space="preserve"> </w:t>
+      </w:r>
+      <w:proofErr w:type="spellStart"/>
       <w:r>
         <w:rPr>
           <w:b/>
@@ -15291,7 +16146,15 @@
           <w:sz w:val="20"/>
           <w:szCs w:val="20"/>
         </w:rPr>
-        <w:t>acter)</w:t>
+        <w:t>acter</w:t>
+      </w:r>
+      <w:proofErr w:type="spellEnd"/>
+      <w:r>
+        <w:rPr>
+          <w:sz w:val="20"/>
+          <w:szCs w:val="20"/>
+        </w:rPr>
+        <w:t>)</w:t>
       </w:r>
       <w:r>
         <w:rPr>
@@ -16378,6 +17241,7 @@
         </w:rPr>
         <w:t xml:space="preserve"> synchronous with any foreign keys that reference them. Bridge Manager has been designed to automate this process, so that, for example, if </w:t>
       </w:r>
+      <w:proofErr w:type="spellStart"/>
       <w:r>
         <w:rPr>
           <w:i/>
@@ -16387,6 +17251,7 @@
         </w:rPr>
         <w:t>Organisation.Organisation_Reference</w:t>
       </w:r>
+      <w:proofErr w:type="spellEnd"/>
       <w:r>
         <w:rPr>
           <w:sz w:val="20"/>
@@ -16394,6 +17259,7 @@
         </w:rPr>
         <w:t xml:space="preserve"> has its max length updated, then </w:t>
       </w:r>
+      <w:proofErr w:type="spellStart"/>
       <w:r>
         <w:rPr>
           <w:i/>
@@ -16421,6 +17287,7 @@
         </w:rPr>
         <w:t>_Reference</w:t>
       </w:r>
+      <w:proofErr w:type="spellEnd"/>
       <w:r>
         <w:rPr>
           <w:sz w:val="20"/>
@@ -16428,6 +17295,7 @@
         </w:rPr>
         <w:t xml:space="preserve"> and </w:t>
       </w:r>
+      <w:proofErr w:type="spellStart"/>
       <w:r>
         <w:rPr>
           <w:i/>
@@ -16437,6 +17305,7 @@
         </w:rPr>
         <w:t>Organisation.Parent_Reference</w:t>
       </w:r>
+      <w:proofErr w:type="spellEnd"/>
       <w:r>
         <w:rPr>
           <w:sz w:val="20"/>
@@ -17674,8 +18543,49 @@
           <w:sz w:val="20"/>
           <w:szCs w:val="20"/>
         </w:rPr>
-        <w:t>. The column orders are stored in the OrganisationOrder, AssetOrder, ContactOrder</w:t>
-      </w:r>
+        <w:t xml:space="preserve">. The column orders are stored in the </w:t>
+      </w:r>
+      <w:proofErr w:type="spellStart"/>
+      <w:r>
+        <w:rPr>
+          <w:sz w:val="20"/>
+          <w:szCs w:val="20"/>
+        </w:rPr>
+        <w:t>OrganisationOrder</w:t>
+      </w:r>
+      <w:proofErr w:type="spellEnd"/>
+      <w:r>
+        <w:rPr>
+          <w:sz w:val="20"/>
+          <w:szCs w:val="20"/>
+        </w:rPr>
+        <w:t xml:space="preserve">, </w:t>
+      </w:r>
+      <w:proofErr w:type="spellStart"/>
+      <w:r>
+        <w:rPr>
+          <w:sz w:val="20"/>
+          <w:szCs w:val="20"/>
+        </w:rPr>
+        <w:t>AssetOrder</w:t>
+      </w:r>
+      <w:proofErr w:type="spellEnd"/>
+      <w:r>
+        <w:rPr>
+          <w:sz w:val="20"/>
+          <w:szCs w:val="20"/>
+        </w:rPr>
+        <w:t xml:space="preserve">, </w:t>
+      </w:r>
+      <w:proofErr w:type="spellStart"/>
+      <w:r>
+        <w:rPr>
+          <w:sz w:val="20"/>
+          <w:szCs w:val="20"/>
+        </w:rPr>
+        <w:t>ContactOrder</w:t>
+      </w:r>
+      <w:proofErr w:type="spellEnd"/>
       <w:r>
         <w:rPr>
           <w:sz w:val="20"/>
@@ -17688,15 +18598,65 @@
           <w:sz w:val="20"/>
           <w:szCs w:val="20"/>
         </w:rPr>
-        <w:t xml:space="preserve"> ConferenceOrder</w:t>
-      </w:r>
-      <w:r>
-        <w:rPr>
-          <w:sz w:val="20"/>
-          <w:szCs w:val="20"/>
-        </w:rPr>
-        <w:t>, TaskOrder, VisitOrder and DocumentOrder</w:t>
-      </w:r>
+        <w:t xml:space="preserve"> </w:t>
+      </w:r>
+      <w:proofErr w:type="spellStart"/>
+      <w:r>
+        <w:rPr>
+          <w:sz w:val="20"/>
+          <w:szCs w:val="20"/>
+        </w:rPr>
+        <w:t>ConferenceOrder</w:t>
+      </w:r>
+      <w:proofErr w:type="spellEnd"/>
+      <w:r>
+        <w:rPr>
+          <w:sz w:val="20"/>
+          <w:szCs w:val="20"/>
+        </w:rPr>
+        <w:t xml:space="preserve">, </w:t>
+      </w:r>
+      <w:proofErr w:type="spellStart"/>
+      <w:r>
+        <w:rPr>
+          <w:sz w:val="20"/>
+          <w:szCs w:val="20"/>
+        </w:rPr>
+        <w:t>TaskOrder</w:t>
+      </w:r>
+      <w:proofErr w:type="spellEnd"/>
+      <w:r>
+        <w:rPr>
+          <w:sz w:val="20"/>
+          <w:szCs w:val="20"/>
+        </w:rPr>
+        <w:t xml:space="preserve">, </w:t>
+      </w:r>
+      <w:proofErr w:type="spellStart"/>
+      <w:r>
+        <w:rPr>
+          <w:sz w:val="20"/>
+          <w:szCs w:val="20"/>
+        </w:rPr>
+        <w:t>VisitOrder</w:t>
+      </w:r>
+      <w:proofErr w:type="spellEnd"/>
+      <w:r>
+        <w:rPr>
+          <w:sz w:val="20"/>
+          <w:szCs w:val="20"/>
+        </w:rPr>
+        <w:t xml:space="preserve"> and </w:t>
+      </w:r>
+      <w:proofErr w:type="spellStart"/>
+      <w:r>
+        <w:rPr>
+          <w:sz w:val="20"/>
+          <w:szCs w:val="20"/>
+        </w:rPr>
+        <w:t>DocumentOrder</w:t>
+      </w:r>
+      <w:proofErr w:type="spellEnd"/>
       <w:r>
         <w:rPr>
           <w:sz w:val="20"/>
@@ -18451,6 +19411,7 @@
           <w:szCs w:val="40"/>
         </w:rPr>
       </w:pPr>
+      <w:proofErr w:type="spellStart"/>
       <w:r>
         <w:rPr>
           <w:b/>
@@ -18459,7 +19420,17 @@
           <w:szCs w:val="40"/>
         </w:rPr>
         <w:lastRenderedPageBreak/>
-        <w:t>BridgeManager Database Diagram</w:t>
+        <w:t>BridgeManager</w:t>
+      </w:r>
+      <w:proofErr w:type="spellEnd"/>
+      <w:r>
+        <w:rPr>
+          <w:b/>
+          <w:bCs/>
+          <w:sz w:val="40"/>
+          <w:szCs w:val="40"/>
+        </w:rPr>
+        <w:t xml:space="preserve"> Database Diagram</w:t>
       </w:r>
     </w:p>
     <w:p>
@@ -18488,8 +19459,49 @@
           <w:sz w:val="20"/>
           <w:szCs w:val="20"/>
         </w:rPr>
-        <w:t xml:space="preserve"> omits the OrganisationOrder, AssetOrder, ContactOrder</w:t>
-      </w:r>
+        <w:t xml:space="preserve"> omits the </w:t>
+      </w:r>
+      <w:proofErr w:type="spellStart"/>
+      <w:r>
+        <w:rPr>
+          <w:sz w:val="20"/>
+          <w:szCs w:val="20"/>
+        </w:rPr>
+        <w:t>OrganisationOrder</w:t>
+      </w:r>
+      <w:proofErr w:type="spellEnd"/>
+      <w:r>
+        <w:rPr>
+          <w:sz w:val="20"/>
+          <w:szCs w:val="20"/>
+        </w:rPr>
+        <w:t xml:space="preserve">, </w:t>
+      </w:r>
+      <w:proofErr w:type="spellStart"/>
+      <w:r>
+        <w:rPr>
+          <w:sz w:val="20"/>
+          <w:szCs w:val="20"/>
+        </w:rPr>
+        <w:t>AssetOrder</w:t>
+      </w:r>
+      <w:proofErr w:type="spellEnd"/>
+      <w:r>
+        <w:rPr>
+          <w:sz w:val="20"/>
+          <w:szCs w:val="20"/>
+        </w:rPr>
+        <w:t xml:space="preserve">, </w:t>
+      </w:r>
+      <w:proofErr w:type="spellStart"/>
+      <w:r>
+        <w:rPr>
+          <w:sz w:val="20"/>
+          <w:szCs w:val="20"/>
+        </w:rPr>
+        <w:t>ContactOrder</w:t>
+      </w:r>
+      <w:proofErr w:type="spellEnd"/>
       <w:r>
         <w:rPr>
           <w:sz w:val="20"/>
@@ -18502,8 +19514,17 @@
           <w:sz w:val="20"/>
           <w:szCs w:val="20"/>
         </w:rPr>
-        <w:t xml:space="preserve"> ConferenceOrder</w:t>
-      </w:r>
+        <w:t xml:space="preserve"> </w:t>
+      </w:r>
+      <w:proofErr w:type="spellStart"/>
+      <w:r>
+        <w:rPr>
+          <w:sz w:val="20"/>
+          <w:szCs w:val="20"/>
+        </w:rPr>
+        <w:t>ConferenceOrder</w:t>
+      </w:r>
+      <w:proofErr w:type="spellEnd"/>
       <w:r>
         <w:rPr>
           <w:sz w:val="20"/>
@@ -18516,21 +19537,78 @@
           <w:sz w:val="20"/>
           <w:szCs w:val="20"/>
         </w:rPr>
-        <w:t xml:space="preserve"> TaskOrder, VisitOrder, DocumentOrder</w:t>
-      </w:r>
-      <w:r>
-        <w:rPr>
-          <w:sz w:val="20"/>
-          <w:szCs w:val="20"/>
-        </w:rPr>
         <w:t xml:space="preserve"> </w:t>
       </w:r>
-      <w:r>
-        <w:rPr>
-          <w:sz w:val="20"/>
-          <w:szCs w:val="20"/>
-        </w:rPr>
-        <w:t>and FriendlyNames table</w:t>
+      <w:proofErr w:type="spellStart"/>
+      <w:r>
+        <w:rPr>
+          <w:sz w:val="20"/>
+          <w:szCs w:val="20"/>
+        </w:rPr>
+        <w:t>TaskOrder</w:t>
+      </w:r>
+      <w:proofErr w:type="spellEnd"/>
+      <w:r>
+        <w:rPr>
+          <w:sz w:val="20"/>
+          <w:szCs w:val="20"/>
+        </w:rPr>
+        <w:t xml:space="preserve">, </w:t>
+      </w:r>
+      <w:proofErr w:type="spellStart"/>
+      <w:r>
+        <w:rPr>
+          <w:sz w:val="20"/>
+          <w:szCs w:val="20"/>
+        </w:rPr>
+        <w:t>VisitOrder</w:t>
+      </w:r>
+      <w:proofErr w:type="spellEnd"/>
+      <w:r>
+        <w:rPr>
+          <w:sz w:val="20"/>
+          <w:szCs w:val="20"/>
+        </w:rPr>
+        <w:t xml:space="preserve">, </w:t>
+      </w:r>
+      <w:proofErr w:type="spellStart"/>
+      <w:r>
+        <w:rPr>
+          <w:sz w:val="20"/>
+          <w:szCs w:val="20"/>
+        </w:rPr>
+        <w:t>DocumentOrder</w:t>
+      </w:r>
+      <w:proofErr w:type="spellEnd"/>
+      <w:r>
+        <w:rPr>
+          <w:sz w:val="20"/>
+          <w:szCs w:val="20"/>
+        </w:rPr>
+        <w:t xml:space="preserve"> </w:t>
+      </w:r>
+      <w:r>
+        <w:rPr>
+          <w:sz w:val="20"/>
+          <w:szCs w:val="20"/>
+        </w:rPr>
+        <w:t xml:space="preserve">and </w:t>
+      </w:r>
+      <w:proofErr w:type="spellStart"/>
+      <w:r>
+        <w:rPr>
+          <w:sz w:val="20"/>
+          <w:szCs w:val="20"/>
+        </w:rPr>
+        <w:t>FriendlyNames</w:t>
+      </w:r>
+      <w:proofErr w:type="spellEnd"/>
+      <w:r>
+        <w:rPr>
+          <w:sz w:val="20"/>
+          <w:szCs w:val="20"/>
+        </w:rPr>
+        <w:t xml:space="preserve"> table</w:t>
       </w:r>
       <w:r>
         <w:rPr>
@@ -18592,15 +19670,14 @@
       </w:pPr>
       <w:r>
         <w:rPr>
-          <w:noProof/>
           <w:sz w:val="20"/>
           <w:szCs w:val="20"/>
         </w:rPr>
         <w:drawing>
-          <wp:inline distT="0" distB="0" distL="0" distR="0" wp14:anchorId="5A7D82A9" wp14:editId="148ED672">
-            <wp:extent cx="6685915" cy="7915275"/>
-            <wp:effectExtent l="0" t="0" r="635" b="9525"/>
-            <wp:docPr id="625203544" name="Picture 3"/>
+          <wp:inline distT="0" distB="0" distL="0" distR="0" wp14:anchorId="2776D080" wp14:editId="29E2CCBF">
+            <wp:extent cx="6696710" cy="7937500"/>
+            <wp:effectExtent l="0" t="0" r="8890" b="6350"/>
+            <wp:docPr id="1491774488" name="Picture 5"/>
             <wp:cNvGraphicFramePr>
               <a:graphicFrameLocks xmlns:a="http://schemas.openxmlformats.org/drawingml/2006/main" noChangeAspect="1"/>
             </wp:cNvGraphicFramePr>
@@ -18608,7 +19685,7 @@
               <a:graphicData uri="http://schemas.openxmlformats.org/drawingml/2006/picture">
                 <pic:pic xmlns:pic="http://schemas.openxmlformats.org/drawingml/2006/picture">
                   <pic:nvPicPr>
-                    <pic:cNvPr id="0" name="Picture 3"/>
+                    <pic:cNvPr id="1491774488" name="Picture 5"/>
                     <pic:cNvPicPr>
                       <a:picLocks noChangeAspect="1" noChangeArrowheads="1"/>
                     </pic:cNvPicPr>
@@ -18629,7 +19706,7 @@
                   <pic:spPr bwMode="auto">
                     <a:xfrm>
                       <a:off x="0" y="0"/>
-                      <a:ext cx="6685915" cy="7915275"/>
+                      <a:ext cx="6696710" cy="7937500"/>
                     </a:xfrm>
                     <a:prstGeom prst="rect">
                       <a:avLst/>
@@ -18817,7 +19894,7 @@
             <v:shape id="_x0000_s1025" type="#_x0000_t75" style="position:absolute;left:0;text-align:left;margin-left:463.75pt;margin-top:.75pt;width:63.55pt;height:9.75pt;z-index:251659264;mso-position-horizontal-relative:text;mso-position-vertical-relative:text">
               <v:imagedata r:id="rId2" o:title=""/>
             </v:shape>
-            <o:OLEObject Type="Embed" ProgID="PBrush" ShapeID="_x0000_s1025" DrawAspect="Content" ObjectID="_1831107509" r:id="rId3"/>
+            <o:OLEObject Type="Embed" ProgID="PBrush" ShapeID="_x0000_s1025" DrawAspect="Content" ObjectID="_1842186342" r:id="rId3"/>
           </w:object>
         </w:r>
         <w:r>
@@ -19207,9 +20284,9 @@
     </w:lvl>
   </w:abstractNum>
   <w:abstractNum w:abstractNumId="3" w15:restartNumberingAfterBreak="0">
-    <w:nsid w:val="405D69D3"/>
+    <w:nsid w:val="3D0660AE"/>
     <w:multiLevelType w:val="hybridMultilevel"/>
-    <w:tmpl w:val="1502593E"/>
+    <w:tmpl w:val="57BEAA8C"/>
     <w:lvl w:ilvl="0" w:tplc="08090001">
       <w:start w:val="1"/>
       <w:numFmt w:val="bullet"/>
@@ -19320,6 +20397,119 @@
     </w:lvl>
   </w:abstractNum>
   <w:abstractNum w:abstractNumId="4" w15:restartNumberingAfterBreak="0">
+    <w:nsid w:val="405D69D3"/>
+    <w:multiLevelType w:val="hybridMultilevel"/>
+    <w:tmpl w:val="1502593E"/>
+    <w:lvl w:ilvl="0" w:tplc="08090001">
+      <w:start w:val="1"/>
+      <w:numFmt w:val="bullet"/>
+      <w:lvlText w:val=""/>
+      <w:lvlJc w:val="left"/>
+      <w:pPr>
+        <w:ind w:left="720" w:hanging="360"/>
+      </w:pPr>
+      <w:rPr>
+        <w:rFonts w:ascii="Symbol" w:hAnsi="Symbol" w:hint="default"/>
+      </w:rPr>
+    </w:lvl>
+    <w:lvl w:ilvl="1" w:tplc="08090003" w:tentative="1">
+      <w:start w:val="1"/>
+      <w:numFmt w:val="bullet"/>
+      <w:lvlText w:val="o"/>
+      <w:lvlJc w:val="left"/>
+      <w:pPr>
+        <w:ind w:left="1440" w:hanging="360"/>
+      </w:pPr>
+      <w:rPr>
+        <w:rFonts w:ascii="Courier New" w:hAnsi="Courier New" w:cs="Courier New" w:hint="default"/>
+      </w:rPr>
+    </w:lvl>
+    <w:lvl w:ilvl="2" w:tplc="08090005" w:tentative="1">
+      <w:start w:val="1"/>
+      <w:numFmt w:val="bullet"/>
+      <w:lvlText w:val=""/>
+      <w:lvlJc w:val="left"/>
+      <w:pPr>
+        <w:ind w:left="2160" w:hanging="360"/>
+      </w:pPr>
+      <w:rPr>
+        <w:rFonts w:ascii="Wingdings" w:hAnsi="Wingdings" w:hint="default"/>
+      </w:rPr>
+    </w:lvl>
+    <w:lvl w:ilvl="3" w:tplc="08090001" w:tentative="1">
+      <w:start w:val="1"/>
+      <w:numFmt w:val="bullet"/>
+      <w:lvlText w:val=""/>
+      <w:lvlJc w:val="left"/>
+      <w:pPr>
+        <w:ind w:left="2880" w:hanging="360"/>
+      </w:pPr>
+      <w:rPr>
+        <w:rFonts w:ascii="Symbol" w:hAnsi="Symbol" w:hint="default"/>
+      </w:rPr>
+    </w:lvl>
+    <w:lvl w:ilvl="4" w:tplc="08090003" w:tentative="1">
+      <w:start w:val="1"/>
+      <w:numFmt w:val="bullet"/>
+      <w:lvlText w:val="o"/>
+      <w:lvlJc w:val="left"/>
+      <w:pPr>
+        <w:ind w:left="3600" w:hanging="360"/>
+      </w:pPr>
+      <w:rPr>
+        <w:rFonts w:ascii="Courier New" w:hAnsi="Courier New" w:cs="Courier New" w:hint="default"/>
+      </w:rPr>
+    </w:lvl>
+    <w:lvl w:ilvl="5" w:tplc="08090005" w:tentative="1">
+      <w:start w:val="1"/>
+      <w:numFmt w:val="bullet"/>
+      <w:lvlText w:val=""/>
+      <w:lvlJc w:val="left"/>
+      <w:pPr>
+        <w:ind w:left="4320" w:hanging="360"/>
+      </w:pPr>
+      <w:rPr>
+        <w:rFonts w:ascii="Wingdings" w:hAnsi="Wingdings" w:hint="default"/>
+      </w:rPr>
+    </w:lvl>
+    <w:lvl w:ilvl="6" w:tplc="08090001" w:tentative="1">
+      <w:start w:val="1"/>
+      <w:numFmt w:val="bullet"/>
+      <w:lvlText w:val=""/>
+      <w:lvlJc w:val="left"/>
+      <w:pPr>
+        <w:ind w:left="5040" w:hanging="360"/>
+      </w:pPr>
+      <w:rPr>
+        <w:rFonts w:ascii="Symbol" w:hAnsi="Symbol" w:hint="default"/>
+      </w:rPr>
+    </w:lvl>
+    <w:lvl w:ilvl="7" w:tplc="08090003" w:tentative="1">
+      <w:start w:val="1"/>
+      <w:numFmt w:val="bullet"/>
+      <w:lvlText w:val="o"/>
+      <w:lvlJc w:val="left"/>
+      <w:pPr>
+        <w:ind w:left="5760" w:hanging="360"/>
+      </w:pPr>
+      <w:rPr>
+        <w:rFonts w:ascii="Courier New" w:hAnsi="Courier New" w:cs="Courier New" w:hint="default"/>
+      </w:rPr>
+    </w:lvl>
+    <w:lvl w:ilvl="8" w:tplc="08090005" w:tentative="1">
+      <w:start w:val="1"/>
+      <w:numFmt w:val="bullet"/>
+      <w:lvlText w:val=""/>
+      <w:lvlJc w:val="left"/>
+      <w:pPr>
+        <w:ind w:left="6480" w:hanging="360"/>
+      </w:pPr>
+      <w:rPr>
+        <w:rFonts w:ascii="Wingdings" w:hAnsi="Wingdings" w:hint="default"/>
+      </w:rPr>
+    </w:lvl>
+  </w:abstractNum>
+  <w:abstractNum w:abstractNumId="5" w15:restartNumberingAfterBreak="0">
     <w:nsid w:val="5291501B"/>
     <w:multiLevelType w:val="hybridMultilevel"/>
     <w:tmpl w:val="88548CCA"/>
@@ -19408,7 +20598,7 @@
       </w:pPr>
     </w:lvl>
   </w:abstractNum>
-  <w:abstractNum w:abstractNumId="5" w15:restartNumberingAfterBreak="0">
+  <w:abstractNum w:abstractNumId="6" w15:restartNumberingAfterBreak="0">
     <w:nsid w:val="6610405D"/>
     <w:multiLevelType w:val="hybridMultilevel"/>
     <w:tmpl w:val="F17813DC"/>
@@ -19521,7 +20711,7 @@
       </w:rPr>
     </w:lvl>
   </w:abstractNum>
-  <w:abstractNum w:abstractNumId="6" w15:restartNumberingAfterBreak="0">
+  <w:abstractNum w:abstractNumId="7" w15:restartNumberingAfterBreak="0">
     <w:nsid w:val="66104220"/>
     <w:multiLevelType w:val="hybridMultilevel"/>
     <w:tmpl w:val="D85E3A3E"/>
@@ -19634,7 +20824,7 @@
       </w:rPr>
     </w:lvl>
   </w:abstractNum>
-  <w:abstractNum w:abstractNumId="7" w15:restartNumberingAfterBreak="0">
+  <w:abstractNum w:abstractNumId="8" w15:restartNumberingAfterBreak="0">
     <w:nsid w:val="682B7A7C"/>
     <w:multiLevelType w:val="hybridMultilevel"/>
     <w:tmpl w:val="776CE44E"/>
@@ -19747,7 +20937,7 @@
       </w:rPr>
     </w:lvl>
   </w:abstractNum>
-  <w:abstractNum w:abstractNumId="8" w15:restartNumberingAfterBreak="0">
+  <w:abstractNum w:abstractNumId="9" w15:restartNumberingAfterBreak="0">
     <w:nsid w:val="6B501BA5"/>
     <w:multiLevelType w:val="hybridMultilevel"/>
     <w:tmpl w:val="9E20C142"/>
@@ -19860,7 +21050,7 @@
       </w:rPr>
     </w:lvl>
   </w:abstractNum>
-  <w:abstractNum w:abstractNumId="9" w15:restartNumberingAfterBreak="0">
+  <w:abstractNum w:abstractNumId="10" w15:restartNumberingAfterBreak="0">
     <w:nsid w:val="6DC56BDB"/>
     <w:multiLevelType w:val="hybridMultilevel"/>
     <w:tmpl w:val="E5FA5608"/>
@@ -19973,7 +21163,7 @@
       </w:rPr>
     </w:lvl>
   </w:abstractNum>
-  <w:abstractNum w:abstractNumId="10" w15:restartNumberingAfterBreak="0">
+  <w:abstractNum w:abstractNumId="11" w15:restartNumberingAfterBreak="0">
     <w:nsid w:val="76027CF2"/>
     <w:multiLevelType w:val="hybridMultilevel"/>
     <w:tmpl w:val="649E57D4"/>
@@ -20086,7 +21276,7 @@
       </w:rPr>
     </w:lvl>
   </w:abstractNum>
-  <w:abstractNum w:abstractNumId="11" w15:restartNumberingAfterBreak="0">
+  <w:abstractNum w:abstractNumId="12" w15:restartNumberingAfterBreak="0">
     <w:nsid w:val="76241C87"/>
     <w:multiLevelType w:val="hybridMultilevel"/>
     <w:tmpl w:val="ED1CECA8"/>
@@ -20200,40 +21390,43 @@
     </w:lvl>
   </w:abstractNum>
   <w:num w:numId="1" w16cid:durableId="871459532">
+    <w:abstractNumId w:val="7"/>
+  </w:num>
+  <w:num w:numId="2" w16cid:durableId="250821284">
+    <w:abstractNumId w:val="12"/>
+  </w:num>
+  <w:num w:numId="3" w16cid:durableId="465899206">
     <w:abstractNumId w:val="6"/>
   </w:num>
-  <w:num w:numId="2" w16cid:durableId="250821284">
-    <w:abstractNumId w:val="11"/>
-  </w:num>
-  <w:num w:numId="3" w16cid:durableId="465899206">
-    <w:abstractNumId w:val="5"/>
-  </w:num>
   <w:num w:numId="4" w16cid:durableId="1161654955">
-    <w:abstractNumId w:val="8"/>
+    <w:abstractNumId w:val="9"/>
   </w:num>
   <w:num w:numId="5" w16cid:durableId="109249521">
-    <w:abstractNumId w:val="7"/>
+    <w:abstractNumId w:val="8"/>
   </w:num>
   <w:num w:numId="6" w16cid:durableId="2066023296">
     <w:abstractNumId w:val="0"/>
   </w:num>
   <w:num w:numId="7" w16cid:durableId="481313554">
-    <w:abstractNumId w:val="3"/>
+    <w:abstractNumId w:val="4"/>
   </w:num>
   <w:num w:numId="8" w16cid:durableId="456728767">
-    <w:abstractNumId w:val="9"/>
+    <w:abstractNumId w:val="10"/>
   </w:num>
   <w:num w:numId="9" w16cid:durableId="470707316">
-    <w:abstractNumId w:val="10"/>
+    <w:abstractNumId w:val="11"/>
   </w:num>
   <w:num w:numId="10" w16cid:durableId="1965889927">
     <w:abstractNumId w:val="1"/>
   </w:num>
   <w:num w:numId="11" w16cid:durableId="365371932">
-    <w:abstractNumId w:val="4"/>
+    <w:abstractNumId w:val="5"/>
   </w:num>
   <w:num w:numId="12" w16cid:durableId="869076139">
     <w:abstractNumId w:val="2"/>
+  </w:num>
+  <w:num w:numId="13" w16cid:durableId="1869827702">
+    <w:abstractNumId w:val="3"/>
   </w:num>
 </w:numbering>
 </file>
@@ -20842,7 +22035,6 @@
   <w:style w:type="character" w:default="1" w:styleId="DefaultParagraphFont">
     <w:name w:val="Default Paragraph Font"/>
     <w:uiPriority w:val="1"/>
-    <w:semiHidden/>
     <w:unhideWhenUsed/>
   </w:style>
   <w:style w:type="table" w:default="1" w:styleId="TableNormal">

</xml_diff>

<commit_message>
Admin docs amended and test SSL cert creation commands added
</commit_message>
<xml_diff>
--- a/BridgeOpsClient/Documentation/Bridge Manager Administration Guide.docx
+++ b/BridgeOpsClient/Documentation/Bridge Manager Administration Guide.docx
@@ -7555,6 +7555,26 @@
     </w:p>
     <w:p>
       <w:pPr>
+        <w:pStyle w:val="ListParagraph"/>
+        <w:numPr>
+          <w:ilvl w:val="0"/>
+          <w:numId w:val="13"/>
+        </w:numPr>
+        <w:rPr>
+          <w:sz w:val="20"/>
+          <w:szCs w:val="20"/>
+        </w:rPr>
+      </w:pPr>
+      <w:r>
+        <w:rPr>
+          <w:sz w:val="20"/>
+          <w:szCs w:val="20"/>
+        </w:rPr>
+        <w:t>The certificate’s private key must be readable by the user account intended to run the agent.</w:t>
+      </w:r>
+    </w:p>
+    <w:p>
+      <w:pPr>
         <w:rPr>
           <w:sz w:val="20"/>
           <w:szCs w:val="20"/>
@@ -11067,12 +11087,6 @@
           <w:szCs w:val="20"/>
         </w:rPr>
         <w:br/>
-      </w:r>
-      <w:r>
-        <w:rPr>
-          <w:sz w:val="20"/>
-          <w:szCs w:val="20"/>
-        </w:rPr>
         <w:t xml:space="preserve">Open the text file containing the server’s error log in the system’s default text editor. </w:t>
       </w:r>
     </w:p>
@@ -11263,7 +11277,7 @@
           <w:sz w:val="20"/>
           <w:szCs w:val="20"/>
         </w:rPr>
-        <w:t>set</w:t>
+        <w:t>set network config</w:t>
       </w:r>
       <w:r>
         <w:rPr>
@@ -11273,8 +11287,23 @@
           <w:sz w:val="20"/>
           <w:szCs w:val="20"/>
         </w:rPr>
-        <w:t xml:space="preserve"> network config</w:t>
-      </w:r>
+        <w:br/>
+      </w:r>
+      <w:r>
+        <w:rPr>
+          <w:sz w:val="20"/>
+          <w:szCs w:val="20"/>
+        </w:rPr>
+        <w:t>Set the port (the application default is 61152), SSL mode, and SSL thumbprint if required.</w:t>
+      </w:r>
+    </w:p>
+    <w:p>
+      <w:pPr>
+        <w:rPr>
+          <w:sz w:val="20"/>
+          <w:szCs w:val="20"/>
+        </w:rPr>
+      </w:pPr>
       <w:r>
         <w:rPr>
           <w:rFonts w:ascii="Roboto Mono" w:hAnsi="Roboto Mono"/>
@@ -11283,6 +11312,16 @@
           <w:sz w:val="20"/>
           <w:szCs w:val="20"/>
         </w:rPr>
+        <w:t>parse network config</w:t>
+      </w:r>
+      <w:r>
+        <w:rPr>
+          <w:rFonts w:ascii="Roboto Mono" w:hAnsi="Roboto Mono"/>
+          <w:b/>
+          <w:bCs/>
+          <w:sz w:val="20"/>
+          <w:szCs w:val="20"/>
+        </w:rPr>
         <w:br/>
       </w:r>
       <w:r>
@@ -11290,7 +11329,21 @@
           <w:sz w:val="20"/>
           <w:szCs w:val="20"/>
         </w:rPr>
-        <w:t>Set the port (the application default is 61152), SSL mode, and SSL thumbprint if required.</w:t>
+        <w:t>Test the validity of network-config.txt located in “Documents/Bridge Manager/Config Files”.</w:t>
+      </w:r>
+      <w:r>
+        <w:rPr>
+          <w:sz w:val="20"/>
+          <w:szCs w:val="20"/>
+        </w:rPr>
+        <w:t xml:space="preserve"> Assuming the file is present and formatted correctly, you will be presented with the </w:t>
+      </w:r>
+      <w:r>
+        <w:rPr>
+          <w:sz w:val="20"/>
+          <w:szCs w:val="20"/>
+        </w:rPr>
+        <w:t>configured ports.</w:t>
       </w:r>
     </w:p>
     <w:p>
@@ -11308,7 +11361,7 @@
           <w:sz w:val="20"/>
           <w:szCs w:val="20"/>
         </w:rPr>
-        <w:t>parse network config</w:t>
+        <w:t>create network config</w:t>
       </w:r>
       <w:r>
         <w:rPr>
@@ -11325,21 +11378,14 @@
           <w:sz w:val="20"/>
           <w:szCs w:val="20"/>
         </w:rPr>
-        <w:t>Test the validity of network-config.txt located in “Documents/Bridge Manager/Config Files”.</w:t>
-      </w:r>
-      <w:r>
-        <w:rPr>
-          <w:sz w:val="20"/>
-          <w:szCs w:val="20"/>
-        </w:rPr>
-        <w:t xml:space="preserve"> Assuming the file is present and formatted correctly, you will be presented with the </w:t>
-      </w:r>
-      <w:r>
-        <w:rPr>
-          <w:sz w:val="20"/>
-          <w:szCs w:val="20"/>
-        </w:rPr>
-        <w:t>configured ports.</w:t>
+        <w:t>Create a fresh network-config.txt file in “Documents/Bridge Manager/Config Files”</w:t>
+      </w:r>
+      <w:r>
+        <w:rPr>
+          <w:sz w:val="20"/>
+          <w:szCs w:val="20"/>
+        </w:rPr>
+        <w:t>.</w:t>
       </w:r>
     </w:p>
     <w:p>
@@ -11357,7 +11403,7 @@
           <w:sz w:val="20"/>
           <w:szCs w:val="20"/>
         </w:rPr>
-        <w:t>create network config</w:t>
+        <w:t>open network config</w:t>
       </w:r>
       <w:r>
         <w:rPr>
@@ -11374,73 +11420,7 @@
           <w:sz w:val="20"/>
           <w:szCs w:val="20"/>
         </w:rPr>
-        <w:t>Create a fresh network-config.txt file in “Documents/Bridge Manager/Config Files”</w:t>
-      </w:r>
-      <w:r>
-        <w:rPr>
-          <w:sz w:val="20"/>
-          <w:szCs w:val="20"/>
-        </w:rPr>
-        <w:t>.</w:t>
-      </w:r>
-    </w:p>
-    <w:p>
-      <w:pPr>
-        <w:rPr>
-          <w:sz w:val="20"/>
-          <w:szCs w:val="20"/>
-        </w:rPr>
-      </w:pPr>
-      <w:r>
-        <w:rPr>
-          <w:rFonts w:ascii="Roboto Mono" w:hAnsi="Roboto Mono"/>
-          <w:b/>
-          <w:bCs/>
-          <w:sz w:val="20"/>
-          <w:szCs w:val="20"/>
-        </w:rPr>
-        <w:t xml:space="preserve">open </w:t>
-      </w:r>
-      <w:r>
-        <w:rPr>
-          <w:rFonts w:ascii="Roboto Mono" w:hAnsi="Roboto Mono"/>
-          <w:b/>
-          <w:bCs/>
-          <w:sz w:val="20"/>
-          <w:szCs w:val="20"/>
-        </w:rPr>
-        <w:t>network config</w:t>
-      </w:r>
-      <w:r>
-        <w:rPr>
-          <w:rFonts w:ascii="Roboto Mono" w:hAnsi="Roboto Mono"/>
-          <w:b/>
-          <w:bCs/>
-          <w:sz w:val="20"/>
-          <w:szCs w:val="20"/>
-        </w:rPr>
-        <w:br/>
-      </w:r>
-      <w:r>
-        <w:rPr>
-          <w:sz w:val="20"/>
-          <w:szCs w:val="20"/>
-        </w:rPr>
-        <w:t xml:space="preserve">Open the text file containing the </w:t>
-      </w:r>
-      <w:r>
-        <w:rPr>
-          <w:sz w:val="20"/>
-          <w:szCs w:val="20"/>
-        </w:rPr>
-        <w:t xml:space="preserve">network configuration </w:t>
-      </w:r>
-      <w:r>
-        <w:rPr>
-          <w:sz w:val="20"/>
-          <w:szCs w:val="20"/>
-        </w:rPr>
-        <w:t>in the system’s default text editor.</w:t>
+        <w:t>Open the text file containing the network configuration in the system’s default text editor.</w:t>
       </w:r>
     </w:p>
     <w:p>
@@ -19670,6 +19650,7 @@
       </w:pPr>
       <w:r>
         <w:rPr>
+          <w:noProof/>
           <w:sz w:val="20"/>
           <w:szCs w:val="20"/>
         </w:rPr>
@@ -19894,7 +19875,7 @@
             <v:shape id="_x0000_s1025" type="#_x0000_t75" style="position:absolute;left:0;text-align:left;margin-left:463.75pt;margin-top:.75pt;width:63.55pt;height:9.75pt;z-index:251659264;mso-position-horizontal-relative:text;mso-position-vertical-relative:text">
               <v:imagedata r:id="rId2" o:title=""/>
             </v:shape>
-            <o:OLEObject Type="Embed" ProgID="PBrush" ShapeID="_x0000_s1025" DrawAspect="Content" ObjectID="_1842186342" r:id="rId3"/>
+            <o:OLEObject Type="Embed" ProgID="PBrush" ShapeID="_x0000_s1025" DrawAspect="Content" ObjectID="_1842426347" r:id="rId3"/>
           </w:object>
         </w:r>
         <w:r>
@@ -22035,6 +22016,7 @@
   <w:style w:type="character" w:default="1" w:styleId="DefaultParagraphFont">
     <w:name w:val="Default Paragraph Font"/>
     <w:uiPriority w:val="1"/>
+    <w:semiHidden/>
     <w:unhideWhenUsed/>
   </w:style>
   <w:style w:type="table" w:default="1" w:styleId="TableNormal">

</xml_diff>

<commit_message>
Fixed a bug preventing the agent from closing clients remotely
</commit_message>
<xml_diff>
--- a/BridgeOpsClient/Documentation/Bridge Manager Administration Guide.docx
+++ b/BridgeOpsClient/Documentation/Bridge Manager Administration Guide.docx
@@ -11028,6 +11028,57 @@
           <w:szCs w:val="20"/>
         </w:rPr>
         <w:t>Note that this function can be unreliable due to its dependence on the client application being logged in and responsive.</w:t>
+      </w:r>
+      <w:r>
+        <w:rPr>
+          <w:sz w:val="20"/>
+          <w:szCs w:val="20"/>
+        </w:rPr>
+        <w:t xml:space="preserve"> After running this command,</w:t>
+      </w:r>
+      <w:r>
+        <w:rPr>
+          <w:sz w:val="20"/>
+          <w:szCs w:val="20"/>
+        </w:rPr>
+        <w:t xml:space="preserve"> it may take up to 10 seconds for the session to be terminated and reflected in the information provided by the</w:t>
+      </w:r>
+      <w:r>
+        <w:rPr>
+          <w:rFonts w:ascii="Roboto Mono" w:hAnsi="Roboto Mono"/>
+          <w:b/>
+          <w:bCs/>
+          <w:sz w:val="16"/>
+          <w:szCs w:val="16"/>
+        </w:rPr>
+        <w:t xml:space="preserve"> s</w:t>
+      </w:r>
+      <w:r>
+        <w:rPr>
+          <w:rFonts w:ascii="Roboto Mono" w:hAnsi="Roboto Mono"/>
+          <w:b/>
+          <w:bCs/>
+          <w:sz w:val="16"/>
+          <w:szCs w:val="16"/>
+        </w:rPr>
+        <w:t>tatu</w:t>
+      </w:r>
+      <w:r>
+        <w:rPr>
+          <w:rFonts w:ascii="Roboto Mono" w:hAnsi="Roboto Mono"/>
+          <w:b/>
+          <w:bCs/>
+          <w:sz w:val="16"/>
+          <w:szCs w:val="16"/>
+        </w:rPr>
+        <w:t xml:space="preserve">s </w:t>
+      </w:r>
+      <w:r>
+        <w:rPr>
+          <w:sz w:val="20"/>
+          <w:szCs w:val="20"/>
+        </w:rPr>
+        <w:t>command.</w:t>
       </w:r>
     </w:p>
     <w:p>
@@ -14845,6 +14896,99 @@
           <w:sz w:val="20"/>
           <w:szCs w:val="20"/>
         </w:rPr>
+        <w:t xml:space="preserve"> </w:t>
+      </w:r>
+      <w:r>
+        <w:rPr>
+          <w:sz w:val="20"/>
+          <w:szCs w:val="20"/>
+        </w:rPr>
+        <w:t>It may take up to</w:t>
+      </w:r>
+      <w:r>
+        <w:rPr>
+          <w:sz w:val="20"/>
+          <w:szCs w:val="20"/>
+        </w:rPr>
+        <w:t xml:space="preserve"> </w:t>
+      </w:r>
+      <w:r>
+        <w:rPr>
+          <w:sz w:val="20"/>
+          <w:szCs w:val="20"/>
+        </w:rPr>
+        <w:t>10</w:t>
+      </w:r>
+      <w:r>
+        <w:rPr>
+          <w:sz w:val="20"/>
+          <w:szCs w:val="20"/>
+        </w:rPr>
+        <w:t xml:space="preserve"> seconds</w:t>
+      </w:r>
+      <w:r>
+        <w:rPr>
+          <w:sz w:val="20"/>
+          <w:szCs w:val="20"/>
+        </w:rPr>
+        <w:t xml:space="preserve"> for the session to be closed</w:t>
+      </w:r>
+      <w:r>
+        <w:rPr>
+          <w:sz w:val="20"/>
+          <w:szCs w:val="20"/>
+        </w:rPr>
+        <w:t>. Click</w:t>
+      </w:r>
+      <w:r>
+        <w:rPr>
+          <w:sz w:val="20"/>
+          <w:szCs w:val="20"/>
+        </w:rPr>
+        <w:t xml:space="preserve"> </w:t>
+      </w:r>
+      <w:r>
+        <w:rPr>
+          <w:b/>
+          <w:bCs/>
+          <w:sz w:val="20"/>
+          <w:szCs w:val="20"/>
+        </w:rPr>
+        <w:t>Refresh</w:t>
+      </w:r>
+      <w:r>
+        <w:rPr>
+          <w:sz w:val="20"/>
+          <w:szCs w:val="20"/>
+        </w:rPr>
+        <w:t xml:space="preserve"> to check the </w:t>
+      </w:r>
+      <w:r>
+        <w:rPr>
+          <w:sz w:val="20"/>
+          <w:szCs w:val="20"/>
+        </w:rPr>
+        <w:t xml:space="preserve">user’s </w:t>
+      </w:r>
+      <w:r>
+        <w:rPr>
+          <w:sz w:val="20"/>
+          <w:szCs w:val="20"/>
+        </w:rPr>
+        <w:t>status</w:t>
+      </w:r>
+      <w:r>
+        <w:rPr>
+          <w:sz w:val="20"/>
+          <w:szCs w:val="20"/>
+        </w:rPr>
+        <w:t>.</w:t>
+      </w:r>
+      <w:r>
+        <w:rPr>
+          <w:sz w:val="20"/>
+          <w:szCs w:val="20"/>
+        </w:rPr>
         <w:br w:type="page"/>
       </w:r>
     </w:p>
@@ -19875,7 +20019,7 @@
             <v:shape id="_x0000_s1025" type="#_x0000_t75" style="position:absolute;left:0;text-align:left;margin-left:463.75pt;margin-top:.75pt;width:63.55pt;height:9.75pt;z-index:251659264;mso-position-horizontal-relative:text;mso-position-vertical-relative:text">
               <v:imagedata r:id="rId2" o:title=""/>
             </v:shape>
-            <o:OLEObject Type="Embed" ProgID="PBrush" ShapeID="_x0000_s1025" DrawAspect="Content" ObjectID="_1842426347" r:id="rId3"/>
+            <o:OLEObject Type="Embed" ProgID="PBrush" ShapeID="_x0000_s1025" DrawAspect="Content" ObjectID="_1843635973" r:id="rId3"/>
           </w:object>
         </w:r>
         <w:r>

</xml_diff>

<commit_message>
Updated version number in docs
</commit_message>
<xml_diff>
--- a/BridgeOpsClient/Documentation/Bridge Manager Administration Guide.docx
+++ b/BridgeOpsClient/Documentation/Bridge Manager Administration Guide.docx
@@ -1,6 +1,6 @@
 
 <file path=word/document.xml><?xml version="1.0" encoding="utf-8"?>
-<w:document xmlns:wpc="http://schemas.microsoft.com/office/word/2010/wordprocessingCanvas" xmlns:cx="http://schemas.microsoft.com/office/drawing/2014/chartex" xmlns:cx1="http://schemas.microsoft.com/office/drawing/2015/9/8/chartex" xmlns:cx2="http://schemas.microsoft.com/office/drawing/2015/10/21/chartex" xmlns:cx3="http://schemas.microsoft.com/office/drawing/2016/5/9/chartex" xmlns:cx4="http://schemas.microsoft.com/office/drawing/2016/5/10/chartex" xmlns:cx5="http://schemas.microsoft.com/office/drawing/2016/5/11/chartex" xmlns:cx6="http://schemas.microsoft.com/office/drawing/2016/5/12/chartex" xmlns:cx7="http://schemas.microsoft.com/office/drawing/2016/5/13/chartex" xmlns:cx8="http://schemas.microsoft.com/office/drawing/2016/5/14/chartex" xmlns:mc="http://schemas.openxmlformats.org/markup-compatibility/2006" xmlns:aink="http://schemas.microsoft.com/office/drawing/2016/ink" xmlns:am3d="http://schemas.microsoft.com/office/drawing/2017/model3d" xmlns:o="urn:schemas-microsoft-com:office:office" xmlns:oel="http://schemas.microsoft.com/office/2019/extlst" xmlns:r="http://schemas.openxmlformats.org/officeDocument/2006/relationships" xmlns:m="http://schemas.openxmlformats.org/officeDocument/2006/math" xmlns:v="urn:schemas-microsoft-com:vml" xmlns:wp14="http://schemas.microsoft.com/office/word/2010/wordprocessingDrawing" xmlns:wp="http://schemas.openxmlformats.org/drawingml/2006/wordprocessingDrawing" xmlns:w10="urn:schemas-microsoft-com:office:word" xmlns:w="http://schemas.openxmlformats.org/wordprocessingml/2006/main" xmlns:w14="http://schemas.microsoft.com/office/word/2010/wordml" xmlns:w15="http://schemas.microsoft.com/office/word/2012/wordml" xmlns:w16cex="http://schemas.microsoft.com/office/word/2018/wordml/cex" xmlns:w16cid="http://schemas.microsoft.com/office/word/2016/wordml/cid" xmlns:w16="http://schemas.microsoft.com/office/word/2018/wordml" xmlns:w16du="http://schemas.microsoft.com/office/word/2023/wordml/word16du" xmlns:w16sdtdh="http://schemas.microsoft.com/office/word/2020/wordml/sdtdatahash" xmlns:w16sdtfl="http://schemas.microsoft.com/office/word/2024/wordml/sdtformatlock" xmlns:w16se="http://schemas.microsoft.com/office/word/2015/wordml/symex" xmlns:wpg="http://schemas.microsoft.com/office/word/2010/wordprocessingGroup" xmlns:wpi="http://schemas.microsoft.com/office/word/2010/wordprocessingInk" xmlns:wne="http://schemas.microsoft.com/office/word/2006/wordml" xmlns:wps="http://schemas.microsoft.com/office/word/2010/wordprocessingShape" mc:Ignorable="w14 w15 w16se w16cid w16 w16cex w16sdtdh w16sdtfl w16du wp14">
+<w:document xmlns:wpc="http://schemas.microsoft.com/office/word/2010/wordprocessingCanvas" xmlns:cx="http://schemas.microsoft.com/office/drawing/2014/chartex" xmlns:cx1="http://schemas.microsoft.com/office/drawing/2015/9/8/chartex" xmlns:cx2="http://schemas.microsoft.com/office/drawing/2015/10/21/chartex" xmlns:cx3="http://schemas.microsoft.com/office/drawing/2016/5/9/chartex" xmlns:cx4="http://schemas.microsoft.com/office/drawing/2016/5/10/chartex" xmlns:cx5="http://schemas.microsoft.com/office/drawing/2016/5/11/chartex" xmlns:cx6="http://schemas.microsoft.com/office/drawing/2016/5/12/chartex" xmlns:cx7="http://schemas.microsoft.com/office/drawing/2016/5/13/chartex" xmlns:cx8="http://schemas.microsoft.com/office/drawing/2016/5/14/chartex" xmlns:mc="http://schemas.openxmlformats.org/markup-compatibility/2006" xmlns:aink="http://schemas.microsoft.com/office/drawing/2016/ink" xmlns:am3d="http://schemas.microsoft.com/office/drawing/2017/model3d" xmlns:o="urn:schemas-microsoft-com:office:office" xmlns:oel="http://schemas.microsoft.com/office/2019/extlst" xmlns:r="http://schemas.openxmlformats.org/officeDocument/2006/relationships" xmlns:m="http://schemas.openxmlformats.org/officeDocument/2006/math" xmlns:v="urn:schemas-microsoft-com:vml" xmlns:wp14="http://schemas.microsoft.com/office/word/2010/wordprocessingDrawing" xmlns:wp="http://schemas.openxmlformats.org/drawingml/2006/wordprocessingDrawing" xmlns:w10="urn:schemas-microsoft-com:office:word" xmlns:w="http://schemas.openxmlformats.org/wordprocessingml/2006/main" xmlns:w14="http://schemas.microsoft.com/office/word/2010/wordml" xmlns:w15="http://schemas.microsoft.com/office/word/2012/wordml" xmlns:w16cei="http://schemas.microsoft.com/office/word/2026/wordml/cei" xmlns:w16cex="http://schemas.microsoft.com/office/word/2018/wordml/cex" xmlns:w16cid="http://schemas.microsoft.com/office/word/2016/wordml/cid" xmlns:w16="http://schemas.microsoft.com/office/word/2018/wordml" xmlns:w16du="http://schemas.microsoft.com/office/word/2023/wordml/word16du" xmlns:w16sdtdh="http://schemas.microsoft.com/office/word/2020/wordml/sdtdatahash" xmlns:w16sdtfl="http://schemas.microsoft.com/office/word/2024/wordml/sdtformatlock" xmlns:w16se="http://schemas.microsoft.com/office/word/2015/wordml/symex" xmlns:wpg="http://schemas.microsoft.com/office/word/2010/wordprocessingGroup" xmlns:wpi="http://schemas.microsoft.com/office/word/2010/wordprocessingInk" xmlns:wne="http://schemas.microsoft.com/office/word/2006/wordml" xmlns:wps="http://schemas.microsoft.com/office/word/2010/wordprocessingShape" mc:Ignorable="w14 w15 w16se w16cid w16 w16cex w16sdtdh w16sdtfl w16du wp14">
   <w:body>
     <w:p>
       <w:pPr>
@@ -74,7 +74,6 @@
         </w:rPr>
         <w:t xml:space="preserve"> </w:t>
       </w:r>
-      <w:proofErr w:type="gramStart"/>
       <w:r>
         <w:rPr>
           <w:sz w:val="48"/>
@@ -98,9 +97,8 @@
           <w:sz w:val="36"/>
           <w:szCs w:val="36"/>
         </w:rPr>
-        <w:t>Administration</w:t>
-      </w:r>
-      <w:proofErr w:type="gramEnd"/>
+        <w:t>Administration Guide</w:t>
+      </w:r>
       <w:r>
         <w:rPr>
           <w:b/>
@@ -108,58 +106,49 @@
           <w:sz w:val="36"/>
           <w:szCs w:val="36"/>
         </w:rPr>
-        <w:t xml:space="preserve"> Guide</w:t>
-      </w:r>
-      <w:r>
-        <w:rPr>
-          <w:b/>
-          <w:bCs/>
+        <w:br/>
+      </w:r>
+      <w:r>
+        <w:rPr>
           <w:sz w:val="36"/>
           <w:szCs w:val="36"/>
         </w:rPr>
-        <w:br/>
+        <w:t xml:space="preserve">v </w:t>
       </w:r>
       <w:r>
         <w:rPr>
           <w:sz w:val="36"/>
           <w:szCs w:val="36"/>
         </w:rPr>
-        <w:t xml:space="preserve">v </w:t>
+        <w:t>1</w:t>
       </w:r>
       <w:r>
         <w:rPr>
           <w:sz w:val="36"/>
           <w:szCs w:val="36"/>
         </w:rPr>
-        <w:t>1</w:t>
+        <w:t>.</w:t>
       </w:r>
       <w:r>
         <w:rPr>
           <w:sz w:val="36"/>
           <w:szCs w:val="36"/>
         </w:rPr>
-        <w:t>.</w:t>
+        <w:t>3</w:t>
       </w:r>
       <w:r>
         <w:rPr>
           <w:sz w:val="36"/>
           <w:szCs w:val="36"/>
         </w:rPr>
-        <w:t>3</w:t>
+        <w:t>.</w:t>
       </w:r>
       <w:r>
         <w:rPr>
           <w:sz w:val="36"/>
           <w:szCs w:val="36"/>
         </w:rPr>
-        <w:t>.</w:t>
-      </w:r>
-      <w:r>
-        <w:rPr>
-          <w:sz w:val="36"/>
-          <w:szCs w:val="36"/>
-        </w:rPr>
-        <w:t>0</w:t>
+        <w:t>5</w:t>
       </w:r>
     </w:p>
     <w:p>
@@ -351,7 +340,6 @@
                               </w:rPr>
                               <w:tab/>
                             </w:r>
-                            <w:proofErr w:type="gramStart"/>
                             <w:r>
                               <w:rPr>
                                 <w:sz w:val="20"/>
@@ -369,7 +357,6 @@
                               </w:rPr>
                               <w:t>1</w:t>
                             </w:r>
-                            <w:proofErr w:type="gramEnd"/>
                           </w:p>
                           <w:p>
                             <w:pPr>
@@ -394,7 +381,6 @@
                               </w:rPr>
                               <w:tab/>
                             </w:r>
-                            <w:proofErr w:type="gramStart"/>
                             <w:r>
                               <w:rPr>
                                 <w:sz w:val="20"/>
@@ -410,7 +396,6 @@
                               </w:rPr>
                               <w:t>1</w:t>
                             </w:r>
-                            <w:proofErr w:type="gramEnd"/>
                           </w:p>
                           <w:p>
                             <w:pPr>
@@ -450,7 +435,6 @@
                               </w:rPr>
                               <w:tab/>
                             </w:r>
-                            <w:proofErr w:type="gramStart"/>
                             <w:r>
                               <w:rPr>
                                 <w:sz w:val="20"/>
@@ -468,7 +452,6 @@
                               </w:rPr>
                               <w:t>2</w:t>
                             </w:r>
-                            <w:proofErr w:type="gramEnd"/>
                           </w:p>
                           <w:p>
                             <w:pPr>
@@ -500,7 +483,6 @@
                               </w:rPr>
                               <w:tab/>
                             </w:r>
-                            <w:proofErr w:type="gramStart"/>
                             <w:r>
                               <w:rPr>
                                 <w:sz w:val="20"/>
@@ -522,7 +504,6 @@
                               </w:rPr>
                               <w:t>2</w:t>
                             </w:r>
-                            <w:proofErr w:type="gramEnd"/>
                           </w:p>
                           <w:p>
                             <w:pPr>
@@ -562,7 +543,6 @@
                               </w:rPr>
                               <w:tab/>
                             </w:r>
-                            <w:proofErr w:type="gramStart"/>
                             <w:r>
                               <w:rPr>
                                 <w:sz w:val="20"/>
@@ -580,7 +560,6 @@
                               </w:rPr>
                               <w:t>2</w:t>
                             </w:r>
-                            <w:proofErr w:type="gramEnd"/>
                           </w:p>
                           <w:p>
                             <w:pPr>
@@ -620,7 +599,6 @@
                               </w:rPr>
                               <w:tab/>
                             </w:r>
-                            <w:proofErr w:type="gramStart"/>
                             <w:r>
                               <w:rPr>
                                 <w:sz w:val="20"/>
@@ -638,7 +616,6 @@
                               </w:rPr>
                               <w:t>3</w:t>
                             </w:r>
-                            <w:proofErr w:type="gramEnd"/>
                           </w:p>
                           <w:p>
                             <w:pPr>
@@ -664,7 +641,6 @@
                               </w:rPr>
                               <w:tab/>
                             </w:r>
-                            <w:proofErr w:type="gramStart"/>
                             <w:r>
                               <w:rPr>
                                 <w:sz w:val="20"/>
@@ -682,7 +658,6 @@
                               </w:rPr>
                               <w:t>4</w:t>
                             </w:r>
-                            <w:proofErr w:type="gramEnd"/>
                           </w:p>
                           <w:p>
                             <w:pPr>
@@ -701,7 +676,6 @@
                               </w:rPr>
                               <w:t>Customise Network Port Settings</w:t>
                             </w:r>
-                            <w:proofErr w:type="gramStart"/>
                             <w:r>
                               <w:rPr>
                                 <w:sz w:val="20"/>
@@ -725,7 +699,6 @@
                               </w:rPr>
                               <w:t>4</w:t>
                             </w:r>
-                            <w:proofErr w:type="gramEnd"/>
                           </w:p>
                           <w:p>
                             <w:pPr>
@@ -746,7 +719,6 @@
                               </w:rPr>
                               <w:t>Creating and Restoring From Backups</w:t>
                             </w:r>
-                            <w:proofErr w:type="gramStart"/>
                             <w:r>
                               <w:rPr>
                                 <w:b/>
@@ -771,7 +743,6 @@
                               </w:rPr>
                               <w:t>4</w:t>
                             </w:r>
-                            <w:proofErr w:type="gramEnd"/>
                           </w:p>
                           <w:p>
                             <w:pPr>
@@ -803,7 +774,6 @@
                               </w:rPr>
                               <w:tab/>
                             </w:r>
-                            <w:proofErr w:type="gramStart"/>
                             <w:r>
                               <w:rPr>
                                 <w:sz w:val="20"/>
@@ -820,7 +790,6 @@
                               </w:rPr>
                               <w:t>4</w:t>
                             </w:r>
-                            <w:proofErr w:type="gramEnd"/>
                           </w:p>
                           <w:p>
                             <w:pPr>
@@ -845,7 +814,6 @@
                               </w:rPr>
                               <w:tab/>
                             </w:r>
-                            <w:proofErr w:type="gramStart"/>
                             <w:r>
                               <w:rPr>
                                 <w:sz w:val="20"/>
@@ -862,7 +830,6 @@
                               </w:rPr>
                               <w:t>4</w:t>
                             </w:r>
-                            <w:proofErr w:type="gramEnd"/>
                           </w:p>
                           <w:p>
                             <w:pPr>
@@ -890,7 +857,6 @@
                               </w:rPr>
                               <w:tab/>
                             </w:r>
-                            <w:proofErr w:type="gramStart"/>
                             <w:r>
                               <w:rPr>
                                 <w:sz w:val="20"/>
@@ -913,7 +879,6 @@
                               </w:rPr>
                               <w:t>5</w:t>
                             </w:r>
-                            <w:proofErr w:type="gramEnd"/>
                           </w:p>
                           <w:p>
                             <w:pPr>
@@ -960,7 +925,6 @@
                               </w:rPr>
                               <w:tab/>
                             </w:r>
-                            <w:proofErr w:type="gramStart"/>
                             <w:r>
                               <w:rPr>
                                 <w:sz w:val="20"/>
@@ -977,7 +941,6 @@
                               </w:rPr>
                               <w:t>5</w:t>
                             </w:r>
-                            <w:proofErr w:type="gramEnd"/>
                           </w:p>
                           <w:p>
                             <w:pPr>
@@ -1017,7 +980,6 @@
                               </w:rPr>
                               <w:tab/>
                             </w:r>
-                            <w:proofErr w:type="gramStart"/>
                             <w:r>
                               <w:rPr>
                                 <w:sz w:val="20"/>
@@ -1034,7 +996,6 @@
                               </w:rPr>
                               <w:t>5</w:t>
                             </w:r>
-                            <w:proofErr w:type="gramEnd"/>
                           </w:p>
                           <w:p>
                             <w:pPr>
@@ -1081,7 +1042,6 @@
                               </w:rPr>
                               <w:tab/>
                             </w:r>
-                            <w:proofErr w:type="gramStart"/>
                             <w:r>
                               <w:rPr>
                                 <w:sz w:val="20"/>
@@ -1098,7 +1058,6 @@
                               </w:rPr>
                               <w:t>7</w:t>
                             </w:r>
-                            <w:proofErr w:type="gramEnd"/>
                           </w:p>
                           <w:p>
                             <w:pPr>
@@ -1138,7 +1097,6 @@
                               </w:rPr>
                               <w:tab/>
                             </w:r>
-                            <w:proofErr w:type="gramStart"/>
                             <w:r>
                               <w:rPr>
                                 <w:sz w:val="20"/>
@@ -1161,7 +1119,6 @@
                               </w:rPr>
                               <w:t>8</w:t>
                             </w:r>
-                            <w:proofErr w:type="gramEnd"/>
                           </w:p>
                           <w:p>
                             <w:pPr>
@@ -1201,7 +1158,6 @@
                               </w:rPr>
                               <w:tab/>
                             </w:r>
-                            <w:proofErr w:type="gramStart"/>
                             <w:r>
                               <w:rPr>
                                 <w:sz w:val="20"/>
@@ -1224,7 +1180,6 @@
                               </w:rPr>
                               <w:t>9</w:t>
                             </w:r>
-                            <w:proofErr w:type="gramEnd"/>
                           </w:p>
                         </w:txbxContent>
                       </wps:txbx>
@@ -2305,7 +2260,6 @@
                                 <w:lang w:val="fr-FR"/>
                               </w:rPr>
                             </w:pPr>
-                            <w:proofErr w:type="spellStart"/>
                             <w:r>
                               <w:rPr>
                                 <w:b/>
@@ -2316,7 +2270,6 @@
                               </w:rPr>
                               <w:t>Prerequisites</w:t>
                             </w:r>
-                            <w:proofErr w:type="spellEnd"/>
                             <w:r>
                               <w:rPr>
                                 <w:b/>
@@ -3319,7 +3272,6 @@
                                 <w:szCs w:val="20"/>
                               </w:rPr>
                             </w:pPr>
-                            <w:proofErr w:type="spellStart"/>
                             <w:r>
                               <w:rPr>
                                 <w:b/>
@@ -3327,17 +3279,7 @@
                                 <w:sz w:val="20"/>
                                 <w:szCs w:val="20"/>
                               </w:rPr>
-                              <w:t>BridgeManager</w:t>
-                            </w:r>
-                            <w:proofErr w:type="spellEnd"/>
-                            <w:r>
-                              <w:rPr>
-                                <w:b/>
-                                <w:bCs/>
-                                <w:sz w:val="20"/>
-                                <w:szCs w:val="20"/>
-                              </w:rPr>
-                              <w:t xml:space="preserve"> Database Diagram</w:t>
+                              <w:t>BridgeManager Database Diagram</w:t>
                             </w:r>
                             <w:r>
                               <w:rPr>
@@ -4776,7 +4718,6 @@
         </w:rPr>
         <w:t xml:space="preserve">.NET 6.0 </w:t>
       </w:r>
-      <w:proofErr w:type="gramStart"/>
       <w:r>
         <w:rPr>
           <w:b/>
@@ -4810,87 +4751,87 @@
           <w:i/>
           <w:iCs/>
         </w:rPr>
-        <w:t>x</w:t>
-      </w:r>
-      <w:proofErr w:type="gramEnd"/>
-      <w:r>
+        <w:t>x86 or x64 depending on your system</w:t>
+      </w:r>
+    </w:p>
+    <w:p>
+      <w:pPr>
+        <w:rPr>
+          <w:sz w:val="20"/>
+          <w:szCs w:val="20"/>
+        </w:rPr>
+      </w:pPr>
+      <w:r>
+        <w:rPr>
+          <w:sz w:val="20"/>
+          <w:szCs w:val="20"/>
+        </w:rPr>
+        <w:t xml:space="preserve">Required </w:t>
+      </w:r>
+      <w:r>
+        <w:rPr>
+          <w:sz w:val="20"/>
+          <w:szCs w:val="20"/>
+        </w:rPr>
+        <w:t>by</w:t>
+      </w:r>
+      <w:r>
+        <w:rPr>
+          <w:sz w:val="20"/>
+          <w:szCs w:val="20"/>
+        </w:rPr>
+        <w:t xml:space="preserve"> the main Bridge Manager </w:t>
+      </w:r>
+      <w:r>
+        <w:rPr>
+          <w:sz w:val="20"/>
+          <w:szCs w:val="20"/>
+        </w:rPr>
+        <w:t>agent</w:t>
+      </w:r>
+      <w:r>
+        <w:rPr>
+          <w:sz w:val="20"/>
+          <w:szCs w:val="20"/>
+        </w:rPr>
+        <w:t xml:space="preserve"> </w:t>
+      </w:r>
+      <w:r>
+        <w:rPr>
+          <w:sz w:val="20"/>
+          <w:szCs w:val="20"/>
+        </w:rPr>
+        <w:t xml:space="preserve">and console </w:t>
+      </w:r>
+      <w:r>
+        <w:rPr>
+          <w:sz w:val="20"/>
+          <w:szCs w:val="20"/>
+        </w:rPr>
+        <w:t>application</w:t>
+      </w:r>
+      <w:r>
+        <w:rPr>
+          <w:sz w:val="20"/>
+          <w:szCs w:val="20"/>
+        </w:rPr>
+        <w:t>s</w:t>
+      </w:r>
+      <w:r>
+        <w:rPr>
+          <w:sz w:val="20"/>
+          <w:szCs w:val="20"/>
+        </w:rPr>
+        <w:t>.</w:t>
+      </w:r>
+    </w:p>
+    <w:p>
+      <w:pPr>
         <w:rPr>
           <w:i/>
           <w:iCs/>
         </w:rPr>
-        <w:t>86 or x64 depending on your system</w:t>
-      </w:r>
-    </w:p>
-    <w:p>
-      <w:pPr>
-        <w:rPr>
-          <w:sz w:val="20"/>
-          <w:szCs w:val="20"/>
-        </w:rPr>
-      </w:pPr>
-      <w:r>
-        <w:rPr>
-          <w:sz w:val="20"/>
-          <w:szCs w:val="20"/>
-        </w:rPr>
-        <w:t xml:space="preserve">Required </w:t>
-      </w:r>
-      <w:r>
-        <w:rPr>
-          <w:sz w:val="20"/>
-          <w:szCs w:val="20"/>
-        </w:rPr>
-        <w:t>by</w:t>
-      </w:r>
-      <w:r>
-        <w:rPr>
-          <w:sz w:val="20"/>
-          <w:szCs w:val="20"/>
-        </w:rPr>
-        <w:t xml:space="preserve"> the main Bridge Manager </w:t>
-      </w:r>
-      <w:r>
-        <w:rPr>
-          <w:sz w:val="20"/>
-          <w:szCs w:val="20"/>
-        </w:rPr>
-        <w:t>agent</w:t>
-      </w:r>
-      <w:r>
-        <w:rPr>
-          <w:sz w:val="20"/>
-          <w:szCs w:val="20"/>
-        </w:rPr>
-        <w:t xml:space="preserve"> </w:t>
-      </w:r>
-      <w:r>
-        <w:rPr>
-          <w:sz w:val="20"/>
-          <w:szCs w:val="20"/>
-        </w:rPr>
-        <w:t xml:space="preserve">and console </w:t>
-      </w:r>
-      <w:r>
-        <w:rPr>
-          <w:sz w:val="20"/>
-          <w:szCs w:val="20"/>
-        </w:rPr>
-        <w:t>application</w:t>
-      </w:r>
-      <w:r>
-        <w:rPr>
-          <w:sz w:val="20"/>
-          <w:szCs w:val="20"/>
-        </w:rPr>
-        <w:t>s</w:t>
-      </w:r>
-      <w:r>
-        <w:rPr>
-          <w:sz w:val="20"/>
-          <w:szCs w:val="20"/>
-        </w:rPr>
-        <w:t>.</w:t>
-      </w:r>
+      </w:pPr>
     </w:p>
     <w:p>
       <w:pPr>
@@ -4899,137 +4840,113 @@
           <w:iCs/>
         </w:rPr>
       </w:pPr>
-    </w:p>
-    <w:p>
-      <w:pPr>
+      <w:r>
+        <w:rPr>
+          <w:b/>
+          <w:bCs/>
+        </w:rPr>
+        <w:t xml:space="preserve">C++ 2015 Redistributable  </w:t>
+      </w:r>
+      <w:r>
         <w:rPr>
           <w:i/>
           <w:iCs/>
         </w:rPr>
-      </w:pPr>
-      <w:r>
-        <w:rPr>
-          <w:b/>
-          <w:bCs/>
-        </w:rPr>
-        <w:t xml:space="preserve">C++ 2015 </w:t>
-      </w:r>
-      <w:proofErr w:type="gramStart"/>
-      <w:r>
-        <w:rPr>
-          <w:b/>
-          <w:bCs/>
-        </w:rPr>
-        <w:t xml:space="preserve">Redistributable  </w:t>
-      </w:r>
-      <w:r>
+        <w:t>x86 or x64 depending on your system</w:t>
+      </w:r>
+    </w:p>
+    <w:p>
+      <w:pPr>
+        <w:rPr>
+          <w:sz w:val="20"/>
+          <w:szCs w:val="20"/>
+        </w:rPr>
+      </w:pPr>
+      <w:r>
+        <w:rPr>
+          <w:sz w:val="20"/>
+          <w:szCs w:val="20"/>
+        </w:rPr>
+        <w:t xml:space="preserve">Required </w:t>
+      </w:r>
+      <w:r>
+        <w:rPr>
+          <w:sz w:val="20"/>
+          <w:szCs w:val="20"/>
+        </w:rPr>
+        <w:t>by</w:t>
+      </w:r>
+      <w:r>
+        <w:rPr>
+          <w:sz w:val="20"/>
+          <w:szCs w:val="20"/>
+        </w:rPr>
+        <w:t xml:space="preserve"> the main Bridge Manager </w:t>
+      </w:r>
+      <w:r>
+        <w:rPr>
+          <w:sz w:val="20"/>
+          <w:szCs w:val="20"/>
+        </w:rPr>
+        <w:t>agent</w:t>
+      </w:r>
+      <w:r>
+        <w:rPr>
+          <w:sz w:val="20"/>
+          <w:szCs w:val="20"/>
+        </w:rPr>
+        <w:t xml:space="preserve"> </w:t>
+      </w:r>
+      <w:r>
+        <w:rPr>
+          <w:sz w:val="20"/>
+          <w:szCs w:val="20"/>
+        </w:rPr>
+        <w:t xml:space="preserve">and console </w:t>
+      </w:r>
+      <w:r>
+        <w:rPr>
+          <w:sz w:val="20"/>
+          <w:szCs w:val="20"/>
+        </w:rPr>
+        <w:t>application</w:t>
+      </w:r>
+      <w:r>
+        <w:rPr>
+          <w:sz w:val="20"/>
+          <w:szCs w:val="20"/>
+        </w:rPr>
+        <w:t>s</w:t>
+      </w:r>
+      <w:r>
+        <w:rPr>
+          <w:sz w:val="20"/>
+          <w:szCs w:val="20"/>
+        </w:rPr>
+        <w:t>.</w:t>
+      </w:r>
+      <w:r>
+        <w:rPr>
+          <w:sz w:val="20"/>
+          <w:szCs w:val="20"/>
+        </w:rPr>
+        <w:t xml:space="preserve"> If your operating system surpasses Windows 10 version 1809 (October 2018 Update) or Windows Server 2019, this should not need to be installed.</w:t>
+      </w:r>
+    </w:p>
+    <w:p>
+      <w:pPr>
         <w:rPr>
           <w:i/>
           <w:iCs/>
         </w:rPr>
-        <w:t>x</w:t>
-      </w:r>
-      <w:proofErr w:type="gramEnd"/>
-      <w:r>
+      </w:pPr>
+    </w:p>
+    <w:p>
+      <w:pPr>
         <w:rPr>
           <w:i/>
           <w:iCs/>
         </w:rPr>
-        <w:t>86 or x64 depending on your system</w:t>
-      </w:r>
-    </w:p>
-    <w:p>
-      <w:pPr>
-        <w:rPr>
-          <w:sz w:val="20"/>
-          <w:szCs w:val="20"/>
-        </w:rPr>
-      </w:pPr>
-      <w:r>
-        <w:rPr>
-          <w:sz w:val="20"/>
-          <w:szCs w:val="20"/>
-        </w:rPr>
-        <w:t xml:space="preserve">Required </w:t>
-      </w:r>
-      <w:r>
-        <w:rPr>
-          <w:sz w:val="20"/>
-          <w:szCs w:val="20"/>
-        </w:rPr>
-        <w:t>by</w:t>
-      </w:r>
-      <w:r>
-        <w:rPr>
-          <w:sz w:val="20"/>
-          <w:szCs w:val="20"/>
-        </w:rPr>
-        <w:t xml:space="preserve"> the main Bridge Manager </w:t>
-      </w:r>
-      <w:r>
-        <w:rPr>
-          <w:sz w:val="20"/>
-          <w:szCs w:val="20"/>
-        </w:rPr>
-        <w:t>agent</w:t>
-      </w:r>
-      <w:r>
-        <w:rPr>
-          <w:sz w:val="20"/>
-          <w:szCs w:val="20"/>
-        </w:rPr>
-        <w:t xml:space="preserve"> </w:t>
-      </w:r>
-      <w:r>
-        <w:rPr>
-          <w:sz w:val="20"/>
-          <w:szCs w:val="20"/>
-        </w:rPr>
-        <w:t xml:space="preserve">and console </w:t>
-      </w:r>
-      <w:r>
-        <w:rPr>
-          <w:sz w:val="20"/>
-          <w:szCs w:val="20"/>
-        </w:rPr>
-        <w:t>application</w:t>
-      </w:r>
-      <w:r>
-        <w:rPr>
-          <w:sz w:val="20"/>
-          <w:szCs w:val="20"/>
-        </w:rPr>
-        <w:t>s</w:t>
-      </w:r>
-      <w:r>
-        <w:rPr>
-          <w:sz w:val="20"/>
-          <w:szCs w:val="20"/>
-        </w:rPr>
-        <w:t>.</w:t>
-      </w:r>
-      <w:r>
-        <w:rPr>
-          <w:sz w:val="20"/>
-          <w:szCs w:val="20"/>
-        </w:rPr>
-        <w:t xml:space="preserve"> If your operating system surpasses Windows 10 version 1809 (October 2018 Update) or Windows Server 2019, this should not need to be installed.</w:t>
-      </w:r>
-    </w:p>
-    <w:p>
-      <w:pPr>
-        <w:rPr>
-          <w:i/>
-          <w:iCs/>
-        </w:rPr>
-      </w:pPr>
-    </w:p>
-    <w:p>
-      <w:pPr>
-        <w:rPr>
-          <w:i/>
-          <w:iCs/>
-        </w:rPr>
       </w:pPr>
       <w:r>
         <w:rPr>
@@ -5079,23 +4996,7 @@
           <w:sz w:val="20"/>
           <w:szCs w:val="20"/>
         </w:rPr>
-        <w:t xml:space="preserve"> and most should work without issue for Bridge manager. The 2017 and 2022 versions of SQL Server Express have been tested and operate without issue. The most important factor in determining which you should use is compatibility with your </w:t>
-      </w:r>
-      <w:proofErr w:type="gramStart"/>
-      <w:r>
-        <w:rPr>
-          <w:sz w:val="20"/>
-          <w:szCs w:val="20"/>
-        </w:rPr>
-        <w:t>operating system, but</w:t>
-      </w:r>
-      <w:proofErr w:type="gramEnd"/>
-      <w:r>
-        <w:rPr>
-          <w:sz w:val="20"/>
-          <w:szCs w:val="20"/>
-        </w:rPr>
-        <w:t xml:space="preserve"> also consider storage capacities if opting for an Express edition. SQL Server 2008 Express and later come</w:t>
+        <w:t xml:space="preserve"> and most should work without issue for Bridge manager. The 2017 and 2022 versions of SQL Server Express have been tested and operate without issue. The most important factor in determining which you should use is compatibility with your operating system, but also consider storage capacities if opting for an Express edition. SQL Server 2008 Express and later come</w:t>
       </w:r>
       <w:r>
         <w:rPr>
@@ -5451,23 +5352,7 @@
           <w:sz w:val="20"/>
           <w:szCs w:val="20"/>
         </w:rPr>
-        <w:t xml:space="preserve">The login must be mapped to </w:t>
-      </w:r>
-      <w:proofErr w:type="spellStart"/>
-      <w:r>
-        <w:rPr>
-          <w:sz w:val="20"/>
-          <w:szCs w:val="20"/>
-        </w:rPr>
-        <w:t>BridgeManager</w:t>
-      </w:r>
-      <w:proofErr w:type="spellEnd"/>
-      <w:r>
-        <w:rPr>
-          <w:sz w:val="20"/>
-          <w:szCs w:val="20"/>
-        </w:rPr>
-        <w:t xml:space="preserve"> (not possible until after the application has been set up).</w:t>
+        <w:t>The login must be mapped to BridgeManager (not possible until after the application has been set up).</w:t>
       </w:r>
     </w:p>
     <w:p>
@@ -5487,46 +5372,14 @@
           <w:sz w:val="20"/>
           <w:szCs w:val="20"/>
         </w:rPr>
-        <w:t xml:space="preserve">The login should have only the public and </w:t>
-      </w:r>
-      <w:proofErr w:type="spellStart"/>
-      <w:r>
-        <w:rPr>
-          <w:sz w:val="20"/>
-          <w:szCs w:val="20"/>
-        </w:rPr>
-        <w:t>db_datareader</w:t>
-      </w:r>
-      <w:proofErr w:type="spellEnd"/>
-      <w:r>
-        <w:rPr>
-          <w:sz w:val="20"/>
-          <w:szCs w:val="20"/>
-        </w:rPr>
-        <w:t xml:space="preserve"> roles enabled</w:t>
-      </w:r>
-      <w:r>
-        <w:rPr>
-          <w:sz w:val="20"/>
-          <w:szCs w:val="20"/>
-        </w:rPr>
-        <w:t xml:space="preserve"> for the </w:t>
-      </w:r>
-      <w:proofErr w:type="spellStart"/>
-      <w:r>
-        <w:rPr>
-          <w:sz w:val="20"/>
-          <w:szCs w:val="20"/>
-        </w:rPr>
-        <w:t>BridgeManager</w:t>
-      </w:r>
-      <w:proofErr w:type="spellEnd"/>
-      <w:r>
-        <w:rPr>
-          <w:sz w:val="20"/>
-          <w:szCs w:val="20"/>
-        </w:rPr>
-        <w:t xml:space="preserve"> database (not possible until after the application has been set up).</w:t>
+        <w:t>The login should have only the public and db_datareader roles enabled</w:t>
+      </w:r>
+      <w:r>
+        <w:rPr>
+          <w:sz w:val="20"/>
+          <w:szCs w:val="20"/>
+        </w:rPr>
+        <w:t xml:space="preserve"> for the BridgeManager database (not possible until after the application has been set up).</w:t>
       </w:r>
     </w:p>
     <w:p>
@@ -5562,23 +5415,7 @@
           <w:sz w:val="20"/>
           <w:szCs w:val="20"/>
         </w:rPr>
-        <w:t xml:space="preserve">to carry out </w:t>
-      </w:r>
-      <w:proofErr w:type="gramStart"/>
-      <w:r>
-        <w:rPr>
-          <w:sz w:val="20"/>
-          <w:szCs w:val="20"/>
-        </w:rPr>
-        <w:t>all of</w:t>
-      </w:r>
-      <w:proofErr w:type="gramEnd"/>
-      <w:r>
-        <w:rPr>
-          <w:sz w:val="20"/>
-          <w:szCs w:val="20"/>
-        </w:rPr>
-        <w:t xml:space="preserve"> its functions relating to SQL Server.</w:t>
+        <w:t>to carry out all of its functions relating to SQL Server.</w:t>
       </w:r>
     </w:p>
     <w:p>
@@ -6083,27 +5920,7 @@
           <w:sz w:val="20"/>
           <w:szCs w:val="20"/>
         </w:rPr>
-        <w:t xml:space="preserve">Creating and Restoring </w:t>
-      </w:r>
-      <w:proofErr w:type="gramStart"/>
-      <w:r>
-        <w:rPr>
-          <w:b/>
-          <w:bCs/>
-          <w:sz w:val="20"/>
-          <w:szCs w:val="20"/>
-        </w:rPr>
-        <w:t>From</w:t>
-      </w:r>
-      <w:proofErr w:type="gramEnd"/>
-      <w:r>
-        <w:rPr>
-          <w:b/>
-          <w:bCs/>
-          <w:sz w:val="20"/>
-          <w:szCs w:val="20"/>
-        </w:rPr>
-        <w:t xml:space="preserve"> Backups</w:t>
+        <w:t>Creating and Restoring From Backups</w:t>
       </w:r>
       <w:r>
         <w:rPr>
@@ -6183,23 +6000,7 @@
           <w:sz w:val="20"/>
           <w:szCs w:val="20"/>
         </w:rPr>
-        <w:t xml:space="preserve"> the console application. If everything was configured correctly, you should be presented with a message stating that the </w:t>
-      </w:r>
-      <w:proofErr w:type="gramStart"/>
-      <w:r>
-        <w:rPr>
-          <w:sz w:val="20"/>
-          <w:szCs w:val="20"/>
-        </w:rPr>
-        <w:t>server</w:t>
-      </w:r>
-      <w:proofErr w:type="gramEnd"/>
-      <w:r>
-        <w:rPr>
-          <w:sz w:val="20"/>
-          <w:szCs w:val="20"/>
-        </w:rPr>
-        <w:t xml:space="preserve"> name has been read</w:t>
+        <w:t xml:space="preserve"> the console application. If everything was configured correctly, you should be presented with a message stating that the server name has been read</w:t>
       </w:r>
       <w:r>
         <w:rPr>
@@ -6468,23 +6269,7 @@
           <w:sz w:val="20"/>
           <w:szCs w:val="20"/>
         </w:rPr>
-        <w:t xml:space="preserve">‘agent’ and press enter to navigate to the agent </w:t>
-      </w:r>
-      <w:proofErr w:type="gramStart"/>
-      <w:r>
-        <w:rPr>
-          <w:sz w:val="20"/>
-          <w:szCs w:val="20"/>
-        </w:rPr>
-        <w:t>menu, and</w:t>
-      </w:r>
-      <w:proofErr w:type="gramEnd"/>
-      <w:r>
-        <w:rPr>
-          <w:sz w:val="20"/>
-          <w:szCs w:val="20"/>
-        </w:rPr>
-        <w:t xml:space="preserve"> then type </w:t>
+        <w:t xml:space="preserve">‘agent’ and press enter to navigate to the agent menu, and then type </w:t>
       </w:r>
       <w:r>
         <w:rPr>
@@ -6583,23 +6368,7 @@
           <w:sz w:val="20"/>
           <w:szCs w:val="20"/>
         </w:rPr>
-        <w:t xml:space="preserve"> </w:t>
-      </w:r>
-      <w:proofErr w:type="gramStart"/>
-      <w:r>
-        <w:rPr>
-          <w:sz w:val="20"/>
-          <w:szCs w:val="20"/>
-        </w:rPr>
-        <w:t>menu, and</w:t>
-      </w:r>
-      <w:proofErr w:type="gramEnd"/>
-      <w:r>
-        <w:rPr>
-          <w:sz w:val="20"/>
-          <w:szCs w:val="20"/>
-        </w:rPr>
-        <w:t xml:space="preserve"> then run the help command again. You will note that some of these commands call for either a string or an int to be inserted at the end. A string represents text, and an int represents a whole number. If you read the explanation for ‘import organisation</w:t>
+        <w:t xml:space="preserve"> menu, and then run the help command again. You will note that some of these commands call for either a string or an int to be inserted at the end. A string represents text, and an int represents a whole number. If you read the explanation for ‘import organisation</w:t>
       </w:r>
       <w:r>
         <w:rPr>
@@ -7160,23 +6929,7 @@
           <w:sz w:val="20"/>
           <w:szCs w:val="20"/>
         </w:rPr>
-        <w:t xml:space="preserve"> You can also </w:t>
-      </w:r>
-      <w:proofErr w:type="gramStart"/>
-      <w:r>
-        <w:rPr>
-          <w:sz w:val="20"/>
-          <w:szCs w:val="20"/>
-        </w:rPr>
-        <w:t>take a look</w:t>
-      </w:r>
-      <w:proofErr w:type="gramEnd"/>
-      <w:r>
-        <w:rPr>
-          <w:sz w:val="20"/>
-          <w:szCs w:val="20"/>
-        </w:rPr>
-        <w:t xml:space="preserve"> </w:t>
+        <w:t xml:space="preserve"> You can also take a look </w:t>
       </w:r>
       <w:r>
         <w:rPr>
@@ -7270,9 +7023,8 @@
           <w:sz w:val="18"/>
           <w:szCs w:val="18"/>
         </w:rPr>
-        <w:t xml:space="preserve"> </w:t>
-      </w:r>
-      <w:proofErr w:type="gramStart"/>
+        <w:t xml:space="preserve"> d</w:t>
+      </w:r>
       <w:r>
         <w:rPr>
           <w:rFonts w:ascii="Roboto Mono" w:hAnsi="Roboto Mono"/>
@@ -7281,7 +7033,7 @@
           <w:sz w:val="18"/>
           <w:szCs w:val="18"/>
         </w:rPr>
-        <w:t>d</w:t>
+        <w:t>atabase</w:t>
       </w:r>
       <w:r>
         <w:rPr>
@@ -7291,13 +7043,10 @@
           <w:sz w:val="18"/>
           <w:szCs w:val="18"/>
         </w:rPr>
-        <w:t>atabase</w:t>
-      </w:r>
-      <w:r>
-        <w:rPr>
-          <w:rFonts w:ascii="Roboto Mono" w:hAnsi="Roboto Mono"/>
-          <w:b/>
-          <w:bCs/>
+        <w:t xml:space="preserve"> </w:t>
+      </w:r>
+      <w:r>
+        <w:rPr>
           <w:sz w:val="18"/>
           <w:szCs w:val="18"/>
         </w:rPr>
@@ -7305,19 +7054,11 @@
       </w:r>
       <w:r>
         <w:rPr>
-          <w:sz w:val="18"/>
-          <w:szCs w:val="18"/>
-        </w:rPr>
-        <w:t xml:space="preserve"> </w:t>
-      </w:r>
-      <w:r>
-        <w:rPr>
           <w:sz w:val="20"/>
           <w:szCs w:val="20"/>
         </w:rPr>
         <w:t>&gt;</w:t>
       </w:r>
-      <w:proofErr w:type="gramEnd"/>
       <w:r>
         <w:rPr>
           <w:rFonts w:ascii="Roboto Mono" w:hAnsi="Roboto Mono"/>
@@ -7685,421 +7426,369 @@
           <w:sz w:val="40"/>
           <w:szCs w:val="40"/>
         </w:rPr>
-        <w:t xml:space="preserve">Creating and Restoring </w:t>
-      </w:r>
-      <w:proofErr w:type="gramStart"/>
-      <w:r>
+        <w:t>Creating and Restoring From Backups</w:t>
+      </w:r>
+    </w:p>
+    <w:p>
+      <w:pPr>
+        <w:rPr>
+          <w:b/>
+          <w:bCs/>
+          <w:sz w:val="20"/>
+          <w:szCs w:val="20"/>
+        </w:rPr>
+      </w:pPr>
+      <w:r>
+        <w:rPr>
+          <w:sz w:val="20"/>
+          <w:szCs w:val="20"/>
+        </w:rPr>
+        <w:t>Since all of Bridge Manager’s working files are stored in “Documents/Bridge Manager”, including the database itself, the task of either creating or restoring from backup</w:t>
+      </w:r>
+      <w:r>
+        <w:rPr>
+          <w:sz w:val="20"/>
+          <w:szCs w:val="20"/>
+        </w:rPr>
+        <w:t>s</w:t>
+      </w:r>
+      <w:r>
+        <w:rPr>
+          <w:sz w:val="20"/>
+          <w:szCs w:val="20"/>
+        </w:rPr>
+        <w:t xml:space="preserve"> is</w:t>
+      </w:r>
+      <w:r>
+        <w:rPr>
+          <w:sz w:val="20"/>
+          <w:szCs w:val="20"/>
+        </w:rPr>
+        <w:t xml:space="preserve"> relatively simple</w:t>
+      </w:r>
+      <w:r>
+        <w:rPr>
+          <w:sz w:val="20"/>
+          <w:szCs w:val="20"/>
+        </w:rPr>
+        <w:t>.</w:t>
+      </w:r>
+      <w:r>
+        <w:rPr>
+          <w:sz w:val="20"/>
+          <w:szCs w:val="20"/>
+        </w:rPr>
+        <w:t xml:space="preserve"> </w:t>
+      </w:r>
+    </w:p>
+    <w:p>
+      <w:pPr>
+        <w:rPr>
+          <w:b/>
+          <w:bCs/>
+        </w:rPr>
+      </w:pPr>
+    </w:p>
+    <w:p>
+      <w:pPr>
+        <w:rPr>
+          <w:b/>
+          <w:bCs/>
+          <w:sz w:val="30"/>
+          <w:szCs w:val="30"/>
+        </w:rPr>
+      </w:pPr>
+      <w:r>
+        <w:rPr>
+          <w:b/>
+          <w:bCs/>
+          <w:sz w:val="30"/>
+          <w:szCs w:val="30"/>
+        </w:rPr>
+        <w:t xml:space="preserve">Creating a </w:t>
+      </w:r>
+      <w:r>
+        <w:rPr>
+          <w:b/>
+          <w:bCs/>
+          <w:sz w:val="30"/>
+          <w:szCs w:val="30"/>
+        </w:rPr>
+        <w:t>B</w:t>
+      </w:r>
+      <w:r>
+        <w:rPr>
+          <w:b/>
+          <w:bCs/>
+          <w:sz w:val="30"/>
+          <w:szCs w:val="30"/>
+        </w:rPr>
+        <w:t>ackup</w:t>
+      </w:r>
+    </w:p>
+    <w:p>
+      <w:pPr>
+        <w:rPr>
+          <w:sz w:val="20"/>
+          <w:szCs w:val="20"/>
+        </w:rPr>
+      </w:pPr>
+      <w:r>
+        <w:rPr>
+          <w:sz w:val="20"/>
+          <w:szCs w:val="20"/>
+        </w:rPr>
+        <w:t>Make sure to</w:t>
+      </w:r>
+      <w:r>
+        <w:rPr>
+          <w:sz w:val="20"/>
+          <w:szCs w:val="20"/>
+        </w:rPr>
+        <w:t xml:space="preserve"> stop the SQL Server service before beginning to prevent data corruption</w:t>
+      </w:r>
+      <w:r>
+        <w:rPr>
+          <w:sz w:val="20"/>
+          <w:szCs w:val="20"/>
+        </w:rPr>
+        <w:t xml:space="preserve"> in the backup</w:t>
+      </w:r>
+      <w:r>
+        <w:rPr>
+          <w:sz w:val="20"/>
+          <w:szCs w:val="20"/>
+        </w:rPr>
+        <w:t xml:space="preserve">. This can be done through SQL Configuration Manager. </w:t>
+      </w:r>
+    </w:p>
+    <w:p>
+      <w:pPr>
+        <w:rPr>
+          <w:sz w:val="20"/>
+          <w:szCs w:val="20"/>
+        </w:rPr>
+      </w:pPr>
+      <w:r>
+        <w:rPr>
+          <w:sz w:val="20"/>
+          <w:szCs w:val="20"/>
+        </w:rPr>
+        <w:t>To create a backup, simply copy the Bridge Manager folder to another drive or directory.</w:t>
+      </w:r>
+      <w:r>
+        <w:rPr>
+          <w:sz w:val="20"/>
+          <w:szCs w:val="20"/>
+        </w:rPr>
+        <w:t xml:space="preserve"> Start the SQL Server service again only once the copying has completed.</w:t>
+      </w:r>
+    </w:p>
+    <w:p>
+      <w:pPr>
+        <w:rPr>
+          <w:sz w:val="20"/>
+          <w:szCs w:val="20"/>
+        </w:rPr>
+      </w:pPr>
+      <w:r>
+        <w:rPr>
+          <w:sz w:val="20"/>
+          <w:szCs w:val="20"/>
+        </w:rPr>
+        <w:t>This will back up all aspects of the server-side application. This includes various configuration files, the database itself, report presets, the agent error log, and any other files responsible for storing client settings server-side.</w:t>
+      </w:r>
+    </w:p>
+    <w:p>
+      <w:pPr>
+        <w:rPr>
+          <w:b/>
+          <w:bCs/>
+          <w:sz w:val="30"/>
+          <w:szCs w:val="30"/>
+        </w:rPr>
+      </w:pPr>
+    </w:p>
+    <w:p>
+      <w:pPr>
+        <w:rPr>
+          <w:b/>
+          <w:bCs/>
+          <w:sz w:val="30"/>
+          <w:szCs w:val="30"/>
+        </w:rPr>
+      </w:pPr>
+      <w:r>
+        <w:rPr>
+          <w:b/>
+          <w:bCs/>
+          <w:sz w:val="30"/>
+          <w:szCs w:val="30"/>
+        </w:rPr>
+        <w:br w:type="page"/>
+      </w:r>
+    </w:p>
+    <w:p>
+      <w:pPr>
+        <w:rPr>
+          <w:b/>
+          <w:bCs/>
+          <w:sz w:val="30"/>
+          <w:szCs w:val="30"/>
+        </w:rPr>
+      </w:pPr>
+      <w:r>
+        <w:rPr>
+          <w:b/>
+          <w:bCs/>
+          <w:sz w:val="30"/>
+          <w:szCs w:val="30"/>
+        </w:rPr>
+        <w:lastRenderedPageBreak/>
+        <w:t>Restoring From a Backup</w:t>
+      </w:r>
+    </w:p>
+    <w:p>
+      <w:pPr>
+        <w:rPr>
+          <w:sz w:val="20"/>
+          <w:szCs w:val="20"/>
+        </w:rPr>
+      </w:pPr>
+      <w:r>
+        <w:rPr>
+          <w:sz w:val="20"/>
+          <w:szCs w:val="20"/>
+        </w:rPr>
+        <w:t xml:space="preserve">To restore from a backup, stop the agent through the console (see the ‘start’ and ‘stop’ </w:t>
+      </w:r>
+      <w:r>
+        <w:rPr>
+          <w:b/>
+          <w:bCs/>
+          <w:sz w:val="20"/>
+          <w:szCs w:val="20"/>
+        </w:rPr>
+        <w:t xml:space="preserve">agent </w:t>
+      </w:r>
+      <w:r>
+        <w:rPr>
+          <w:sz w:val="20"/>
+          <w:szCs w:val="20"/>
+        </w:rPr>
+        <w:t xml:space="preserve">commands in the </w:t>
+      </w:r>
+      <w:r>
+        <w:rPr>
+          <w:b/>
+          <w:bCs/>
+          <w:sz w:val="20"/>
+          <w:szCs w:val="20"/>
+        </w:rPr>
+        <w:t>Bridge Manager Console</w:t>
+      </w:r>
+      <w:r>
+        <w:rPr>
+          <w:sz w:val="20"/>
+          <w:szCs w:val="20"/>
+        </w:rPr>
+        <w:t xml:space="preserve"> section below).</w:t>
+      </w:r>
+    </w:p>
+    <w:p>
+      <w:pPr>
+        <w:rPr>
+          <w:sz w:val="20"/>
+          <w:szCs w:val="20"/>
+        </w:rPr>
+      </w:pPr>
+      <w:r>
+        <w:rPr>
+          <w:sz w:val="20"/>
+          <w:szCs w:val="20"/>
+        </w:rPr>
+        <w:t xml:space="preserve">Once the agent has been stopped, simply </w:t>
+      </w:r>
+      <w:r>
+        <w:rPr>
+          <w:sz w:val="20"/>
+          <w:szCs w:val="20"/>
+        </w:rPr>
+        <w:t>remove</w:t>
+      </w:r>
+      <w:r>
+        <w:rPr>
+          <w:sz w:val="20"/>
+          <w:szCs w:val="20"/>
+        </w:rPr>
+        <w:t xml:space="preserve"> the</w:t>
+      </w:r>
+      <w:r>
+        <w:rPr>
+          <w:sz w:val="20"/>
+          <w:szCs w:val="20"/>
+        </w:rPr>
+        <w:t xml:space="preserve"> current</w:t>
+      </w:r>
+      <w:r>
+        <w:rPr>
+          <w:sz w:val="20"/>
+          <w:szCs w:val="20"/>
+        </w:rPr>
+        <w:t xml:space="preserve"> Bridge Manager folder from Documents, then copy the previously backed up Bridge Manager folder into the same location</w:t>
+      </w:r>
+      <w:r>
+        <w:rPr>
+          <w:sz w:val="20"/>
+          <w:szCs w:val="20"/>
+        </w:rPr>
+        <w:t xml:space="preserve"> (the folder must still be named “Bridge Manager” in order for the console and agent to locate it)</w:t>
+      </w:r>
+      <w:r>
+        <w:rPr>
+          <w:sz w:val="20"/>
+          <w:szCs w:val="20"/>
+        </w:rPr>
+        <w:t xml:space="preserve">. If another program is currently accessing the database, SQL Server Management Studio for example, you may need to close this in order to </w:t>
+      </w:r>
+      <w:r>
+        <w:rPr>
+          <w:sz w:val="20"/>
+          <w:szCs w:val="20"/>
+        </w:rPr>
+        <w:t>remove</w:t>
+      </w:r>
+      <w:r>
+        <w:rPr>
+          <w:sz w:val="20"/>
+          <w:szCs w:val="20"/>
+        </w:rPr>
+        <w:t xml:space="preserve"> the original folder.</w:t>
+      </w:r>
+    </w:p>
+    <w:p>
+      <w:pPr>
+        <w:rPr>
+          <w:sz w:val="20"/>
+          <w:szCs w:val="20"/>
+        </w:rPr>
+      </w:pPr>
+      <w:r>
+        <w:rPr>
+          <w:sz w:val="20"/>
+          <w:szCs w:val="20"/>
+        </w:rPr>
+        <w:t>Once the backup has been copied back to Documents, restart the agent from the console.</w:t>
+      </w:r>
+    </w:p>
+    <w:p>
+      <w:pPr>
         <w:rPr>
           <w:b/>
           <w:bCs/>
           <w:sz w:val="40"/>
           <w:szCs w:val="40"/>
         </w:rPr>
-        <w:t>From</w:t>
-      </w:r>
-      <w:proofErr w:type="gramEnd"/>
-      <w:r>
-        <w:rPr>
-          <w:b/>
-          <w:bCs/>
-          <w:sz w:val="40"/>
-          <w:szCs w:val="40"/>
-        </w:rPr>
-        <w:t xml:space="preserve"> Backups</w:t>
-      </w:r>
-    </w:p>
-    <w:p>
-      <w:pPr>
-        <w:rPr>
-          <w:b/>
-          <w:bCs/>
-          <w:sz w:val="20"/>
-          <w:szCs w:val="20"/>
-        </w:rPr>
-      </w:pPr>
-      <w:r>
-        <w:rPr>
-          <w:sz w:val="20"/>
-          <w:szCs w:val="20"/>
-        </w:rPr>
-        <w:t>Since all of Bridge Manager’s working files are stored in “Documents/Bridge Manager”, including the database itself, the task of either creating or restoring from backup</w:t>
-      </w:r>
-      <w:r>
-        <w:rPr>
-          <w:sz w:val="20"/>
-          <w:szCs w:val="20"/>
-        </w:rPr>
-        <w:t>s</w:t>
-      </w:r>
-      <w:r>
-        <w:rPr>
-          <w:sz w:val="20"/>
-          <w:szCs w:val="20"/>
-        </w:rPr>
-        <w:t xml:space="preserve"> is</w:t>
-      </w:r>
-      <w:r>
-        <w:rPr>
-          <w:sz w:val="20"/>
-          <w:szCs w:val="20"/>
-        </w:rPr>
-        <w:t xml:space="preserve"> relatively simple</w:t>
-      </w:r>
-      <w:r>
-        <w:rPr>
-          <w:sz w:val="20"/>
-          <w:szCs w:val="20"/>
-        </w:rPr>
-        <w:t>.</w:t>
-      </w:r>
-      <w:r>
-        <w:rPr>
-          <w:sz w:val="20"/>
-          <w:szCs w:val="20"/>
-        </w:rPr>
-        <w:t xml:space="preserve"> </w:t>
-      </w:r>
-    </w:p>
-    <w:p>
-      <w:pPr>
-        <w:rPr>
-          <w:b/>
-          <w:bCs/>
-        </w:rPr>
-      </w:pPr>
-    </w:p>
-    <w:p>
-      <w:pPr>
-        <w:rPr>
-          <w:b/>
-          <w:bCs/>
-          <w:sz w:val="30"/>
-          <w:szCs w:val="30"/>
-        </w:rPr>
-      </w:pPr>
-      <w:r>
-        <w:rPr>
-          <w:b/>
-          <w:bCs/>
-          <w:sz w:val="30"/>
-          <w:szCs w:val="30"/>
-        </w:rPr>
-        <w:t xml:space="preserve">Creating a </w:t>
-      </w:r>
-      <w:r>
-        <w:rPr>
-          <w:b/>
-          <w:bCs/>
-          <w:sz w:val="30"/>
-          <w:szCs w:val="30"/>
-        </w:rPr>
-        <w:t>B</w:t>
-      </w:r>
-      <w:r>
-        <w:rPr>
-          <w:b/>
-          <w:bCs/>
-          <w:sz w:val="30"/>
-          <w:szCs w:val="30"/>
-        </w:rPr>
-        <w:t>ackup</w:t>
-      </w:r>
-    </w:p>
-    <w:p>
-      <w:pPr>
-        <w:rPr>
-          <w:sz w:val="20"/>
-          <w:szCs w:val="20"/>
-        </w:rPr>
-      </w:pPr>
-      <w:r>
-        <w:rPr>
-          <w:sz w:val="20"/>
-          <w:szCs w:val="20"/>
-        </w:rPr>
-        <w:t>Make sure to</w:t>
-      </w:r>
-      <w:r>
-        <w:rPr>
-          <w:sz w:val="20"/>
-          <w:szCs w:val="20"/>
-        </w:rPr>
-        <w:t xml:space="preserve"> stop the SQL Server service before beginning to prevent data corruption</w:t>
-      </w:r>
-      <w:r>
-        <w:rPr>
-          <w:sz w:val="20"/>
-          <w:szCs w:val="20"/>
-        </w:rPr>
-        <w:t xml:space="preserve"> in the backup</w:t>
-      </w:r>
-      <w:r>
-        <w:rPr>
-          <w:sz w:val="20"/>
-          <w:szCs w:val="20"/>
-        </w:rPr>
-        <w:t xml:space="preserve">. This can be done through SQL Configuration Manager. </w:t>
-      </w:r>
-    </w:p>
-    <w:p>
-      <w:pPr>
-        <w:rPr>
-          <w:sz w:val="20"/>
-          <w:szCs w:val="20"/>
-        </w:rPr>
-      </w:pPr>
-      <w:r>
-        <w:rPr>
-          <w:sz w:val="20"/>
-          <w:szCs w:val="20"/>
-        </w:rPr>
-        <w:t>To create a backup, simply copy the Bridge Manager folder to another drive or directory.</w:t>
-      </w:r>
-      <w:r>
-        <w:rPr>
-          <w:sz w:val="20"/>
-          <w:szCs w:val="20"/>
-        </w:rPr>
-        <w:t xml:space="preserve"> Start the SQL Server service again only once the copying has completed.</w:t>
-      </w:r>
-    </w:p>
-    <w:p>
-      <w:pPr>
-        <w:rPr>
-          <w:sz w:val="20"/>
-          <w:szCs w:val="20"/>
-        </w:rPr>
-      </w:pPr>
-      <w:r>
-        <w:rPr>
-          <w:sz w:val="20"/>
-          <w:szCs w:val="20"/>
-        </w:rPr>
-        <w:t>This will back up all aspects of the server-side application. This includes various configuration files, the database itself, report presets, the agent error log, and any other files responsible for storing client settings server-side.</w:t>
-      </w:r>
-    </w:p>
-    <w:p>
-      <w:pPr>
-        <w:rPr>
-          <w:b/>
-          <w:bCs/>
-          <w:sz w:val="30"/>
-          <w:szCs w:val="30"/>
-        </w:rPr>
-      </w:pPr>
-    </w:p>
-    <w:p>
-      <w:pPr>
-        <w:rPr>
-          <w:b/>
-          <w:bCs/>
-          <w:sz w:val="30"/>
-          <w:szCs w:val="30"/>
-        </w:rPr>
-      </w:pPr>
-      <w:r>
-        <w:rPr>
-          <w:b/>
-          <w:bCs/>
-          <w:sz w:val="30"/>
-          <w:szCs w:val="30"/>
-        </w:rPr>
-        <w:br w:type="page"/>
-      </w:r>
-    </w:p>
-    <w:p>
-      <w:pPr>
-        <w:rPr>
-          <w:b/>
-          <w:bCs/>
-          <w:sz w:val="30"/>
-          <w:szCs w:val="30"/>
-        </w:rPr>
-      </w:pPr>
-      <w:r>
-        <w:rPr>
-          <w:b/>
-          <w:bCs/>
-          <w:sz w:val="30"/>
-          <w:szCs w:val="30"/>
-        </w:rPr>
-        <w:lastRenderedPageBreak/>
-        <w:t>Restoring From a Backup</w:t>
-      </w:r>
-    </w:p>
-    <w:p>
-      <w:pPr>
-        <w:rPr>
-          <w:sz w:val="20"/>
-          <w:szCs w:val="20"/>
-        </w:rPr>
-      </w:pPr>
-      <w:r>
-        <w:rPr>
-          <w:sz w:val="20"/>
-          <w:szCs w:val="20"/>
-        </w:rPr>
-        <w:t xml:space="preserve">To restore from a backup, stop the agent through the console (see the ‘start’ and ‘stop’ </w:t>
-      </w:r>
-      <w:r>
-        <w:rPr>
-          <w:b/>
-          <w:bCs/>
-          <w:sz w:val="20"/>
-          <w:szCs w:val="20"/>
-        </w:rPr>
-        <w:t xml:space="preserve">agent </w:t>
-      </w:r>
-      <w:r>
-        <w:rPr>
-          <w:sz w:val="20"/>
-          <w:szCs w:val="20"/>
-        </w:rPr>
-        <w:t xml:space="preserve">commands in the </w:t>
-      </w:r>
-      <w:r>
-        <w:rPr>
-          <w:b/>
-          <w:bCs/>
-          <w:sz w:val="20"/>
-          <w:szCs w:val="20"/>
-        </w:rPr>
-        <w:t>Bridge Manager Console</w:t>
-      </w:r>
-      <w:r>
-        <w:rPr>
-          <w:sz w:val="20"/>
-          <w:szCs w:val="20"/>
-        </w:rPr>
-        <w:t xml:space="preserve"> section below).</w:t>
-      </w:r>
-    </w:p>
-    <w:p>
-      <w:pPr>
-        <w:rPr>
-          <w:sz w:val="20"/>
-          <w:szCs w:val="20"/>
-        </w:rPr>
-      </w:pPr>
-      <w:r>
-        <w:rPr>
-          <w:sz w:val="20"/>
-          <w:szCs w:val="20"/>
-        </w:rPr>
-        <w:t xml:space="preserve">Once the agent has been stopped, simply </w:t>
-      </w:r>
-      <w:r>
-        <w:rPr>
-          <w:sz w:val="20"/>
-          <w:szCs w:val="20"/>
-        </w:rPr>
-        <w:t>remove</w:t>
-      </w:r>
-      <w:r>
-        <w:rPr>
-          <w:sz w:val="20"/>
-          <w:szCs w:val="20"/>
-        </w:rPr>
-        <w:t xml:space="preserve"> the</w:t>
-      </w:r>
-      <w:r>
-        <w:rPr>
-          <w:sz w:val="20"/>
-          <w:szCs w:val="20"/>
-        </w:rPr>
-        <w:t xml:space="preserve"> current</w:t>
-      </w:r>
-      <w:r>
-        <w:rPr>
-          <w:sz w:val="20"/>
-          <w:szCs w:val="20"/>
-        </w:rPr>
-        <w:t xml:space="preserve"> Bridge Manager folder from Documents, then copy the previously backed up Bridge Manager folder into the same location</w:t>
-      </w:r>
-      <w:r>
-        <w:rPr>
-          <w:sz w:val="20"/>
-          <w:szCs w:val="20"/>
-        </w:rPr>
-        <w:t xml:space="preserve"> (the folder must still be named “Bridge Manager” </w:t>
-      </w:r>
-      <w:proofErr w:type="gramStart"/>
-      <w:r>
-        <w:rPr>
-          <w:sz w:val="20"/>
-          <w:szCs w:val="20"/>
-        </w:rPr>
-        <w:t>in order for</w:t>
-      </w:r>
-      <w:proofErr w:type="gramEnd"/>
-      <w:r>
-        <w:rPr>
-          <w:sz w:val="20"/>
-          <w:szCs w:val="20"/>
-        </w:rPr>
-        <w:t xml:space="preserve"> the console and agent to locate it)</w:t>
-      </w:r>
-      <w:r>
-        <w:rPr>
-          <w:sz w:val="20"/>
-          <w:szCs w:val="20"/>
-        </w:rPr>
-        <w:t xml:space="preserve">. If another program is currently accessing the database, SQL Server Management Studio for example, you may need to close this </w:t>
-      </w:r>
-      <w:proofErr w:type="gramStart"/>
-      <w:r>
-        <w:rPr>
-          <w:sz w:val="20"/>
-          <w:szCs w:val="20"/>
-        </w:rPr>
-        <w:t>in order to</w:t>
-      </w:r>
-      <w:proofErr w:type="gramEnd"/>
-      <w:r>
-        <w:rPr>
-          <w:sz w:val="20"/>
-          <w:szCs w:val="20"/>
-        </w:rPr>
-        <w:t xml:space="preserve"> </w:t>
-      </w:r>
-      <w:r>
-        <w:rPr>
-          <w:sz w:val="20"/>
-          <w:szCs w:val="20"/>
-        </w:rPr>
-        <w:t>remove</w:t>
-      </w:r>
-      <w:r>
-        <w:rPr>
-          <w:sz w:val="20"/>
-          <w:szCs w:val="20"/>
-        </w:rPr>
-        <w:t xml:space="preserve"> the original folder.</w:t>
-      </w:r>
-    </w:p>
-    <w:p>
-      <w:pPr>
-        <w:rPr>
-          <w:sz w:val="20"/>
-          <w:szCs w:val="20"/>
-        </w:rPr>
-      </w:pPr>
-      <w:r>
-        <w:rPr>
-          <w:sz w:val="20"/>
-          <w:szCs w:val="20"/>
-        </w:rPr>
-        <w:t>Once the backup has been copied back to Documents, restart the agent from the console.</w:t>
-      </w:r>
-    </w:p>
-    <w:p>
-      <w:pPr>
-        <w:rPr>
-          <w:b/>
-          <w:bCs/>
-          <w:sz w:val="40"/>
-          <w:szCs w:val="40"/>
-        </w:rPr>
       </w:pPr>
       <w:r>
         <w:rPr>
@@ -8134,23 +7823,7 @@
           <w:sz w:val="20"/>
           <w:szCs w:val="20"/>
         </w:rPr>
-        <w:t xml:space="preserve">its </w:t>
-      </w:r>
-      <w:proofErr w:type="spellStart"/>
-      <w:r>
-        <w:rPr>
-          <w:sz w:val="20"/>
-          <w:szCs w:val="20"/>
-        </w:rPr>
-        <w:t>BridgeManager</w:t>
-      </w:r>
-      <w:proofErr w:type="spellEnd"/>
-      <w:r>
-        <w:rPr>
-          <w:sz w:val="20"/>
-          <w:szCs w:val="20"/>
-        </w:rPr>
-        <w:t xml:space="preserve"> </w:t>
+        <w:t xml:space="preserve">its BridgeManager </w:t>
       </w:r>
       <w:r>
         <w:rPr>
@@ -8582,36 +8255,16 @@
           <w:sz w:val="20"/>
           <w:szCs w:val="20"/>
         </w:rPr>
-        <w:t xml:space="preserve"> </w:t>
-      </w:r>
-      <w:proofErr w:type="gramStart"/>
-      <w:r>
-        <w:rPr>
-          <w:b/>
-          <w:bCs/>
-          <w:sz w:val="20"/>
-          <w:szCs w:val="20"/>
-        </w:rPr>
-        <w:t>t</w:t>
-      </w:r>
-      <w:r>
-        <w:rPr>
-          <w:b/>
-          <w:bCs/>
-          <w:sz w:val="20"/>
-          <w:szCs w:val="20"/>
-        </w:rPr>
-        <w:t>ype</w:t>
-      </w:r>
-      <w:proofErr w:type="gramEnd"/>
-      <w:r>
-        <w:rPr>
-          <w:b/>
-          <w:bCs/>
-          <w:sz w:val="20"/>
-          <w:szCs w:val="20"/>
-        </w:rPr>
-        <w:t xml:space="preserve"> override</w:t>
+        <w:t xml:space="preserve"> t</w:t>
+      </w:r>
+      <w:r>
+        <w:rPr>
+          <w:b/>
+          <w:bCs/>
+          <w:sz w:val="20"/>
+          <w:szCs w:val="20"/>
+        </w:rPr>
+        <w:t>ype override</w:t>
       </w:r>
       <w:r>
         <w:rPr>
@@ -8708,39 +8361,7 @@
           <w:sz w:val="20"/>
           <w:szCs w:val="20"/>
         </w:rPr>
-        <w:t>commands allow you to predefine more user-friendly names for columns or names more specific to your use case, for example changing ‘</w:t>
-      </w:r>
-      <w:proofErr w:type="spellStart"/>
-      <w:r>
-        <w:rPr>
-          <w:sz w:val="20"/>
-          <w:szCs w:val="20"/>
-        </w:rPr>
-        <w:t>Dial_No</w:t>
-      </w:r>
-      <w:proofErr w:type="spellEnd"/>
-      <w:r>
-        <w:rPr>
-          <w:sz w:val="20"/>
-          <w:szCs w:val="20"/>
-        </w:rPr>
-        <w:t>’ to ‘</w:t>
-      </w:r>
-      <w:proofErr w:type="spellStart"/>
-      <w:r>
-        <w:rPr>
-          <w:sz w:val="20"/>
-          <w:szCs w:val="20"/>
-        </w:rPr>
-        <w:t>IP_Address</w:t>
-      </w:r>
-      <w:proofErr w:type="spellEnd"/>
-      <w:r>
-        <w:rPr>
-          <w:sz w:val="20"/>
-          <w:szCs w:val="20"/>
-        </w:rPr>
-        <w:t>’.</w:t>
+        <w:t>commands allow you to predefine more user-friendly names for columns or names more specific to your use case, for example changing ‘Dial_No’ to ‘IP_Address’.</w:t>
       </w:r>
       <w:r>
         <w:rPr>
@@ -8856,23 +8477,7 @@
           <w:sz w:val="20"/>
           <w:szCs w:val="20"/>
         </w:rPr>
-        <w:t>After running the previous command to create type-overrides.txt, open it in a text editor. Instructions are provided at the top of the file – make sure to read these fully. Note that all lines beginning with “</w:t>
-      </w:r>
-      <w:proofErr w:type="gramStart"/>
-      <w:r>
-        <w:rPr>
-          <w:sz w:val="20"/>
-          <w:szCs w:val="20"/>
-        </w:rPr>
-        <w:t># ”</w:t>
-      </w:r>
-      <w:proofErr w:type="gramEnd"/>
-      <w:r>
-        <w:rPr>
-          <w:sz w:val="20"/>
-          <w:szCs w:val="20"/>
-        </w:rPr>
-        <w:t xml:space="preserve"> will be ignored when loading overrides from the file. Once you are happy</w:t>
+        <w:t>After running the previous command to create type-overrides.txt, open it in a text editor. Instructions are provided at the top of the file – make sure to read these fully. Note that all lines beginning with “# ” will be ignored when loading overrides from the file. Once you are happy</w:t>
       </w:r>
       <w:r>
         <w:rPr>
@@ -9161,23 +8766,7 @@
           <w:sz w:val="20"/>
           <w:szCs w:val="20"/>
         </w:rPr>
-        <w:t xml:space="preserve"> fully. Note that all lines beginning with “</w:t>
-      </w:r>
-      <w:proofErr w:type="gramStart"/>
-      <w:r>
-        <w:rPr>
-          <w:sz w:val="20"/>
-          <w:szCs w:val="20"/>
-        </w:rPr>
-        <w:t># ”</w:t>
-      </w:r>
-      <w:proofErr w:type="gramEnd"/>
-      <w:r>
-        <w:rPr>
-          <w:sz w:val="20"/>
-          <w:szCs w:val="20"/>
-        </w:rPr>
-        <w:t xml:space="preserve"> will be ignored when loading </w:t>
+        <w:t xml:space="preserve"> fully. Note that all lines beginning with “# ” will be ignored when loading </w:t>
       </w:r>
       <w:r>
         <w:rPr>
@@ -9382,23 +8971,7 @@
           <w:sz w:val="20"/>
           <w:szCs w:val="20"/>
         </w:rPr>
-        <w:t xml:space="preserve"> fully. Note that all lines beginning with “</w:t>
-      </w:r>
-      <w:proofErr w:type="gramStart"/>
-      <w:r>
-        <w:rPr>
-          <w:sz w:val="20"/>
-          <w:szCs w:val="20"/>
-        </w:rPr>
-        <w:t># ”</w:t>
-      </w:r>
-      <w:proofErr w:type="gramEnd"/>
-      <w:r>
-        <w:rPr>
-          <w:sz w:val="20"/>
-          <w:szCs w:val="20"/>
-        </w:rPr>
-        <w:t xml:space="preserve"> will be ignored when loading friendly names from the file. Once you are happy, run the command. Any successfully read names will be summarised here and will be applied automatically after database creation (all friendly names are held in a dedicated table rather than being applied to the actual database structure in any way).</w:t>
+        <w:t xml:space="preserve"> fully. Note that all lines beginning with “# ” will be ignored when loading friendly names from the file. Once you are happy, run the command. Any successfully read names will be summarised here and will be applied automatically after database creation (all friendly names are held in a dedicated table rather than being applied to the actual database structure in any way).</w:t>
       </w:r>
     </w:p>
     <w:p>
@@ -9488,39 +9061,7 @@
           <w:sz w:val="20"/>
           <w:szCs w:val="20"/>
         </w:rPr>
-        <w:t xml:space="preserve">This command will automatically create the database, placing both the </w:t>
-      </w:r>
-      <w:proofErr w:type="spellStart"/>
-      <w:r>
-        <w:rPr>
-          <w:sz w:val="20"/>
-          <w:szCs w:val="20"/>
-        </w:rPr>
-        <w:t>BridgeManager_Data.mdf</w:t>
-      </w:r>
-      <w:proofErr w:type="spellEnd"/>
-      <w:r>
-        <w:rPr>
-          <w:sz w:val="20"/>
-          <w:szCs w:val="20"/>
-        </w:rPr>
-        <w:t xml:space="preserve"> database file and the </w:t>
-      </w:r>
-      <w:proofErr w:type="spellStart"/>
-      <w:r>
-        <w:rPr>
-          <w:sz w:val="20"/>
-          <w:szCs w:val="20"/>
-        </w:rPr>
-        <w:t>BridgeManager_Log.ldf</w:t>
-      </w:r>
-      <w:proofErr w:type="spellEnd"/>
-      <w:r>
-        <w:rPr>
-          <w:sz w:val="20"/>
-          <w:szCs w:val="20"/>
-        </w:rPr>
-        <w:t xml:space="preserve"> log file into “Documents/Bridge Manager”, applying any loaded type overrides, column additions or friendly names as it does so.</w:t>
+        <w:t>This command will automatically create the database, placing both the BridgeManager_Data.mdf database file and the BridgeManager_Log.ldf log file into “Documents/Bridge Manager”, applying any loaded type overrides, column additions or friendly names as it does so.</w:t>
       </w:r>
     </w:p>
     <w:p>
@@ -10803,21 +10344,12 @@
         </w:rPr>
         <w:br/>
       </w:r>
-      <w:proofErr w:type="spellStart"/>
-      <w:r>
-        <w:rPr>
-          <w:sz w:val="20"/>
-          <w:szCs w:val="20"/>
-        </w:rPr>
-        <w:t>Start</w:t>
-      </w:r>
-      <w:proofErr w:type="spellEnd"/>
-      <w:r>
-        <w:rPr>
-          <w:sz w:val="20"/>
-          <w:szCs w:val="20"/>
-        </w:rPr>
-        <w:t xml:space="preserve"> the BridgeManagerAgent.exe program. Note that this executable must be in the same directory as the console application. The command will fail if the executable could not be found, or if the process is already running in the background.</w:t>
+      <w:r>
+        <w:rPr>
+          <w:sz w:val="20"/>
+          <w:szCs w:val="20"/>
+        </w:rPr>
+        <w:t>Start the BridgeManagerAgent.exe program. Note that this executable must be in the same directory as the console application. The command will fail if the executable could not be found, or if the process is already running in the background.</w:t>
       </w:r>
     </w:p>
     <w:p>
@@ -10876,21 +10408,12 @@
         </w:rPr>
         <w:br/>
       </w:r>
-      <w:proofErr w:type="spellStart"/>
-      <w:r>
-        <w:rPr>
-          <w:sz w:val="20"/>
-          <w:szCs w:val="20"/>
-        </w:rPr>
-        <w:t>Stop</w:t>
-      </w:r>
-      <w:proofErr w:type="spellEnd"/>
-      <w:r>
-        <w:rPr>
-          <w:sz w:val="20"/>
-          <w:szCs w:val="20"/>
-        </w:rPr>
-        <w:t xml:space="preserve"> the BridgeManagerAgent.exe program. This command will work even if the agent wasn’t started this session or from within the console</w:t>
+      <w:r>
+        <w:rPr>
+          <w:sz w:val="20"/>
+          <w:szCs w:val="20"/>
+        </w:rPr>
+        <w:t>Stop the BridgeManagerAgent.exe program. This command will work even if the agent wasn’t started this session or from within the console</w:t>
       </w:r>
       <w:r>
         <w:rPr>
@@ -11744,7 +11267,6 @@
         </w:rPr>
         <w:t xml:space="preserve">.NET 6.0 </w:t>
       </w:r>
-      <w:proofErr w:type="gramStart"/>
       <w:r>
         <w:rPr>
           <w:b/>
@@ -11778,15 +11300,7 @@
           <w:i/>
           <w:iCs/>
         </w:rPr>
-        <w:t>x</w:t>
-      </w:r>
-      <w:proofErr w:type="gramEnd"/>
-      <w:r>
-        <w:rPr>
-          <w:i/>
-          <w:iCs/>
-        </w:rPr>
-        <w:t>86 or x64 depending on your system</w:t>
+        <w:t>x86 or x64 depending on your system</w:t>
       </w:r>
     </w:p>
     <w:p>
@@ -15058,30 +14572,14 @@
           <w:sz w:val="20"/>
           <w:szCs w:val="20"/>
         </w:rPr>
-        <w:t xml:space="preserve">Bridge Manager’s database layout, </w:t>
-      </w:r>
-      <w:proofErr w:type="gramStart"/>
-      <w:r>
-        <w:rPr>
-          <w:sz w:val="20"/>
-          <w:szCs w:val="20"/>
-        </w:rPr>
-        <w:t xml:space="preserve">and </w:t>
-      </w:r>
-      <w:r>
-        <w:rPr>
-          <w:sz w:val="20"/>
-          <w:szCs w:val="20"/>
-        </w:rPr>
-        <w:t>also</w:t>
-      </w:r>
-      <w:proofErr w:type="gramEnd"/>
-      <w:r>
-        <w:rPr>
-          <w:sz w:val="20"/>
-          <w:szCs w:val="20"/>
-        </w:rPr>
-        <w:t xml:space="preserve"> </w:t>
+        <w:t xml:space="preserve">Bridge Manager’s database layout, and </w:t>
+      </w:r>
+      <w:r>
+        <w:rPr>
+          <w:sz w:val="20"/>
+          <w:szCs w:val="20"/>
+        </w:rPr>
+        <w:t xml:space="preserve">also </w:t>
       </w:r>
       <w:r>
         <w:rPr>
@@ -15357,21 +14855,12 @@
         </w:rPr>
         <w:br/>
       </w:r>
-      <w:proofErr w:type="gramStart"/>
-      <w:r>
-        <w:rPr>
-          <w:sz w:val="20"/>
-          <w:szCs w:val="20"/>
-        </w:rPr>
-        <w:t>Non-editable</w:t>
-      </w:r>
-      <w:proofErr w:type="gramEnd"/>
-      <w:r>
-        <w:rPr>
-          <w:sz w:val="20"/>
-          <w:szCs w:val="20"/>
-        </w:rPr>
-        <w:t xml:space="preserve"> columns that are integral to the software’s core functions may use friendly names to change how they appear across the application. See the </w:t>
+      <w:r>
+        <w:rPr>
+          <w:sz w:val="20"/>
+          <w:szCs w:val="20"/>
+        </w:rPr>
+        <w:t xml:space="preserve">Non-editable columns that are integral to the software’s core functions may use friendly names to change how they appear across the application. See the </w:t>
       </w:r>
       <w:r>
         <w:rPr>
@@ -16054,23 +15543,7 @@
           <w:sz w:val="20"/>
           <w:szCs w:val="20"/>
         </w:rPr>
-        <w:t xml:space="preserve">the organisation table’s </w:t>
-      </w:r>
-      <w:proofErr w:type="spellStart"/>
-      <w:r>
-        <w:rPr>
-          <w:sz w:val="20"/>
-          <w:szCs w:val="20"/>
-        </w:rPr>
-        <w:t>Dial_No</w:t>
-      </w:r>
-      <w:proofErr w:type="spellEnd"/>
-      <w:r>
-        <w:rPr>
-          <w:sz w:val="20"/>
-          <w:szCs w:val="20"/>
-        </w:rPr>
-        <w:t xml:space="preserve"> column to ‘IP Address’, it will appear as ‘IP Address’ in the Organisation window, the search bar of the data pane and the select query builder.</w:t>
+        <w:t>the organisation table’s Dial_No column to ‘IP Address’, it will appear as ‘IP Address’ in the Organisation window, the search bar of the data pane and the select query builder.</w:t>
       </w:r>
     </w:p>
     <w:p>
@@ -16230,7 +15703,6 @@
         </w:rPr>
         <w:t>type (</w:t>
       </w:r>
-      <w:proofErr w:type="spellStart"/>
       <w:r>
         <w:rPr>
           <w:b/>
@@ -16245,17 +15717,8 @@
           <w:sz w:val="20"/>
           <w:szCs w:val="20"/>
         </w:rPr>
-        <w:t>iable</w:t>
-      </w:r>
-      <w:proofErr w:type="spellEnd"/>
-      <w:r>
-        <w:rPr>
-          <w:sz w:val="20"/>
-          <w:szCs w:val="20"/>
-        </w:rPr>
-        <w:t xml:space="preserve"> </w:t>
-      </w:r>
-      <w:proofErr w:type="spellStart"/>
+        <w:t xml:space="preserve">iable </w:t>
+      </w:r>
       <w:r>
         <w:rPr>
           <w:b/>
@@ -16270,15 +15733,7 @@
           <w:sz w:val="20"/>
           <w:szCs w:val="20"/>
         </w:rPr>
-        <w:t>acter</w:t>
-      </w:r>
-      <w:proofErr w:type="spellEnd"/>
-      <w:r>
-        <w:rPr>
-          <w:sz w:val="20"/>
-          <w:szCs w:val="20"/>
-        </w:rPr>
-        <w:t>)</w:t>
+        <w:t>acter)</w:t>
       </w:r>
       <w:r>
         <w:rPr>
@@ -16998,15 +16453,7 @@
           <w:sz w:val="20"/>
           <w:szCs w:val="20"/>
         </w:rPr>
-        <w:t xml:space="preserve">Placing this constraint on a column will force </w:t>
-      </w:r>
-      <w:proofErr w:type="gramStart"/>
-      <w:r>
-        <w:rPr>
-          <w:sz w:val="20"/>
-          <w:szCs w:val="20"/>
-        </w:rPr>
-        <w:t>all</w:t>
+        <w:t>Placing this constraint on a column will force all</w:t>
       </w:r>
       <w:r>
         <w:rPr>
@@ -17015,7 +16462,6 @@
         </w:rPr>
         <w:t xml:space="preserve"> of</w:t>
       </w:r>
-      <w:proofErr w:type="gramEnd"/>
       <w:r>
         <w:rPr>
           <w:sz w:val="20"/>
@@ -17365,7 +16811,6 @@
         </w:rPr>
         <w:t xml:space="preserve"> synchronous with any foreign keys that reference them. Bridge Manager has been designed to automate this process, so that, for example, if </w:t>
       </w:r>
-      <w:proofErr w:type="spellStart"/>
       <w:r>
         <w:rPr>
           <w:i/>
@@ -17375,7 +16820,6 @@
         </w:rPr>
         <w:t>Organisation.Organisation_Reference</w:t>
       </w:r>
-      <w:proofErr w:type="spellEnd"/>
       <w:r>
         <w:rPr>
           <w:sz w:val="20"/>
@@ -17383,7 +16827,6 @@
         </w:rPr>
         <w:t xml:space="preserve"> has its max length updated, then </w:t>
       </w:r>
-      <w:proofErr w:type="spellStart"/>
       <w:r>
         <w:rPr>
           <w:i/>
@@ -17411,7 +16854,6 @@
         </w:rPr>
         <w:t>_Reference</w:t>
       </w:r>
-      <w:proofErr w:type="spellEnd"/>
       <w:r>
         <w:rPr>
           <w:sz w:val="20"/>
@@ -17419,7 +16861,6 @@
         </w:rPr>
         <w:t xml:space="preserve"> and </w:t>
       </w:r>
-      <w:proofErr w:type="spellStart"/>
       <w:r>
         <w:rPr>
           <w:i/>
@@ -17429,7 +16870,6 @@
         </w:rPr>
         <w:t>Organisation.Parent_Reference</w:t>
       </w:r>
-      <w:proofErr w:type="spellEnd"/>
       <w:r>
         <w:rPr>
           <w:sz w:val="20"/>
@@ -17500,23 +16940,7 @@
           <w:sz w:val="20"/>
           <w:szCs w:val="20"/>
         </w:rPr>
-        <w:t xml:space="preserve">Even with these safeguards in place, it is advised to leave core column types alone unless </w:t>
-      </w:r>
-      <w:proofErr w:type="gramStart"/>
-      <w:r>
-        <w:rPr>
-          <w:sz w:val="20"/>
-          <w:szCs w:val="20"/>
-        </w:rPr>
-        <w:t>absolutely necessary</w:t>
-      </w:r>
-      <w:proofErr w:type="gramEnd"/>
-      <w:r>
-        <w:rPr>
-          <w:sz w:val="20"/>
-          <w:szCs w:val="20"/>
-        </w:rPr>
-        <w:t>, and to always back up the database before making any changes.</w:t>
+        <w:t>Even with these safeguards in place, it is advised to leave core column types alone unless absolutely necessary, and to always back up the database before making any changes.</w:t>
       </w:r>
     </w:p>
     <w:p>
@@ -18667,49 +18091,8 @@
           <w:sz w:val="20"/>
           <w:szCs w:val="20"/>
         </w:rPr>
-        <w:t xml:space="preserve">. The column orders are stored in the </w:t>
-      </w:r>
-      <w:proofErr w:type="spellStart"/>
-      <w:r>
-        <w:rPr>
-          <w:sz w:val="20"/>
-          <w:szCs w:val="20"/>
-        </w:rPr>
-        <w:t>OrganisationOrder</w:t>
-      </w:r>
-      <w:proofErr w:type="spellEnd"/>
-      <w:r>
-        <w:rPr>
-          <w:sz w:val="20"/>
-          <w:szCs w:val="20"/>
-        </w:rPr>
-        <w:t xml:space="preserve">, </w:t>
-      </w:r>
-      <w:proofErr w:type="spellStart"/>
-      <w:r>
-        <w:rPr>
-          <w:sz w:val="20"/>
-          <w:szCs w:val="20"/>
-        </w:rPr>
-        <w:t>AssetOrder</w:t>
-      </w:r>
-      <w:proofErr w:type="spellEnd"/>
-      <w:r>
-        <w:rPr>
-          <w:sz w:val="20"/>
-          <w:szCs w:val="20"/>
-        </w:rPr>
-        <w:t xml:space="preserve">, </w:t>
-      </w:r>
-      <w:proofErr w:type="spellStart"/>
-      <w:r>
-        <w:rPr>
-          <w:sz w:val="20"/>
-          <w:szCs w:val="20"/>
-        </w:rPr>
-        <w:t>ContactOrder</w:t>
-      </w:r>
-      <w:proofErr w:type="spellEnd"/>
+        <w:t>. The column orders are stored in the OrganisationOrder, AssetOrder, ContactOrder</w:t>
+      </w:r>
       <w:r>
         <w:rPr>
           <w:sz w:val="20"/>
@@ -18722,65 +18105,15 @@
           <w:sz w:val="20"/>
           <w:szCs w:val="20"/>
         </w:rPr>
-        <w:t xml:space="preserve"> </w:t>
-      </w:r>
-      <w:proofErr w:type="spellStart"/>
-      <w:r>
-        <w:rPr>
-          <w:sz w:val="20"/>
-          <w:szCs w:val="20"/>
-        </w:rPr>
-        <w:t>ConferenceOrder</w:t>
-      </w:r>
-      <w:proofErr w:type="spellEnd"/>
-      <w:r>
-        <w:rPr>
-          <w:sz w:val="20"/>
-          <w:szCs w:val="20"/>
-        </w:rPr>
-        <w:t xml:space="preserve">, </w:t>
-      </w:r>
-      <w:proofErr w:type="spellStart"/>
-      <w:r>
-        <w:rPr>
-          <w:sz w:val="20"/>
-          <w:szCs w:val="20"/>
-        </w:rPr>
-        <w:t>TaskOrder</w:t>
-      </w:r>
-      <w:proofErr w:type="spellEnd"/>
-      <w:r>
-        <w:rPr>
-          <w:sz w:val="20"/>
-          <w:szCs w:val="20"/>
-        </w:rPr>
-        <w:t xml:space="preserve">, </w:t>
-      </w:r>
-      <w:proofErr w:type="spellStart"/>
-      <w:r>
-        <w:rPr>
-          <w:sz w:val="20"/>
-          <w:szCs w:val="20"/>
-        </w:rPr>
-        <w:t>VisitOrder</w:t>
-      </w:r>
-      <w:proofErr w:type="spellEnd"/>
-      <w:r>
-        <w:rPr>
-          <w:sz w:val="20"/>
-          <w:szCs w:val="20"/>
-        </w:rPr>
-        <w:t xml:space="preserve"> and </w:t>
-      </w:r>
-      <w:proofErr w:type="spellStart"/>
-      <w:r>
-        <w:rPr>
-          <w:sz w:val="20"/>
-          <w:szCs w:val="20"/>
-        </w:rPr>
-        <w:t>DocumentOrder</w:t>
-      </w:r>
-      <w:proofErr w:type="spellEnd"/>
+        <w:t xml:space="preserve"> ConferenceOrder</w:t>
+      </w:r>
+      <w:r>
+        <w:rPr>
+          <w:sz w:val="20"/>
+          <w:szCs w:val="20"/>
+        </w:rPr>
+        <w:t>, TaskOrder, VisitOrder and DocumentOrder</w:t>
+      </w:r>
       <w:r>
         <w:rPr>
           <w:sz w:val="20"/>
@@ -18830,7 +18163,6 @@
         </w:rPr>
         <w:t xml:space="preserve">Bridge Manager accounts with full admin rights have the capability to correct change reasons. This capability is restricted to administrators </w:t>
       </w:r>
-      <w:proofErr w:type="gramStart"/>
       <w:r>
         <w:rPr>
           <w:sz w:val="20"/>
@@ -18838,7 +18170,6 @@
         </w:rPr>
         <w:t>in order to</w:t>
       </w:r>
-      <w:proofErr w:type="gramEnd"/>
       <w:r>
         <w:rPr>
           <w:sz w:val="20"/>
@@ -19535,7 +18866,6 @@
           <w:szCs w:val="40"/>
         </w:rPr>
       </w:pPr>
-      <w:proofErr w:type="spellStart"/>
       <w:r>
         <w:rPr>
           <w:b/>
@@ -19544,17 +18874,7 @@
           <w:szCs w:val="40"/>
         </w:rPr>
         <w:lastRenderedPageBreak/>
-        <w:t>BridgeManager</w:t>
-      </w:r>
-      <w:proofErr w:type="spellEnd"/>
-      <w:r>
-        <w:rPr>
-          <w:b/>
-          <w:bCs/>
-          <w:sz w:val="40"/>
-          <w:szCs w:val="40"/>
-        </w:rPr>
-        <w:t xml:space="preserve"> Database Diagram</w:t>
+        <w:t>BridgeManager Database Diagram</w:t>
       </w:r>
     </w:p>
     <w:p>
@@ -19583,49 +18903,8 @@
           <w:sz w:val="20"/>
           <w:szCs w:val="20"/>
         </w:rPr>
-        <w:t xml:space="preserve"> omits the </w:t>
-      </w:r>
-      <w:proofErr w:type="spellStart"/>
-      <w:r>
-        <w:rPr>
-          <w:sz w:val="20"/>
-          <w:szCs w:val="20"/>
-        </w:rPr>
-        <w:t>OrganisationOrder</w:t>
-      </w:r>
-      <w:proofErr w:type="spellEnd"/>
-      <w:r>
-        <w:rPr>
-          <w:sz w:val="20"/>
-          <w:szCs w:val="20"/>
-        </w:rPr>
-        <w:t xml:space="preserve">, </w:t>
-      </w:r>
-      <w:proofErr w:type="spellStart"/>
-      <w:r>
-        <w:rPr>
-          <w:sz w:val="20"/>
-          <w:szCs w:val="20"/>
-        </w:rPr>
-        <w:t>AssetOrder</w:t>
-      </w:r>
-      <w:proofErr w:type="spellEnd"/>
-      <w:r>
-        <w:rPr>
-          <w:sz w:val="20"/>
-          <w:szCs w:val="20"/>
-        </w:rPr>
-        <w:t xml:space="preserve">, </w:t>
-      </w:r>
-      <w:proofErr w:type="spellStart"/>
-      <w:r>
-        <w:rPr>
-          <w:sz w:val="20"/>
-          <w:szCs w:val="20"/>
-        </w:rPr>
-        <w:t>ContactOrder</w:t>
-      </w:r>
-      <w:proofErr w:type="spellEnd"/>
+        <w:t xml:space="preserve"> omits the OrganisationOrder, AssetOrder, ContactOrder</w:t>
+      </w:r>
       <w:r>
         <w:rPr>
           <w:sz w:val="20"/>
@@ -19638,101 +18917,35 @@
           <w:sz w:val="20"/>
           <w:szCs w:val="20"/>
         </w:rPr>
+        <w:t xml:space="preserve"> ConferenceOrder</w:t>
+      </w:r>
+      <w:r>
+        <w:rPr>
+          <w:sz w:val="20"/>
+          <w:szCs w:val="20"/>
+        </w:rPr>
+        <w:t>,</w:t>
+      </w:r>
+      <w:r>
+        <w:rPr>
+          <w:sz w:val="20"/>
+          <w:szCs w:val="20"/>
+        </w:rPr>
+        <w:t xml:space="preserve"> TaskOrder, VisitOrder, DocumentOrder</w:t>
+      </w:r>
+      <w:r>
+        <w:rPr>
+          <w:sz w:val="20"/>
+          <w:szCs w:val="20"/>
+        </w:rPr>
         <w:t xml:space="preserve"> </w:t>
       </w:r>
-      <w:proofErr w:type="spellStart"/>
-      <w:r>
-        <w:rPr>
-          <w:sz w:val="20"/>
-          <w:szCs w:val="20"/>
-        </w:rPr>
-        <w:t>ConferenceOrder</w:t>
-      </w:r>
-      <w:proofErr w:type="spellEnd"/>
-      <w:r>
-        <w:rPr>
-          <w:sz w:val="20"/>
-          <w:szCs w:val="20"/>
-        </w:rPr>
-        <w:t>,</w:t>
-      </w:r>
-      <w:r>
-        <w:rPr>
-          <w:sz w:val="20"/>
-          <w:szCs w:val="20"/>
-        </w:rPr>
-        <w:t xml:space="preserve"> </w:t>
-      </w:r>
-      <w:proofErr w:type="spellStart"/>
-      <w:r>
-        <w:rPr>
-          <w:sz w:val="20"/>
-          <w:szCs w:val="20"/>
-        </w:rPr>
-        <w:t>TaskOrder</w:t>
-      </w:r>
-      <w:proofErr w:type="spellEnd"/>
-      <w:r>
-        <w:rPr>
-          <w:sz w:val="20"/>
-          <w:szCs w:val="20"/>
-        </w:rPr>
-        <w:t xml:space="preserve">, </w:t>
-      </w:r>
-      <w:proofErr w:type="spellStart"/>
-      <w:r>
-        <w:rPr>
-          <w:sz w:val="20"/>
-          <w:szCs w:val="20"/>
-        </w:rPr>
-        <w:t>VisitOrder</w:t>
-      </w:r>
-      <w:proofErr w:type="spellEnd"/>
-      <w:r>
-        <w:rPr>
-          <w:sz w:val="20"/>
-          <w:szCs w:val="20"/>
-        </w:rPr>
-        <w:t xml:space="preserve">, </w:t>
-      </w:r>
-      <w:proofErr w:type="spellStart"/>
-      <w:r>
-        <w:rPr>
-          <w:sz w:val="20"/>
-          <w:szCs w:val="20"/>
-        </w:rPr>
-        <w:t>DocumentOrder</w:t>
-      </w:r>
-      <w:proofErr w:type="spellEnd"/>
-      <w:r>
-        <w:rPr>
-          <w:sz w:val="20"/>
-          <w:szCs w:val="20"/>
-        </w:rPr>
-        <w:t xml:space="preserve"> </w:t>
-      </w:r>
-      <w:r>
-        <w:rPr>
-          <w:sz w:val="20"/>
-          <w:szCs w:val="20"/>
-        </w:rPr>
-        <w:t xml:space="preserve">and </w:t>
-      </w:r>
-      <w:proofErr w:type="spellStart"/>
-      <w:r>
-        <w:rPr>
-          <w:sz w:val="20"/>
-          <w:szCs w:val="20"/>
-        </w:rPr>
-        <w:t>FriendlyNames</w:t>
-      </w:r>
-      <w:proofErr w:type="spellEnd"/>
-      <w:r>
-        <w:rPr>
-          <w:sz w:val="20"/>
-          <w:szCs w:val="20"/>
-        </w:rPr>
-        <w:t xml:space="preserve"> table</w:t>
+      <w:r>
+        <w:rPr>
+          <w:sz w:val="20"/>
+          <w:szCs w:val="20"/>
+        </w:rPr>
+        <w:t>and FriendlyNames table</w:t>
       </w:r>
       <w:r>
         <w:rPr>
@@ -19862,7 +19075,7 @@
 </file>
 
 <file path=word/endnotes.xml><?xml version="1.0" encoding="utf-8"?>
-<w:endnotes xmlns:wpc="http://schemas.microsoft.com/office/word/2010/wordprocessingCanvas" xmlns:cx="http://schemas.microsoft.com/office/drawing/2014/chartex" xmlns:cx1="http://schemas.microsoft.com/office/drawing/2015/9/8/chartex" xmlns:cx2="http://schemas.microsoft.com/office/drawing/2015/10/21/chartex" xmlns:cx3="http://schemas.microsoft.com/office/drawing/2016/5/9/chartex" xmlns:cx4="http://schemas.microsoft.com/office/drawing/2016/5/10/chartex" xmlns:cx5="http://schemas.microsoft.com/office/drawing/2016/5/11/chartex" xmlns:cx6="http://schemas.microsoft.com/office/drawing/2016/5/12/chartex" xmlns:cx7="http://schemas.microsoft.com/office/drawing/2016/5/13/chartex" xmlns:cx8="http://schemas.microsoft.com/office/drawing/2016/5/14/chartex" xmlns:mc="http://schemas.openxmlformats.org/markup-compatibility/2006" xmlns:aink="http://schemas.microsoft.com/office/drawing/2016/ink" xmlns:am3d="http://schemas.microsoft.com/office/drawing/2017/model3d" xmlns:o="urn:schemas-microsoft-com:office:office" xmlns:oel="http://schemas.microsoft.com/office/2019/extlst" xmlns:r="http://schemas.openxmlformats.org/officeDocument/2006/relationships" xmlns:m="http://schemas.openxmlformats.org/officeDocument/2006/math" xmlns:v="urn:schemas-microsoft-com:vml" xmlns:wp14="http://schemas.microsoft.com/office/word/2010/wordprocessingDrawing" xmlns:wp="http://schemas.openxmlformats.org/drawingml/2006/wordprocessingDrawing" xmlns:w10="urn:schemas-microsoft-com:office:word" xmlns:w="http://schemas.openxmlformats.org/wordprocessingml/2006/main" xmlns:w14="http://schemas.microsoft.com/office/word/2010/wordml" xmlns:w15="http://schemas.microsoft.com/office/word/2012/wordml" xmlns:w16cex="http://schemas.microsoft.com/office/word/2018/wordml/cex" xmlns:w16cid="http://schemas.microsoft.com/office/word/2016/wordml/cid" xmlns:w16="http://schemas.microsoft.com/office/word/2018/wordml" xmlns:w16du="http://schemas.microsoft.com/office/word/2023/wordml/word16du" xmlns:w16sdtdh="http://schemas.microsoft.com/office/word/2020/wordml/sdtdatahash" xmlns:w16sdtfl="http://schemas.microsoft.com/office/word/2024/wordml/sdtformatlock" xmlns:w16se="http://schemas.microsoft.com/office/word/2015/wordml/symex" xmlns:wpg="http://schemas.microsoft.com/office/word/2010/wordprocessingGroup" xmlns:wpi="http://schemas.microsoft.com/office/word/2010/wordprocessingInk" xmlns:wne="http://schemas.microsoft.com/office/word/2006/wordml" xmlns:wps="http://schemas.microsoft.com/office/word/2010/wordprocessingShape" mc:Ignorable="w14 w15 w16se w16cid w16 w16cex w16sdtdh w16sdtfl w16du wp14">
+<w:endnotes xmlns:wpc="http://schemas.microsoft.com/office/word/2010/wordprocessingCanvas" xmlns:cx="http://schemas.microsoft.com/office/drawing/2014/chartex" xmlns:cx1="http://schemas.microsoft.com/office/drawing/2015/9/8/chartex" xmlns:cx2="http://schemas.microsoft.com/office/drawing/2015/10/21/chartex" xmlns:cx3="http://schemas.microsoft.com/office/drawing/2016/5/9/chartex" xmlns:cx4="http://schemas.microsoft.com/office/drawing/2016/5/10/chartex" xmlns:cx5="http://schemas.microsoft.com/office/drawing/2016/5/11/chartex" xmlns:cx6="http://schemas.microsoft.com/office/drawing/2016/5/12/chartex" xmlns:cx7="http://schemas.microsoft.com/office/drawing/2016/5/13/chartex" xmlns:cx8="http://schemas.microsoft.com/office/drawing/2016/5/14/chartex" xmlns:mc="http://schemas.openxmlformats.org/markup-compatibility/2006" xmlns:aink="http://schemas.microsoft.com/office/drawing/2016/ink" xmlns:am3d="http://schemas.microsoft.com/office/drawing/2017/model3d" xmlns:o="urn:schemas-microsoft-com:office:office" xmlns:oel="http://schemas.microsoft.com/office/2019/extlst" xmlns:r="http://schemas.openxmlformats.org/officeDocument/2006/relationships" xmlns:m="http://schemas.openxmlformats.org/officeDocument/2006/math" xmlns:v="urn:schemas-microsoft-com:vml" xmlns:wp14="http://schemas.microsoft.com/office/word/2010/wordprocessingDrawing" xmlns:wp="http://schemas.openxmlformats.org/drawingml/2006/wordprocessingDrawing" xmlns:w10="urn:schemas-microsoft-com:office:word" xmlns:w="http://schemas.openxmlformats.org/wordprocessingml/2006/main" xmlns:w14="http://schemas.microsoft.com/office/word/2010/wordml" xmlns:w15="http://schemas.microsoft.com/office/word/2012/wordml" xmlns:w16cei="http://schemas.microsoft.com/office/word/2026/wordml/cei" xmlns:w16cex="http://schemas.microsoft.com/office/word/2018/wordml/cex" xmlns:w16cid="http://schemas.microsoft.com/office/word/2016/wordml/cid" xmlns:w16="http://schemas.microsoft.com/office/word/2018/wordml" xmlns:w16du="http://schemas.microsoft.com/office/word/2023/wordml/word16du" xmlns:w16sdtdh="http://schemas.microsoft.com/office/word/2020/wordml/sdtdatahash" xmlns:w16sdtfl="http://schemas.microsoft.com/office/word/2024/wordml/sdtformatlock" xmlns:w16se="http://schemas.microsoft.com/office/word/2015/wordml/symex" xmlns:wpg="http://schemas.microsoft.com/office/word/2010/wordprocessingGroup" xmlns:wpi="http://schemas.microsoft.com/office/word/2010/wordprocessingInk" xmlns:wne="http://schemas.microsoft.com/office/word/2006/wordml" xmlns:wps="http://schemas.microsoft.com/office/word/2010/wordprocessingShape" mc:Ignorable="w14 w15 w16se w16cid w16 w16cex w16sdtdh w16sdtfl w16du wp14">
   <w:endnote w:type="separator" w:id="-1">
     <w:p>
       <w:pPr>
@@ -19887,7 +19100,7 @@
 </file>
 
 <file path=word/footer1.xml><?xml version="1.0" encoding="utf-8"?>
-<w:ftr xmlns:wpc="http://schemas.microsoft.com/office/word/2010/wordprocessingCanvas" xmlns:cx="http://schemas.microsoft.com/office/drawing/2014/chartex" xmlns:cx1="http://schemas.microsoft.com/office/drawing/2015/9/8/chartex" xmlns:cx2="http://schemas.microsoft.com/office/drawing/2015/10/21/chartex" xmlns:cx3="http://schemas.microsoft.com/office/drawing/2016/5/9/chartex" xmlns:cx4="http://schemas.microsoft.com/office/drawing/2016/5/10/chartex" xmlns:cx5="http://schemas.microsoft.com/office/drawing/2016/5/11/chartex" xmlns:cx6="http://schemas.microsoft.com/office/drawing/2016/5/12/chartex" xmlns:cx7="http://schemas.microsoft.com/office/drawing/2016/5/13/chartex" xmlns:cx8="http://schemas.microsoft.com/office/drawing/2016/5/14/chartex" xmlns:mc="http://schemas.openxmlformats.org/markup-compatibility/2006" xmlns:aink="http://schemas.microsoft.com/office/drawing/2016/ink" xmlns:am3d="http://schemas.microsoft.com/office/drawing/2017/model3d" xmlns:o="urn:schemas-microsoft-com:office:office" xmlns:oel="http://schemas.microsoft.com/office/2019/extlst" xmlns:r="http://schemas.openxmlformats.org/officeDocument/2006/relationships" xmlns:m="http://schemas.openxmlformats.org/officeDocument/2006/math" xmlns:v="urn:schemas-microsoft-com:vml" xmlns:wp14="http://schemas.microsoft.com/office/word/2010/wordprocessingDrawing" xmlns:wp="http://schemas.openxmlformats.org/drawingml/2006/wordprocessingDrawing" xmlns:w10="urn:schemas-microsoft-com:office:word" xmlns:w="http://schemas.openxmlformats.org/wordprocessingml/2006/main" xmlns:w14="http://schemas.microsoft.com/office/word/2010/wordml" xmlns:w15="http://schemas.microsoft.com/office/word/2012/wordml" xmlns:w16cex="http://schemas.microsoft.com/office/word/2018/wordml/cex" xmlns:w16cid="http://schemas.microsoft.com/office/word/2016/wordml/cid" xmlns:w16="http://schemas.microsoft.com/office/word/2018/wordml" xmlns:w16du="http://schemas.microsoft.com/office/word/2023/wordml/word16du" xmlns:w16sdtdh="http://schemas.microsoft.com/office/word/2020/wordml/sdtdatahash" xmlns:w16sdtfl="http://schemas.microsoft.com/office/word/2024/wordml/sdtformatlock" xmlns:w16se="http://schemas.microsoft.com/office/word/2015/wordml/symex" xmlns:wpg="http://schemas.microsoft.com/office/word/2010/wordprocessingGroup" xmlns:wpi="http://schemas.microsoft.com/office/word/2010/wordprocessingInk" xmlns:wne="http://schemas.microsoft.com/office/word/2006/wordml" xmlns:wps="http://schemas.microsoft.com/office/word/2010/wordprocessingShape" mc:Ignorable="w14 w15 w16se w16cid w16 w16cex w16sdtdh w16sdtfl w16du wp14">
+<w:ftr xmlns:wpc="http://schemas.microsoft.com/office/word/2010/wordprocessingCanvas" xmlns:cx="http://schemas.microsoft.com/office/drawing/2014/chartex" xmlns:cx1="http://schemas.microsoft.com/office/drawing/2015/9/8/chartex" xmlns:cx2="http://schemas.microsoft.com/office/drawing/2015/10/21/chartex" xmlns:cx3="http://schemas.microsoft.com/office/drawing/2016/5/9/chartex" xmlns:cx4="http://schemas.microsoft.com/office/drawing/2016/5/10/chartex" xmlns:cx5="http://schemas.microsoft.com/office/drawing/2016/5/11/chartex" xmlns:cx6="http://schemas.microsoft.com/office/drawing/2016/5/12/chartex" xmlns:cx7="http://schemas.microsoft.com/office/drawing/2016/5/13/chartex" xmlns:cx8="http://schemas.microsoft.com/office/drawing/2016/5/14/chartex" xmlns:mc="http://schemas.openxmlformats.org/markup-compatibility/2006" xmlns:aink="http://schemas.microsoft.com/office/drawing/2016/ink" xmlns:am3d="http://schemas.microsoft.com/office/drawing/2017/model3d" xmlns:o="urn:schemas-microsoft-com:office:office" xmlns:oel="http://schemas.microsoft.com/office/2019/extlst" xmlns:r="http://schemas.openxmlformats.org/officeDocument/2006/relationships" xmlns:m="http://schemas.openxmlformats.org/officeDocument/2006/math" xmlns:v="urn:schemas-microsoft-com:vml" xmlns:wp14="http://schemas.microsoft.com/office/word/2010/wordprocessingDrawing" xmlns:wp="http://schemas.openxmlformats.org/drawingml/2006/wordprocessingDrawing" xmlns:w10="urn:schemas-microsoft-com:office:word" xmlns:w="http://schemas.openxmlformats.org/wordprocessingml/2006/main" xmlns:w14="http://schemas.microsoft.com/office/word/2010/wordml" xmlns:w15="http://schemas.microsoft.com/office/word/2012/wordml" xmlns:w16cei="http://schemas.microsoft.com/office/word/2026/wordml/cei" xmlns:w16cex="http://schemas.microsoft.com/office/word/2018/wordml/cex" xmlns:w16cid="http://schemas.microsoft.com/office/word/2016/wordml/cid" xmlns:w16="http://schemas.microsoft.com/office/word/2018/wordml" xmlns:w16du="http://schemas.microsoft.com/office/word/2023/wordml/word16du" xmlns:w16sdtdh="http://schemas.microsoft.com/office/word/2020/wordml/sdtdatahash" xmlns:w16sdtfl="http://schemas.microsoft.com/office/word/2024/wordml/sdtformatlock" xmlns:w16se="http://schemas.microsoft.com/office/word/2015/wordml/symex" xmlns:wpg="http://schemas.microsoft.com/office/word/2010/wordprocessingGroup" xmlns:wpi="http://schemas.microsoft.com/office/word/2010/wordprocessingInk" xmlns:wne="http://schemas.microsoft.com/office/word/2006/wordml" xmlns:wps="http://schemas.microsoft.com/office/word/2010/wordprocessingShape" mc:Ignorable="w14 w15 w16se w16cid w16 w16cex w16sdtdh w16sdtfl w16du wp14">
   <w:sdt>
     <w:sdtPr>
       <w:id w:val="1735817785"/>
@@ -19996,7 +19209,7 @@
           <w:rPr>
             <w:noProof/>
           </w:rPr>
-          <w:object w:dxaOrig="1440" w:dyaOrig="1440" w14:anchorId="0F8B9233">
+          <w:object w:dxaOrig="4169" w:dyaOrig="644" w14:anchorId="0F8B9233">
             <v:shapetype id="_x0000_t75" coordsize="21600,21600" o:spt="75" o:preferrelative="t" path="m@4@5l@4@11@9@11@9@5xe" filled="f" stroked="f">
               <v:stroke joinstyle="miter"/>
               <v:formulas>
@@ -20019,7 +19232,7 @@
             <v:shape id="_x0000_s1025" type="#_x0000_t75" style="position:absolute;left:0;text-align:left;margin-left:463.75pt;margin-top:.75pt;width:63.55pt;height:9.75pt;z-index:251659264;mso-position-horizontal-relative:text;mso-position-vertical-relative:text">
               <v:imagedata r:id="rId2" o:title=""/>
             </v:shape>
-            <o:OLEObject Type="Embed" ProgID="PBrush" ShapeID="_x0000_s1025" DrawAspect="Content" ObjectID="_1843635973" r:id="rId3"/>
+            <o:OLEObject Type="Embed" ProgID="PBrush" ShapeID="_x0000_s1025" DrawAspect="Content" ObjectID="_1848746520" r:id="rId3"/>
           </w:object>
         </w:r>
         <w:r>
@@ -20066,7 +19279,7 @@
 </file>
 
 <file path=word/footnotes.xml><?xml version="1.0" encoding="utf-8"?>
-<w:footnotes xmlns:wpc="http://schemas.microsoft.com/office/word/2010/wordprocessingCanvas" xmlns:cx="http://schemas.microsoft.com/office/drawing/2014/chartex" xmlns:cx1="http://schemas.microsoft.com/office/drawing/2015/9/8/chartex" xmlns:cx2="http://schemas.microsoft.com/office/drawing/2015/10/21/chartex" xmlns:cx3="http://schemas.microsoft.com/office/drawing/2016/5/9/chartex" xmlns:cx4="http://schemas.microsoft.com/office/drawing/2016/5/10/chartex" xmlns:cx5="http://schemas.microsoft.com/office/drawing/2016/5/11/chartex" xmlns:cx6="http://schemas.microsoft.com/office/drawing/2016/5/12/chartex" xmlns:cx7="http://schemas.microsoft.com/office/drawing/2016/5/13/chartex" xmlns:cx8="http://schemas.microsoft.com/office/drawing/2016/5/14/chartex" xmlns:mc="http://schemas.openxmlformats.org/markup-compatibility/2006" xmlns:aink="http://schemas.microsoft.com/office/drawing/2016/ink" xmlns:am3d="http://schemas.microsoft.com/office/drawing/2017/model3d" xmlns:o="urn:schemas-microsoft-com:office:office" xmlns:oel="http://schemas.microsoft.com/office/2019/extlst" xmlns:r="http://schemas.openxmlformats.org/officeDocument/2006/relationships" xmlns:m="http://schemas.openxmlformats.org/officeDocument/2006/math" xmlns:v="urn:schemas-microsoft-com:vml" xmlns:wp14="http://schemas.microsoft.com/office/word/2010/wordprocessingDrawing" xmlns:wp="http://schemas.openxmlformats.org/drawingml/2006/wordprocessingDrawing" xmlns:w10="urn:schemas-microsoft-com:office:word" xmlns:w="http://schemas.openxmlformats.org/wordprocessingml/2006/main" xmlns:w14="http://schemas.microsoft.com/office/word/2010/wordml" xmlns:w15="http://schemas.microsoft.com/office/word/2012/wordml" xmlns:w16cex="http://schemas.microsoft.com/office/word/2018/wordml/cex" xmlns:w16cid="http://schemas.microsoft.com/office/word/2016/wordml/cid" xmlns:w16="http://schemas.microsoft.com/office/word/2018/wordml" xmlns:w16du="http://schemas.microsoft.com/office/word/2023/wordml/word16du" xmlns:w16sdtdh="http://schemas.microsoft.com/office/word/2020/wordml/sdtdatahash" xmlns:w16sdtfl="http://schemas.microsoft.com/office/word/2024/wordml/sdtformatlock" xmlns:w16se="http://schemas.microsoft.com/office/word/2015/wordml/symex" xmlns:wpg="http://schemas.microsoft.com/office/word/2010/wordprocessingGroup" xmlns:wpi="http://schemas.microsoft.com/office/word/2010/wordprocessingInk" xmlns:wne="http://schemas.microsoft.com/office/word/2006/wordml" xmlns:wps="http://schemas.microsoft.com/office/word/2010/wordprocessingShape" mc:Ignorable="w14 w15 w16se w16cid w16 w16cex w16sdtdh w16sdtfl w16du wp14">
+<w:footnotes xmlns:wpc="http://schemas.microsoft.com/office/word/2010/wordprocessingCanvas" xmlns:cx="http://schemas.microsoft.com/office/drawing/2014/chartex" xmlns:cx1="http://schemas.microsoft.com/office/drawing/2015/9/8/chartex" xmlns:cx2="http://schemas.microsoft.com/office/drawing/2015/10/21/chartex" xmlns:cx3="http://schemas.microsoft.com/office/drawing/2016/5/9/chartex" xmlns:cx4="http://schemas.microsoft.com/office/drawing/2016/5/10/chartex" xmlns:cx5="http://schemas.microsoft.com/office/drawing/2016/5/11/chartex" xmlns:cx6="http://schemas.microsoft.com/office/drawing/2016/5/12/chartex" xmlns:cx7="http://schemas.microsoft.com/office/drawing/2016/5/13/chartex" xmlns:cx8="http://schemas.microsoft.com/office/drawing/2016/5/14/chartex" xmlns:mc="http://schemas.openxmlformats.org/markup-compatibility/2006" xmlns:aink="http://schemas.microsoft.com/office/drawing/2016/ink" xmlns:am3d="http://schemas.microsoft.com/office/drawing/2017/model3d" xmlns:o="urn:schemas-microsoft-com:office:office" xmlns:oel="http://schemas.microsoft.com/office/2019/extlst" xmlns:r="http://schemas.openxmlformats.org/officeDocument/2006/relationships" xmlns:m="http://schemas.openxmlformats.org/officeDocument/2006/math" xmlns:v="urn:schemas-microsoft-com:vml" xmlns:wp14="http://schemas.microsoft.com/office/word/2010/wordprocessingDrawing" xmlns:wp="http://schemas.openxmlformats.org/drawingml/2006/wordprocessingDrawing" xmlns:w10="urn:schemas-microsoft-com:office:word" xmlns:w="http://schemas.openxmlformats.org/wordprocessingml/2006/main" xmlns:w14="http://schemas.microsoft.com/office/word/2010/wordml" xmlns:w15="http://schemas.microsoft.com/office/word/2012/wordml" xmlns:w16cei="http://schemas.microsoft.com/office/word/2026/wordml/cei" xmlns:w16cex="http://schemas.microsoft.com/office/word/2018/wordml/cex" xmlns:w16cid="http://schemas.microsoft.com/office/word/2016/wordml/cid" xmlns:w16="http://schemas.microsoft.com/office/word/2018/wordml" xmlns:w16du="http://schemas.microsoft.com/office/word/2023/wordml/word16du" xmlns:w16sdtdh="http://schemas.microsoft.com/office/word/2020/wordml/sdtdatahash" xmlns:w16sdtfl="http://schemas.microsoft.com/office/word/2024/wordml/sdtformatlock" xmlns:w16se="http://schemas.microsoft.com/office/word/2015/wordml/symex" xmlns:wpg="http://schemas.microsoft.com/office/word/2010/wordprocessingGroup" xmlns:wpi="http://schemas.microsoft.com/office/word/2010/wordprocessingInk" xmlns:wne="http://schemas.microsoft.com/office/word/2006/wordml" xmlns:wps="http://schemas.microsoft.com/office/word/2010/wordprocessingShape" mc:Ignorable="w14 w15 w16se w16cid w16 w16cex w16sdtdh w16sdtfl w16du wp14">
   <w:footnote w:type="separator" w:id="-1">
     <w:p>
       <w:pPr>
@@ -20091,7 +19304,7 @@
 </file>
 
 <file path=word/numbering.xml><?xml version="1.0" encoding="utf-8"?>
-<w:numbering xmlns:wpc="http://schemas.microsoft.com/office/word/2010/wordprocessingCanvas" xmlns:cx="http://schemas.microsoft.com/office/drawing/2014/chartex" xmlns:cx1="http://schemas.microsoft.com/office/drawing/2015/9/8/chartex" xmlns:cx2="http://schemas.microsoft.com/office/drawing/2015/10/21/chartex" xmlns:cx3="http://schemas.microsoft.com/office/drawing/2016/5/9/chartex" xmlns:cx4="http://schemas.microsoft.com/office/drawing/2016/5/10/chartex" xmlns:cx5="http://schemas.microsoft.com/office/drawing/2016/5/11/chartex" xmlns:cx6="http://schemas.microsoft.com/office/drawing/2016/5/12/chartex" xmlns:cx7="http://schemas.microsoft.com/office/drawing/2016/5/13/chartex" xmlns:cx8="http://schemas.microsoft.com/office/drawing/2016/5/14/chartex" xmlns:mc="http://schemas.openxmlformats.org/markup-compatibility/2006" xmlns:aink="http://schemas.microsoft.com/office/drawing/2016/ink" xmlns:am3d="http://schemas.microsoft.com/office/drawing/2017/model3d" xmlns:o="urn:schemas-microsoft-com:office:office" xmlns:oel="http://schemas.microsoft.com/office/2019/extlst" xmlns:r="http://schemas.openxmlformats.org/officeDocument/2006/relationships" xmlns:m="http://schemas.openxmlformats.org/officeDocument/2006/math" xmlns:v="urn:schemas-microsoft-com:vml" xmlns:wp14="http://schemas.microsoft.com/office/word/2010/wordprocessingDrawing" xmlns:wp="http://schemas.openxmlformats.org/drawingml/2006/wordprocessingDrawing" xmlns:w10="urn:schemas-microsoft-com:office:word" xmlns:w="http://schemas.openxmlformats.org/wordprocessingml/2006/main" xmlns:w14="http://schemas.microsoft.com/office/word/2010/wordml" xmlns:w15="http://schemas.microsoft.com/office/word/2012/wordml" xmlns:w16cex="http://schemas.microsoft.com/office/word/2018/wordml/cex" xmlns:w16cid="http://schemas.microsoft.com/office/word/2016/wordml/cid" xmlns:w16="http://schemas.microsoft.com/office/word/2018/wordml" xmlns:w16du="http://schemas.microsoft.com/office/word/2023/wordml/word16du" xmlns:w16sdtdh="http://schemas.microsoft.com/office/word/2020/wordml/sdtdatahash" xmlns:w16sdtfl="http://schemas.microsoft.com/office/word/2024/wordml/sdtformatlock" xmlns:w16se="http://schemas.microsoft.com/office/word/2015/wordml/symex" xmlns:wpg="http://schemas.microsoft.com/office/word/2010/wordprocessingGroup" xmlns:wpi="http://schemas.microsoft.com/office/word/2010/wordprocessingInk" xmlns:wne="http://schemas.microsoft.com/office/word/2006/wordml" xmlns:wps="http://schemas.microsoft.com/office/word/2010/wordprocessingShape" mc:Ignorable="w14 w15 w16se w16cid w16 w16cex w16sdtdh w16sdtfl w16du wp14">
+<w:numbering xmlns:wpc="http://schemas.microsoft.com/office/word/2010/wordprocessingCanvas" xmlns:cx="http://schemas.microsoft.com/office/drawing/2014/chartex" xmlns:cx1="http://schemas.microsoft.com/office/drawing/2015/9/8/chartex" xmlns:cx2="http://schemas.microsoft.com/office/drawing/2015/10/21/chartex" xmlns:cx3="http://schemas.microsoft.com/office/drawing/2016/5/9/chartex" xmlns:cx4="http://schemas.microsoft.com/office/drawing/2016/5/10/chartex" xmlns:cx5="http://schemas.microsoft.com/office/drawing/2016/5/11/chartex" xmlns:cx6="http://schemas.microsoft.com/office/drawing/2016/5/12/chartex" xmlns:cx7="http://schemas.microsoft.com/office/drawing/2016/5/13/chartex" xmlns:cx8="http://schemas.microsoft.com/office/drawing/2016/5/14/chartex" xmlns:mc="http://schemas.openxmlformats.org/markup-compatibility/2006" xmlns:aink="http://schemas.microsoft.com/office/drawing/2016/ink" xmlns:am3d="http://schemas.microsoft.com/office/drawing/2017/model3d" xmlns:o="urn:schemas-microsoft-com:office:office" xmlns:oel="http://schemas.microsoft.com/office/2019/extlst" xmlns:r="http://schemas.openxmlformats.org/officeDocument/2006/relationships" xmlns:m="http://schemas.openxmlformats.org/officeDocument/2006/math" xmlns:v="urn:schemas-microsoft-com:vml" xmlns:wp14="http://schemas.microsoft.com/office/word/2010/wordprocessingDrawing" xmlns:wp="http://schemas.openxmlformats.org/drawingml/2006/wordprocessingDrawing" xmlns:w10="urn:schemas-microsoft-com:office:word" xmlns:w="http://schemas.openxmlformats.org/wordprocessingml/2006/main" xmlns:w14="http://schemas.microsoft.com/office/word/2010/wordml" xmlns:w15="http://schemas.microsoft.com/office/word/2012/wordml" xmlns:w16cei="http://schemas.microsoft.com/office/word/2026/wordml/cei" xmlns:w16cex="http://schemas.microsoft.com/office/word/2018/wordml/cex" xmlns:w16cid="http://schemas.microsoft.com/office/word/2016/wordml/cid" xmlns:w16="http://schemas.microsoft.com/office/word/2018/wordml" xmlns:w16du="http://schemas.microsoft.com/office/word/2023/wordml/word16du" xmlns:w16sdtdh="http://schemas.microsoft.com/office/word/2020/wordml/sdtdatahash" xmlns:w16sdtfl="http://schemas.microsoft.com/office/word/2024/wordml/sdtformatlock" xmlns:w16se="http://schemas.microsoft.com/office/word/2015/wordml/symex" xmlns:wpg="http://schemas.microsoft.com/office/word/2010/wordprocessingGroup" xmlns:wpi="http://schemas.microsoft.com/office/word/2010/wordprocessingInk" xmlns:wne="http://schemas.microsoft.com/office/word/2006/wordml" xmlns:wps="http://schemas.microsoft.com/office/word/2010/wordprocessingShape" mc:Ignorable="w14 w15 w16se w16cid w16 w16cex w16sdtdh w16sdtfl w16du wp14">
   <w:abstractNum w:abstractNumId="0" w15:restartNumberingAfterBreak="0">
     <w:nsid w:val="036618BC"/>
     <w:multiLevelType w:val="hybridMultilevel"/>

</xml_diff>